<commit_message>
Sync PROP_temp/CMR Scala RTL, DATE experiment configs, and hier DC/GLS flow.
Capture the temp hierarchical PROP designs, multicast/hotspot benchmark settings, and durable remote synthesis/simulation scripts needed to reproduce the current paper experiments.

Co-authored-by: Cursor <cursoragent@cursor.com>
</commit_message>
<xml_diff>
--- a/DATE paper/paper/A Scalable Asynchronous Hierachical NoC for High-Performance Multicst.docx
+++ b/DATE paper/paper/A Scalable Asynchronous Hierachical NoC for High-Performance Multicst.docx
@@ -506,16 +506,1036 @@
     <w:p>
       <w:pPr>
         <w:pStyle w:val="a3"/>
+        <w:rPr>
+          <w:lang w:eastAsia="zh-CN"/>
+        </w:rPr>
+      </w:pPr>
+      <w:r>
+        <w:rPr>
+          <w:lang w:eastAsia="zh-CN"/>
+        </w:rPr>
+        <w:t xml:space="preserve">Large-scale neuromorphic and event-driven processors increasingly depend on the scalability of their on-chip communication fabrics. IBM TrueNorth integrates 4,096 neurosynaptic cores on a single chip (TrueNorth), while the more recent PAICORE integrates 1,024 neuromorphic cores with an on-chip hierarchical interconnect (PAICORE). Intel’s </w:t>
+      </w:r>
+      <w:proofErr w:type="spellStart"/>
+      <w:r>
+        <w:rPr>
+          <w:lang w:eastAsia="zh-CN"/>
+        </w:rPr>
+        <w:t>Loihi</w:t>
+      </w:r>
+      <w:proofErr w:type="spellEnd"/>
+      <w:r>
+        <w:rPr>
+          <w:lang w:eastAsia="zh-CN"/>
+        </w:rPr>
+        <w:t xml:space="preserve"> 2 contains up to 128 fully asynchronous neuron cores connected by an on-chip network (</w:t>
+      </w:r>
+      <w:proofErr w:type="spellStart"/>
+      <w:r>
+        <w:rPr>
+          <w:lang w:eastAsia="zh-CN"/>
+        </w:rPr>
+        <w:t>Loihi</w:t>
+      </w:r>
+      <w:proofErr w:type="spellEnd"/>
+      <w:r>
+        <w:rPr>
+          <w:lang w:eastAsia="zh-CN"/>
+        </w:rPr>
+        <w:t xml:space="preserve"> 2 Technology Brief), and Hala Point further scales 1,152 </w:t>
+      </w:r>
+      <w:proofErr w:type="spellStart"/>
+      <w:r>
+        <w:rPr>
+          <w:lang w:eastAsia="zh-CN"/>
+        </w:rPr>
+        <w:t>Loihi</w:t>
+      </w:r>
+      <w:proofErr w:type="spellEnd"/>
+      <w:r>
+        <w:rPr>
+          <w:lang w:eastAsia="zh-CN"/>
+        </w:rPr>
+        <w:t xml:space="preserve"> 2 processors to 140,544 neuromorphic cores (Hala Point). Neural connectivity meanwhile requires sparse events to be delivered to both nearby and distant destinations with inherently high fanout. As system size grows, the network must therefore sustain more concurrent communication while meeting increasingly stringent latency, throughput, and energy constraints. Communication bandwidth, routing latency, and routing resources have consequently become important scalability concerns in large neuromorphic systems (DYNAPs; PAICORE; Ultra). This pressure is further amplified by high-fanout communication, where a single event may generate traffic toward many destinations and increase network load even when computation itself is sparse (Multicast Tree Router; HBS). The central interconnect challenge is therefore not simply to connect more processing elements, but to maintain NoC performance as both network scale and communication fanout increase.</w:t>
+      </w:r>
+    </w:p>
+    <w:p>
+      <w:pPr>
+        <w:pStyle w:val="a3"/>
+        <w:rPr>
+          <w:lang w:eastAsia="zh-CN"/>
+        </w:rPr>
+      </w:pPr>
+      <w:r>
+        <w:rPr>
+          <w:lang w:eastAsia="zh-CN"/>
+        </w:rPr>
+        <w:t>Prior work has improved NoC performance by targeting different components of packet delivery. Following the standard latency decomposition used in interconnection-network analysis (Dally &amp; Towles; SMART), the communication latency can be expressed as</w:t>
+      </w:r>
+    </w:p>
+    <w:p>
+      <w:pPr>
+        <w:pStyle w:val="a3"/>
+        <w:rPr>
+          <w:lang w:eastAsia="zh-CN"/>
+        </w:rPr>
+      </w:pPr>
+      <m:oMathPara>
+        <m:oMath>
+          <m:m>
+            <m:mPr>
+              <m:plcHide m:val="1"/>
+              <m:mcs>
+                <m:mc>
+                  <m:mcPr>
+                    <m:count m:val="4"/>
+                    <m:mcJc m:val="center"/>
+                  </m:mcPr>
+                </m:mc>
+              </m:mcs>
+              <m:ctrlPr>
+                <w:rPr>
+                  <w:rFonts w:ascii="Cambria Math" w:hAnsi="Cambria Math"/>
+                  <w:lang w:eastAsia="zh-CN"/>
+                </w:rPr>
+              </m:ctrlPr>
+            </m:mPr>
+            <m:mr>
+              <m:e/>
+              <m:e>
+                <m:sSub>
+                  <m:sSubPr>
+                    <m:ctrlPr>
+                      <w:rPr>
+                        <w:rFonts w:ascii="Cambria Math" w:hAnsi="Cambria Math"/>
+                        <w:lang w:eastAsia="zh-CN"/>
+                      </w:rPr>
+                    </m:ctrlPr>
+                  </m:sSubPr>
+                  <m:e>
+                    <m:r>
+                      <w:rPr>
+                        <w:rFonts w:ascii="Cambria Math" w:hAnsi="Cambria Math"/>
+                        <w:lang w:eastAsia="zh-CN"/>
+                      </w:rPr>
+                      <m:t>T</m:t>
+                    </m:r>
+                  </m:e>
+                  <m:sub>
+                    <m:r>
+                      <m:rPr>
+                        <m:sty m:val="p"/>
+                      </m:rPr>
+                      <w:rPr>
+                        <w:rFonts w:ascii="Cambria Math" w:hAnsi="Cambria Math"/>
+                        <w:lang w:eastAsia="zh-CN"/>
+                      </w:rPr>
+                      <m:t>comm</m:t>
+                    </m:r>
+                  </m:sub>
+                </m:sSub>
+                <m:r>
+                  <w:rPr>
+                    <w:rFonts w:ascii="Cambria Math" w:hAnsi="Cambria Math"/>
+                    <w:lang w:eastAsia="zh-CN"/>
+                  </w:rPr>
+                  <m:t>=H</m:t>
+                </m:r>
+                <m:sSub>
+                  <m:sSubPr>
+                    <m:ctrlPr>
+                      <w:rPr>
+                        <w:rFonts w:ascii="Cambria Math" w:hAnsi="Cambria Math"/>
+                        <w:lang w:eastAsia="zh-CN"/>
+                      </w:rPr>
+                    </m:ctrlPr>
+                  </m:sSubPr>
+                  <m:e>
+                    <m:r>
+                      <w:rPr>
+                        <w:rFonts w:ascii="Cambria Math" w:hAnsi="Cambria Math"/>
+                        <w:lang w:eastAsia="zh-CN"/>
+                      </w:rPr>
+                      <m:t>t</m:t>
+                    </m:r>
+                  </m:e>
+                  <m:sub>
+                    <m:r>
+                      <w:rPr>
+                        <w:rFonts w:ascii="Cambria Math" w:hAnsi="Cambria Math"/>
+                        <w:lang w:eastAsia="zh-CN"/>
+                      </w:rPr>
+                      <m:t>r</m:t>
+                    </m:r>
+                  </m:sub>
+                </m:sSub>
+                <m:r>
+                  <w:rPr>
+                    <w:rFonts w:ascii="Cambria Math" w:hAnsi="Cambria Math"/>
+                    <w:lang w:eastAsia="zh-CN"/>
+                  </w:rPr>
+                  <m:t>+H</m:t>
+                </m:r>
+                <m:sSub>
+                  <m:sSubPr>
+                    <m:ctrlPr>
+                      <w:rPr>
+                        <w:rFonts w:ascii="Cambria Math" w:hAnsi="Cambria Math"/>
+                        <w:lang w:eastAsia="zh-CN"/>
+                      </w:rPr>
+                    </m:ctrlPr>
+                  </m:sSubPr>
+                  <m:e>
+                    <m:r>
+                      <w:rPr>
+                        <w:rFonts w:ascii="Cambria Math" w:hAnsi="Cambria Math"/>
+                        <w:lang w:eastAsia="zh-CN"/>
+                      </w:rPr>
+                      <m:t>t</m:t>
+                    </m:r>
+                  </m:e>
+                  <m:sub>
+                    <m:r>
+                      <w:rPr>
+                        <w:rFonts w:ascii="Cambria Math" w:hAnsi="Cambria Math"/>
+                        <w:lang w:eastAsia="zh-CN"/>
+                      </w:rPr>
+                      <m:t>w</m:t>
+                    </m:r>
+                  </m:sub>
+                </m:sSub>
+                <m:r>
+                  <w:rPr>
+                    <w:rFonts w:ascii="Cambria Math" w:hAnsi="Cambria Math"/>
+                    <w:lang w:eastAsia="zh-CN"/>
+                  </w:rPr>
+                  <m:t>+</m:t>
+                </m:r>
+                <m:sSub>
+                  <m:sSubPr>
+                    <m:ctrlPr>
+                      <w:rPr>
+                        <w:rFonts w:ascii="Cambria Math" w:hAnsi="Cambria Math"/>
+                        <w:lang w:eastAsia="zh-CN"/>
+                      </w:rPr>
+                    </m:ctrlPr>
+                  </m:sSubPr>
+                  <m:e>
+                    <m:r>
+                      <w:rPr>
+                        <w:rFonts w:ascii="Cambria Math" w:hAnsi="Cambria Math"/>
+                        <w:lang w:eastAsia="zh-CN"/>
+                      </w:rPr>
+                      <m:t>T</m:t>
+                    </m:r>
+                  </m:e>
+                  <m:sub>
+                    <m:r>
+                      <w:rPr>
+                        <w:rFonts w:ascii="Cambria Math" w:hAnsi="Cambria Math"/>
+                        <w:lang w:eastAsia="zh-CN"/>
+                      </w:rPr>
+                      <m:t>c</m:t>
+                    </m:r>
+                  </m:sub>
+                </m:sSub>
+                <m:r>
+                  <w:rPr>
+                    <w:rFonts w:ascii="Cambria Math" w:hAnsi="Cambria Math"/>
+                    <w:lang w:eastAsia="zh-CN"/>
+                  </w:rPr>
+                  <m:t>+</m:t>
+                </m:r>
+                <m:f>
+                  <m:fPr>
+                    <m:ctrlPr>
+                      <w:rPr>
+                        <w:rFonts w:ascii="Cambria Math" w:hAnsi="Cambria Math"/>
+                        <w:lang w:eastAsia="zh-CN"/>
+                      </w:rPr>
+                    </m:ctrlPr>
+                  </m:fPr>
+                  <m:num>
+                    <m:r>
+                      <w:rPr>
+                        <w:rFonts w:ascii="Cambria Math" w:hAnsi="Cambria Math"/>
+                        <w:lang w:eastAsia="zh-CN"/>
+                      </w:rPr>
+                      <m:t>L</m:t>
+                    </m:r>
+                  </m:num>
+                  <m:den>
+                    <m:r>
+                      <w:rPr>
+                        <w:rFonts w:ascii="Cambria Math" w:hAnsi="Cambria Math"/>
+                        <w:lang w:eastAsia="zh-CN"/>
+                      </w:rPr>
+                      <m:t>b</m:t>
+                    </m:r>
+                  </m:den>
+                </m:f>
+                <m:r>
+                  <w:rPr>
+                    <w:rFonts w:ascii="Cambria Math" w:hAnsi="Cambria Math"/>
+                    <w:lang w:eastAsia="zh-CN"/>
+                  </w:rPr>
+                  <m:t>,</m:t>
+                </m:r>
+              </m:e>
+              <m:e/>
+              <m:e>
+                <m:r>
+                  <m:rPr>
+                    <m:nor/>
+                  </m:rPr>
+                  <w:rPr>
+                    <w:lang w:eastAsia="zh-CN"/>
+                  </w:rPr>
+                  <m:t>(1)</m:t>
+                </m:r>
+              </m:e>
+            </m:mr>
+          </m:m>
+          <m:r>
+            <w:rPr>
+              <w:lang w:eastAsia="zh-CN"/>
+            </w:rPr>
+            <w:br/>
+          </m:r>
+        </m:oMath>
+      </m:oMathPara>
+    </w:p>
+    <w:p>
+      <w:pPr>
+        <w:pStyle w:val="a3"/>
+        <w:rPr>
+          <w:lang w:eastAsia="zh-CN"/>
+        </w:rPr>
+      </w:pPr>
+      <w:r>
+        <w:rPr>
+          <w:lang w:eastAsia="zh-CN"/>
+        </w:rPr>
+        <w:t xml:space="preserve">where </w:t>
+      </w:r>
+      <m:oMath>
+        <m:r>
+          <w:rPr>
+            <w:rFonts w:ascii="Cambria Math" w:hAnsi="Cambria Math"/>
+            <w:lang w:eastAsia="zh-CN"/>
+          </w:rPr>
+          <m:t>H</m:t>
+        </m:r>
+      </m:oMath>
+      <w:r>
+        <w:rPr>
+          <w:lang w:eastAsia="zh-CN"/>
+        </w:rPr>
+        <w:t xml:space="preserve">is the number of router hops, </w:t>
+      </w:r>
+      <m:oMath>
+        <m:sSub>
+          <m:sSubPr>
+            <m:ctrlPr>
+              <w:rPr>
+                <w:rFonts w:ascii="Cambria Math" w:hAnsi="Cambria Math"/>
+                <w:lang w:eastAsia="zh-CN"/>
+              </w:rPr>
+            </m:ctrlPr>
+          </m:sSubPr>
+          <m:e>
+            <m:r>
+              <w:rPr>
+                <w:rFonts w:ascii="Cambria Math" w:hAnsi="Cambria Math"/>
+                <w:lang w:eastAsia="zh-CN"/>
+              </w:rPr>
+              <m:t>t</m:t>
+            </m:r>
+          </m:e>
+          <m:sub>
+            <m:r>
+              <w:rPr>
+                <w:rFonts w:ascii="Cambria Math" w:hAnsi="Cambria Math"/>
+                <w:lang w:eastAsia="zh-CN"/>
+              </w:rPr>
+              <m:t>r</m:t>
+            </m:r>
+          </m:sub>
+        </m:sSub>
+      </m:oMath>
+      <w:r>
+        <w:rPr>
+          <w:lang w:eastAsia="zh-CN"/>
+        </w:rPr>
+        <w:t xml:space="preserve">and </w:t>
+      </w:r>
+      <m:oMath>
+        <m:sSub>
+          <m:sSubPr>
+            <m:ctrlPr>
+              <w:rPr>
+                <w:rFonts w:ascii="Cambria Math" w:hAnsi="Cambria Math"/>
+                <w:lang w:eastAsia="zh-CN"/>
+              </w:rPr>
+            </m:ctrlPr>
+          </m:sSubPr>
+          <m:e>
+            <m:r>
+              <w:rPr>
+                <w:rFonts w:ascii="Cambria Math" w:hAnsi="Cambria Math"/>
+                <w:lang w:eastAsia="zh-CN"/>
+              </w:rPr>
+              <m:t>t</m:t>
+            </m:r>
+          </m:e>
+          <m:sub>
+            <m:r>
+              <w:rPr>
+                <w:rFonts w:ascii="Cambria Math" w:hAnsi="Cambria Math"/>
+                <w:lang w:eastAsia="zh-CN"/>
+              </w:rPr>
+              <m:t>w</m:t>
+            </m:r>
+          </m:sub>
+        </m:sSub>
+      </m:oMath>
+      <w:r>
+        <w:rPr>
+          <w:lang w:eastAsia="zh-CN"/>
+        </w:rPr>
+        <w:t xml:space="preserve">are the router and link delays per hop, </w:t>
+      </w:r>
+      <m:oMath>
+        <m:sSub>
+          <m:sSubPr>
+            <m:ctrlPr>
+              <w:rPr>
+                <w:rFonts w:ascii="Cambria Math" w:hAnsi="Cambria Math"/>
+                <w:lang w:eastAsia="zh-CN"/>
+              </w:rPr>
+            </m:ctrlPr>
+          </m:sSubPr>
+          <m:e>
+            <m:r>
+              <w:rPr>
+                <w:rFonts w:ascii="Cambria Math" w:hAnsi="Cambria Math"/>
+                <w:lang w:eastAsia="zh-CN"/>
+              </w:rPr>
+              <m:t>T</m:t>
+            </m:r>
+          </m:e>
+          <m:sub>
+            <m:r>
+              <w:rPr>
+                <w:rFonts w:ascii="Cambria Math" w:hAnsi="Cambria Math"/>
+                <w:lang w:eastAsia="zh-CN"/>
+              </w:rPr>
+              <m:t>c</m:t>
+            </m:r>
+          </m:sub>
+        </m:sSub>
+      </m:oMath>
+      <w:r>
+        <w:rPr>
+          <w:lang w:eastAsia="zh-CN"/>
+        </w:rPr>
+        <w:t xml:space="preserve">is the delay caused by contention, and </w:t>
+      </w:r>
+      <m:oMath>
+        <m:r>
+          <w:rPr>
+            <w:rFonts w:ascii="Cambria Math" w:hAnsi="Cambria Math"/>
+            <w:lang w:eastAsia="zh-CN"/>
+          </w:rPr>
+          <m:t>L/b</m:t>
+        </m:r>
+      </m:oMath>
+      <w:r>
+        <w:rPr>
+          <w:lang w:eastAsia="zh-CN"/>
+        </w:rPr>
+        <w:t xml:space="preserve">represents packet serialization. This model highlights three complementary directions for NoC performance optimization. </w:t>
+      </w:r>
+      <w:r>
+        <w:rPr>
+          <w:b/>
+          <w:bCs/>
+          <w:lang w:eastAsia="zh-CN"/>
+        </w:rPr>
+        <w:t>(a) Topology optimization:</w:t>
+      </w:r>
+      <w:r>
+        <w:rPr>
+          <w:lang w:eastAsia="zh-CN"/>
+        </w:rPr>
+        <w:t xml:space="preserve"> topology primarily reduces </w:t>
+      </w:r>
+      <m:oMath>
+        <m:r>
+          <w:rPr>
+            <w:rFonts w:ascii="Cambria Math" w:hAnsi="Cambria Math"/>
+            <w:lang w:eastAsia="zh-CN"/>
+          </w:rPr>
+          <m:t>H</m:t>
+        </m:r>
+      </m:oMath>
+      <w:r>
+        <w:rPr>
+          <w:lang w:eastAsia="zh-CN"/>
+        </w:rPr>
+        <w:t xml:space="preserve">by shortening communication paths, while additional connectivity or bandwidth can also </w:t>
+      </w:r>
+      <w:r>
+        <w:rPr>
+          <w:lang w:eastAsia="zh-CN"/>
+        </w:rPr>
+        <w:t xml:space="preserve">relieve </w:t>
+      </w:r>
+      <m:oMath>
+        <m:sSub>
+          <m:sSubPr>
+            <m:ctrlPr>
+              <w:rPr>
+                <w:rFonts w:ascii="Cambria Math" w:hAnsi="Cambria Math"/>
+                <w:lang w:eastAsia="zh-CN"/>
+              </w:rPr>
+            </m:ctrlPr>
+          </m:sSubPr>
+          <m:e>
+            <m:r>
+              <w:rPr>
+                <w:rFonts w:ascii="Cambria Math" w:hAnsi="Cambria Math"/>
+                <w:lang w:eastAsia="zh-CN"/>
+              </w:rPr>
+              <m:t>T</m:t>
+            </m:r>
+          </m:e>
+          <m:sub>
+            <m:r>
+              <w:rPr>
+                <w:rFonts w:ascii="Cambria Math" w:hAnsi="Cambria Math"/>
+                <w:lang w:eastAsia="zh-CN"/>
+              </w:rPr>
+              <m:t>c</m:t>
+            </m:r>
+          </m:sub>
+        </m:sSub>
+      </m:oMath>
+      <w:r>
+        <w:rPr>
+          <w:lang w:eastAsia="zh-CN"/>
+        </w:rPr>
+        <w:t xml:space="preserve">. Regular mesh and torus networks expose different trade-offs between network diameter and implementation cost (NoC Topology Analysis), whereas high-radix structures such as the flattened butterfly reduce hop count through richer connectivity (Flattened Butterfly). Hierarchical networks provide another approach by keeping local communication on shorter paths and provisioning additional capacity toward higher levels, as exemplified by the fat-tree organization in PAICORE (PAICORE). </w:t>
+      </w:r>
+      <w:r>
+        <w:rPr>
+          <w:b/>
+          <w:bCs/>
+          <w:lang w:eastAsia="zh-CN"/>
+        </w:rPr>
+        <w:t>(b) Routing and traffic optimization:</w:t>
+      </w:r>
+      <w:r>
+        <w:rPr>
+          <w:lang w:eastAsia="zh-CN"/>
+        </w:rPr>
+        <w:t xml:space="preserve"> routing determines the actual paths taken by packets and how traffic is distributed, thereby affecting both </w:t>
+      </w:r>
+      <m:oMath>
+        <m:r>
+          <w:rPr>
+            <w:rFonts w:ascii="Cambria Math" w:hAnsi="Cambria Math"/>
+            <w:lang w:eastAsia="zh-CN"/>
+          </w:rPr>
+          <m:t>H</m:t>
+        </m:r>
+      </m:oMath>
+      <w:r>
+        <w:rPr>
+          <w:lang w:eastAsia="zh-CN"/>
+        </w:rPr>
+        <w:t xml:space="preserve">and </w:t>
+      </w:r>
+      <m:oMath>
+        <m:sSub>
+          <m:sSubPr>
+            <m:ctrlPr>
+              <w:rPr>
+                <w:rFonts w:ascii="Cambria Math" w:hAnsi="Cambria Math"/>
+                <w:lang w:eastAsia="zh-CN"/>
+              </w:rPr>
+            </m:ctrlPr>
+          </m:sSubPr>
+          <m:e>
+            <m:r>
+              <w:rPr>
+                <w:rFonts w:ascii="Cambria Math" w:hAnsi="Cambria Math"/>
+                <w:lang w:eastAsia="zh-CN"/>
+              </w:rPr>
+              <m:t>T</m:t>
+            </m:r>
+          </m:e>
+          <m:sub>
+            <m:r>
+              <w:rPr>
+                <w:rFonts w:ascii="Cambria Math" w:hAnsi="Cambria Math"/>
+                <w:lang w:eastAsia="zh-CN"/>
+              </w:rPr>
+              <m:t>c</m:t>
+            </m:r>
+          </m:sub>
+        </m:sSub>
+      </m:oMath>
+      <w:r>
+        <w:rPr>
+          <w:lang w:eastAsia="zh-CN"/>
+        </w:rPr>
+        <w:t xml:space="preserve">. Adaptive routing can steer packets away from congested regions (Carpool), while hardware multicast allows multiple destinations to share common path segments instead of repeatedly transmitting the same information (VCTM). </w:t>
+      </w:r>
+      <w:r>
+        <w:rPr>
+          <w:b/>
+          <w:bCs/>
+          <w:lang w:eastAsia="zh-CN"/>
+        </w:rPr>
+        <w:t>(c) Router microarchitecture optimization:</w:t>
+      </w:r>
+      <w:r>
+        <w:rPr>
+          <w:lang w:eastAsia="zh-CN"/>
+        </w:rPr>
+        <w:t xml:space="preserve"> router design primarily targets </w:t>
+      </w:r>
+      <m:oMath>
+        <m:sSub>
+          <m:sSubPr>
+            <m:ctrlPr>
+              <w:rPr>
+                <w:rFonts w:ascii="Cambria Math" w:hAnsi="Cambria Math"/>
+                <w:lang w:eastAsia="zh-CN"/>
+              </w:rPr>
+            </m:ctrlPr>
+          </m:sSubPr>
+          <m:e>
+            <m:r>
+              <w:rPr>
+                <w:rFonts w:ascii="Cambria Math" w:hAnsi="Cambria Math"/>
+                <w:lang w:eastAsia="zh-CN"/>
+              </w:rPr>
+              <m:t>t</m:t>
+            </m:r>
+          </m:e>
+          <m:sub>
+            <m:r>
+              <w:rPr>
+                <w:rFonts w:ascii="Cambria Math" w:hAnsi="Cambria Math"/>
+                <w:lang w:eastAsia="zh-CN"/>
+              </w:rPr>
+              <m:t>r</m:t>
+            </m:r>
+          </m:sub>
+        </m:sSub>
+      </m:oMath>
+      <w:r>
+        <w:rPr>
+          <w:lang w:eastAsia="zh-CN"/>
+        </w:rPr>
+        <w:t xml:space="preserve">and the local contribution to </w:t>
+      </w:r>
+      <m:oMath>
+        <m:sSub>
+          <m:sSubPr>
+            <m:ctrlPr>
+              <w:rPr>
+                <w:rFonts w:ascii="Cambria Math" w:hAnsi="Cambria Math"/>
+                <w:lang w:eastAsia="zh-CN"/>
+              </w:rPr>
+            </m:ctrlPr>
+          </m:sSubPr>
+          <m:e>
+            <m:r>
+              <w:rPr>
+                <w:rFonts w:ascii="Cambria Math" w:hAnsi="Cambria Math"/>
+                <w:lang w:eastAsia="zh-CN"/>
+              </w:rPr>
+              <m:t>T</m:t>
+            </m:r>
+          </m:e>
+          <m:sub>
+            <m:r>
+              <w:rPr>
+                <w:rFonts w:ascii="Cambria Math" w:hAnsi="Cambria Math"/>
+                <w:lang w:eastAsia="zh-CN"/>
+              </w:rPr>
+              <m:t>c</m:t>
+            </m:r>
+          </m:sub>
+        </m:sSub>
+      </m:oMath>
+      <w:r>
+        <w:rPr>
+          <w:lang w:eastAsia="zh-CN"/>
+        </w:rPr>
+        <w:t xml:space="preserve">, while wider or parallel datapaths can increase </w:t>
+      </w:r>
+      <m:oMath>
+        <m:r>
+          <w:rPr>
+            <w:rFonts w:ascii="Cambria Math" w:hAnsi="Cambria Math"/>
+            <w:lang w:eastAsia="zh-CN"/>
+          </w:rPr>
+          <m:t>b</m:t>
+        </m:r>
+      </m:oMath>
+      <w:r>
+        <w:rPr>
+          <w:lang w:eastAsia="zh-CN"/>
+        </w:rPr>
+        <w:t>. FlooNoC increases communication bandwidth through wide and parallel channels (FlooNoC); specialized routers can optimize multicast and aggregation traffic (MONET); and fully asynchronous implementations can reduce forwarding latency without conventional clocked pipelines (Reusable DATE’26).</w:t>
+      </w:r>
+    </w:p>
+    <w:p>
+      <w:pPr>
+        <w:pStyle w:val="a3"/>
+        <w:rPr>
+          <w:lang w:eastAsia="zh-CN"/>
+        </w:rPr>
+      </w:pPr>
+      <w:r>
+        <w:rPr>
+          <w:lang w:eastAsia="zh-CN"/>
+        </w:rPr>
+        <w:t xml:space="preserve">However, network scale and communication fanout couple the terms in (1), making isolated optimization increasingly insufficient. As the network grows, communication over larger distances tends to increase </w:t>
+      </w:r>
+      <m:oMath>
+        <m:r>
+          <w:rPr>
+            <w:rFonts w:ascii="Cambria Math" w:hAnsi="Cambria Math"/>
+            <w:lang w:eastAsia="zh-CN"/>
+          </w:rPr>
+          <m:t>H</m:t>
+        </m:r>
+      </m:oMath>
+      <w:r>
+        <w:rPr>
+          <w:lang w:eastAsia="zh-CN"/>
+        </w:rPr>
+        <w:t xml:space="preserve">, exposing each packet to more routers and links. High-fanout communication further increases </w:t>
+      </w:r>
+      <m:oMath>
+        <m:sSub>
+          <m:sSubPr>
+            <m:ctrlPr>
+              <w:rPr>
+                <w:rFonts w:ascii="Cambria Math" w:hAnsi="Cambria Math"/>
+                <w:lang w:eastAsia="zh-CN"/>
+              </w:rPr>
+            </m:ctrlPr>
+          </m:sSubPr>
+          <m:e>
+            <m:r>
+              <w:rPr>
+                <w:rFonts w:ascii="Cambria Math" w:hAnsi="Cambria Math"/>
+                <w:lang w:eastAsia="zh-CN"/>
+              </w:rPr>
+              <m:t>T</m:t>
+            </m:r>
+          </m:e>
+          <m:sub>
+            <m:r>
+              <w:rPr>
+                <w:rFonts w:ascii="Cambria Math" w:hAnsi="Cambria Math"/>
+                <w:lang w:eastAsia="zh-CN"/>
+              </w:rPr>
+              <m:t>c</m:t>
+            </m:r>
+          </m:sub>
+        </m:sSub>
+      </m:oMath>
+      <w:r>
+        <w:rPr>
+          <w:lang w:eastAsia="zh-CN"/>
+        </w:rPr>
+        <w:t xml:space="preserve">when implemented as repeated point-to-point transfers, since multiple copies compete for injection bandwidth and repeatedly occupy shared paths. Hierarchical organizations can reduce </w:t>
+      </w:r>
+      <m:oMath>
+        <m:r>
+          <w:rPr>
+            <w:rFonts w:ascii="Cambria Math" w:hAnsi="Cambria Math"/>
+            <w:lang w:eastAsia="zh-CN"/>
+          </w:rPr>
+          <m:t>H</m:t>
+        </m:r>
+      </m:oMath>
+      <w:r>
+        <w:rPr>
+          <w:lang w:eastAsia="zh-CN"/>
+        </w:rPr>
+        <w:t xml:space="preserve">by keeping nearby communication local, but the resulting traffic convergence may instead increase </w:t>
+      </w:r>
+      <m:oMath>
+        <m:sSub>
+          <m:sSubPr>
+            <m:ctrlPr>
+              <w:rPr>
+                <w:rFonts w:ascii="Cambria Math" w:hAnsi="Cambria Math"/>
+                <w:lang w:eastAsia="zh-CN"/>
+              </w:rPr>
+            </m:ctrlPr>
+          </m:sSubPr>
+          <m:e>
+            <m:r>
+              <w:rPr>
+                <w:rFonts w:ascii="Cambria Math" w:hAnsi="Cambria Math"/>
+                <w:lang w:eastAsia="zh-CN"/>
+              </w:rPr>
+              <m:t>T</m:t>
+            </m:r>
+          </m:e>
+          <m:sub>
+            <m:r>
+              <w:rPr>
+                <w:rFonts w:ascii="Cambria Math" w:hAnsi="Cambria Math"/>
+                <w:lang w:eastAsia="zh-CN"/>
+              </w:rPr>
+              <m:t>c</m:t>
+            </m:r>
+          </m:sub>
+        </m:sSub>
+      </m:oMath>
+      <w:r>
+        <w:rPr>
+          <w:lang w:eastAsia="zh-CN"/>
+        </w:rPr>
+        <w:t xml:space="preserve">at upper-level aggregation points when their service capacity is insufficient. Increasing router or link capacity can reduce </w:t>
+      </w:r>
+      <m:oMath>
+        <m:sSub>
+          <m:sSubPr>
+            <m:ctrlPr>
+              <w:rPr>
+                <w:rFonts w:ascii="Cambria Math" w:hAnsi="Cambria Math"/>
+                <w:lang w:eastAsia="zh-CN"/>
+              </w:rPr>
+            </m:ctrlPr>
+          </m:sSubPr>
+          <m:e>
+            <m:r>
+              <w:rPr>
+                <w:rFonts w:ascii="Cambria Math" w:hAnsi="Cambria Math"/>
+                <w:lang w:eastAsia="zh-CN"/>
+              </w:rPr>
+              <m:t>t</m:t>
+            </m:r>
+          </m:e>
+          <m:sub>
+            <m:r>
+              <w:rPr>
+                <w:rFonts w:ascii="Cambria Math" w:hAnsi="Cambria Math"/>
+                <w:lang w:eastAsia="zh-CN"/>
+              </w:rPr>
+              <m:t>r</m:t>
+            </m:r>
+          </m:sub>
+        </m:sSub>
+      </m:oMath>
+      <w:r>
+        <w:rPr>
+          <w:lang w:eastAsia="zh-CN"/>
+        </w:rPr>
+        <w:t xml:space="preserve">, </w:t>
+      </w:r>
+      <m:oMath>
+        <m:sSub>
+          <m:sSubPr>
+            <m:ctrlPr>
+              <w:rPr>
+                <w:rFonts w:ascii="Cambria Math" w:hAnsi="Cambria Math"/>
+                <w:lang w:eastAsia="zh-CN"/>
+              </w:rPr>
+            </m:ctrlPr>
+          </m:sSubPr>
+          <m:e>
+            <m:r>
+              <w:rPr>
+                <w:rFonts w:ascii="Cambria Math" w:hAnsi="Cambria Math"/>
+                <w:lang w:eastAsia="zh-CN"/>
+              </w:rPr>
+              <m:t>T</m:t>
+            </m:r>
+          </m:e>
+          <m:sub>
+            <m:r>
+              <w:rPr>
+                <w:rFonts w:ascii="Cambria Math" w:hAnsi="Cambria Math"/>
+                <w:lang w:eastAsia="zh-CN"/>
+              </w:rPr>
+              <m:t>c</m:t>
+            </m:r>
+          </m:sub>
+        </m:sSub>
+      </m:oMath>
+      <w:r>
+        <w:rPr>
+          <w:lang w:eastAsia="zh-CN"/>
+        </w:rPr>
+        <w:t>, or serialization overhead, but incurs additional hardware cost and does not eliminate redundant traffic or unnecessarily long routes. Improving large-scale high-fanout NoC performance therefore requires coordinated optimization of topology, communication mechanisms, and router microarchitecture rather than minimizing any single term in isolation.</w:t>
+      </w:r>
+    </w:p>
+    <w:p>
+      <w:pPr>
+        <w:pStyle w:val="a3"/>
+        <w:rPr>
+          <w:lang w:eastAsia="zh-CN"/>
+        </w:rPr>
+      </w:pPr>
+      <w:r>
+        <w:rPr>
+          <w:lang w:eastAsia="zh-CN"/>
+        </w:rPr>
+        <w:t>Guided by this cross-layer view, we propose a fully asynchronous hierarchical NoC that jointly addresses the performance factors in (1). The main contributions of this work are summarized as follows:</w:t>
+      </w:r>
+    </w:p>
+    <w:p>
+      <w:pPr>
+        <w:pStyle w:val="a3"/>
+        <w:rPr>
+          <w:lang w:eastAsia="zh-CN"/>
+        </w:rPr>
+      </w:pPr>
+      <w:r>
+        <w:rPr>
+          <w:lang w:eastAsia="zh-CN"/>
+        </w:rPr>
+        <w:t xml:space="preserve">• </w:t>
+      </w:r>
+      <w:r>
+        <w:rPr>
+          <w:b/>
+          <w:bCs/>
+          <w:lang w:eastAsia="zh-CN"/>
+        </w:rPr>
+        <w:t>A hierarchical network organization for scale-out:</w:t>
+      </w:r>
+      <w:r>
+        <w:rPr>
+          <w:lang w:eastAsia="zh-CN"/>
+        </w:rPr>
+        <w:t xml:space="preserve"> PEs are organized into fixed-depth local trees connected by an upper on-chip mesh. Local communication remains within small tree clusters, while larger systems are formed by adding </w:t>
+      </w:r>
+      <w:r>
+        <w:rPr>
+          <w:lang w:eastAsia="zh-CN"/>
+        </w:rPr>
+        <w:lastRenderedPageBreak/>
+        <w:t>clusters to the mesh, limiting hop-count growth while reducing the amount of traffic exposed to the global network.</w:t>
+      </w:r>
+    </w:p>
+    <w:p>
+      <w:pPr>
+        <w:pStyle w:val="a3"/>
+        <w:rPr>
+          <w:lang w:eastAsia="zh-CN"/>
+        </w:rPr>
+      </w:pPr>
+      <w:r>
+        <w:rPr>
+          <w:lang w:eastAsia="zh-CN"/>
+        </w:rPr>
+        <w:t xml:space="preserve">• </w:t>
+      </w:r>
+      <w:r>
+        <w:rPr>
+          <w:b/>
+          <w:bCs/>
+          <w:lang w:eastAsia="zh-CN"/>
+        </w:rPr>
+        <w:t>Multicast routing across local trees and the upper mesh:</w:t>
+      </w:r>
+      <w:r>
+        <w:rPr>
+          <w:lang w:eastAsia="zh-CN"/>
+        </w:rPr>
+        <w:t xml:space="preserve"> A multicast transaction initiated by a single source injection remains multicast as it traverses both parts of the network. This avoids converting communication into separate point-to-point transmissions at the hierarchy boundary, reducing redundant traffic and its contribution to contention.</w:t>
+      </w:r>
+    </w:p>
+    <w:p>
+      <w:pPr>
+        <w:pStyle w:val="a3"/>
+        <w:rPr>
+          <w:rFonts w:hint="eastAsia"/>
+          <w:lang w:eastAsia="zh-CN"/>
+        </w:rPr>
+      </w:pPr>
+      <w:r>
+        <w:rPr>
+          <w:lang w:eastAsia="zh-CN"/>
+        </w:rPr>
+        <w:t xml:space="preserve">• </w:t>
+      </w:r>
+      <w:r>
+        <w:rPr>
+          <w:b/>
+          <w:bCs/>
+          <w:lang w:eastAsia="zh-CN"/>
+        </w:rPr>
+        <w:t>Fully asynchronous control of multiple physical lanes:</w:t>
+      </w:r>
+      <w:r>
+        <w:rPr>
+          <w:lang w:eastAsia="zh-CN"/>
+        </w:rPr>
+        <w:t xml:space="preserve"> Selected parts of the hierarchy use multiple physical lanes to increase service capacity where traffic converges. Each multicast branch is assigned to an available lane until the packet completes, while the control logic preserves the request and acknowledgment state of the two-phase handshake, reducing local forwarding and contention delays without relying on local clocks.</w:t>
+      </w:r>
+    </w:p>
+    <w:p>
+      <w:pPr>
+        <w:pStyle w:val="1"/>
+        <w:rPr>
+          <w:lang w:eastAsia="zh-CN"/>
+        </w:rPr>
+      </w:pPr>
+      <w:r>
+        <w:rPr>
+          <w:rFonts w:hint="eastAsia"/>
+          <w:lang w:eastAsia="zh-CN"/>
+        </w:rPr>
+        <w:t>Backgroud &amp; Motivation</w:t>
+      </w:r>
+    </w:p>
+    <w:p>
+      <w:pPr>
+        <w:pStyle w:val="2"/>
+      </w:pPr>
+      <w:r>
+        <w:t>Communication in Large-Scale Neuromorphic Systems</w:t>
+      </w:r>
+    </w:p>
+    <w:p>
+      <w:pPr>
+        <w:pStyle w:val="a3"/>
+        <w:rPr>
+          <w:lang w:val="en-US" w:eastAsia="zh-CN"/>
+        </w:rPr>
+      </w:pPr>
+      <w:r>
+        <w:rPr>
+          <w:lang w:val="en-US" w:eastAsia="zh-CN"/>
+        </w:rPr>
+        <w:t>Neuromorphic processors distribute neurons and synapses across many processing cores, while the logical connections between neurons are realized through the communication fabric. A widely adopted model is Address-Event Representation (AER), in which a neuron generates an event when it fires and the corresponding address is delivered to its destination cores (DYNAPs). This communication differs from conventional point-to-point traffic in several important ways. Neural connectivity can exhibit very large fanout, so one source event may need to reach many destinations (Multicast Tree Router). Event activity is typically sparse and data-driven, yet each event can trigger multiple network transfers because of this one-to-many connectivity (HBS). Moreover, neural networks exhibit strong communication locality together with less frequent long-range connections, requiring efficient communication both within nearby groups and across the larger system (DYNAPs).</w:t>
+      </w:r>
+    </w:p>
+    <w:p>
+      <w:pPr>
+        <w:pStyle w:val="a3"/>
         <w:ind w:firstLine="0pt"/>
         <w:rPr>
-          <w:rFonts w:hint="eastAsia"/>
-          <w:color w:val="000000" w:themeColor="text1"/>
           <w:lang w:val="en-US" w:eastAsia="zh-CN"/>
         </w:rPr>
       </w:pPr>
       <w:r>
         <w:rPr>
-          <w:lang w:eastAsia="zh-CN"/>
+          <w:lang w:val="en-US" w:eastAsia="zh-CN"/>
         </w:rPr>
         <w:tab/>
       </w:r>
@@ -523,1321 +1543,160 @@
         <w:rPr>
           <w:lang w:val="en-US" w:eastAsia="zh-CN"/>
         </w:rPr>
-        <w:t xml:space="preserve">Event-driven systems, particularly neuromorphic processors, communicate through sparse events that may target many destinations </w:t>
+        <w:t xml:space="preserve">As the system grows, these characteristics place several simultaneous demands on the NoC. Longer-distance communication increases the routing work required to reach remote destinations, while high fanout increases the amount of traffic injected into and carried by the network. Traffic from multiple sources can also converge on shared routers and links, making local service capacity increasingly important. Accordingly, bandwidth, latency, and routing-resource requirements have been identified as major scalability concerns in large neuromorphic systems (DYNAPs), while multicast addressing and routing metadata also contribute to communication energy and storage overhead (HBS). The event-driven nature of these systems further makes asynchronous communication a natural implementation choice, since transfers can proceed through local handshakes without a global network clock (Asynchronous Design; Reusable DATE’26). Large-scale neuromorphic </w:t>
+      </w:r>
+      <w:proofErr w:type="spellStart"/>
+      <w:r>
+        <w:rPr>
+          <w:lang w:val="en-US" w:eastAsia="zh-CN"/>
+        </w:rPr>
+        <w:t>NoCs</w:t>
+      </w:r>
+      <w:proofErr w:type="spellEnd"/>
+      <w:r>
+        <w:rPr>
+          <w:lang w:val="en-US" w:eastAsia="zh-CN"/>
+        </w:rPr>
+        <w:t xml:space="preserve"> therefore face concurrent pressure from communication distance, traffic volume, and local service demand, which have motivated optimization at multiple levels of the network.</w:t>
+      </w:r>
+      <w:r>
+        <w:rPr>
+          <w:lang w:val="en-US" w:eastAsia="zh-CN"/>
+        </w:rPr>
+        <w:tab/>
       </w:r>
       <w:r>
         <w:rPr>
           <w:rFonts w:hint="eastAsia"/>
           <w:lang w:val="en-US" w:eastAsia="zh-CN"/>
         </w:rPr>
-        <w:t>[1]</w:t>
+        <w:t>PICTURE: Two phase and four phase</w:t>
       </w:r>
       <w:r>
         <w:rPr>
           <w:rFonts w:hint="eastAsia"/>
           <w:lang w:val="en-US" w:eastAsia="zh-CN"/>
         </w:rPr>
-        <w:t xml:space="preserve">, [2], [3], </w:t>
-      </w:r>
-      <w:r>
-        <w:rPr>
-          <w:lang w:val="en-US" w:eastAsia="zh-CN"/>
-        </w:rPr>
-        <w:t>[4].</w:t>
-      </w:r>
+        <w:t xml:space="preserve"> protocol</w:t>
+      </w:r>
+    </w:p>
+    <w:p>
+      <w:pPr>
+        <w:pStyle w:val="2"/>
+        <w:rPr>
+          <w:lang w:eastAsia="zh-CN"/>
+        </w:rPr>
+      </w:pPr>
       <w:r>
         <w:rPr>
           <w:rFonts w:hint="eastAsia"/>
-          <w:lang w:val="en-US" w:eastAsia="zh-CN"/>
-        </w:rPr>
-        <w:t xml:space="preserve"> </w:t>
-      </w:r>
-      <w:r>
-        <w:rPr>
-          <w:lang w:val="en-US" w:eastAsia="zh-CN"/>
-        </w:rPr>
-        <w:t>As a result, a single event often needs to be delivered from one source to a set of processing elements</w:t>
-      </w:r>
-      <w:r>
-        <w:rPr>
-          <w:rFonts w:hint="eastAsia"/>
-          <w:lang w:val="en-US" w:eastAsia="zh-CN"/>
-        </w:rPr>
-        <w:t xml:space="preserve"> (PEs)</w:t>
-      </w:r>
-      <w:r>
-        <w:rPr>
-          <w:lang w:val="en-US" w:eastAsia="zh-CN"/>
-        </w:rPr>
-        <w:t xml:space="preserve">, </w:t>
-      </w:r>
-      <w:r>
-        <w:rPr>
-          <w:color w:val="000000" w:themeColor="text1"/>
-          <w:highlight w:val="yellow"/>
-          <w:lang w:val="en-US" w:eastAsia="zh-CN"/>
-        </w:rPr>
-        <w:t>giving rise to one-to-many, or multicast, communication</w:t>
-      </w:r>
-      <w:r>
-        <w:rPr>
-          <w:lang w:val="en-US" w:eastAsia="zh-CN"/>
-        </w:rPr>
-        <w:t xml:space="preserve"> [5], [6].</w:t>
-      </w:r>
-      <w:r>
-        <w:rPr>
-          <w:rFonts w:hint="eastAsia"/>
-          <w:lang w:val="en-US" w:eastAsia="zh-CN"/>
-        </w:rPr>
-        <w:t xml:space="preserve"> </w:t>
-      </w:r>
-      <w:r>
-        <w:rPr>
-          <w:lang w:val="en-US" w:eastAsia="zh-CN"/>
-        </w:rPr>
-        <w:t xml:space="preserve">With hardware multicast support, </w:t>
-      </w:r>
-      <w:r>
-        <w:rPr>
-          <w:rFonts w:hint="eastAsia"/>
-          <w:lang w:val="en-US" w:eastAsia="zh-CN"/>
-        </w:rPr>
-        <w:t>the source injects</w:t>
-      </w:r>
-      <w:r>
-        <w:rPr>
-          <w:rFonts w:hint="eastAsia"/>
-          <w:lang w:val="en-US" w:eastAsia="zh-CN"/>
-        </w:rPr>
-        <w:t xml:space="preserve"> </w:t>
-      </w:r>
-      <w:r>
-        <w:rPr>
-          <w:rFonts w:hint="eastAsia"/>
-          <w:lang w:val="en-US" w:eastAsia="zh-CN"/>
-        </w:rPr>
-        <w:t xml:space="preserve">a single </w:t>
-      </w:r>
-      <w:r>
-        <w:rPr>
-          <w:rFonts w:hint="eastAsia"/>
-          <w:lang w:val="en-US" w:eastAsia="zh-CN"/>
-        </w:rPr>
-        <w:t>packet, which is</w:t>
-      </w:r>
-      <w:r>
-        <w:rPr>
-          <w:lang w:val="en-US" w:eastAsia="zh-CN"/>
-        </w:rPr>
-        <w:t xml:space="preserve"> replicated inside the network</w:t>
-      </w:r>
-      <w:r>
-        <w:rPr>
-          <w:rFonts w:hint="eastAsia"/>
-          <w:lang w:val="en-US" w:eastAsia="zh-CN"/>
-        </w:rPr>
-        <w:t xml:space="preserve"> </w:t>
-      </w:r>
-      <w:r>
-        <w:rPr>
-          <w:lang w:val="en-US" w:eastAsia="zh-CN"/>
-        </w:rPr>
-        <w:t>when delivery paths diverge,</w:t>
-      </w:r>
-      <w:r>
-        <w:rPr>
-          <w:rFonts w:hint="eastAsia"/>
-          <w:lang w:val="en-US" w:eastAsia="zh-CN"/>
-        </w:rPr>
-        <w:t xml:space="preserve"> </w:t>
-      </w:r>
-      <w:r>
-        <w:rPr>
-          <w:rFonts w:hint="eastAsia"/>
-          <w:lang w:val="en-US" w:eastAsia="zh-CN"/>
-        </w:rPr>
-        <w:t>whereas</w:t>
-      </w:r>
-      <w:r>
-        <w:rPr>
-          <w:lang w:val="en-US" w:eastAsia="zh-CN"/>
-        </w:rPr>
-        <w:t xml:space="preserve"> unicast-based multicast generates separate point-to-point packets for individual destinations </w:t>
-      </w:r>
-      <w:r>
-        <w:rPr>
-          <w:rFonts w:hint="eastAsia"/>
-          <w:lang w:val="en-US" w:eastAsia="zh-CN"/>
-        </w:rPr>
-        <w:t>[2], [5], [6]</w:t>
-      </w:r>
-      <w:r>
-        <w:rPr>
-          <w:lang w:val="en-US" w:eastAsia="zh-CN"/>
-        </w:rPr>
-        <w:t>.</w:t>
-      </w:r>
-      <w:r>
-        <w:rPr>
-          <w:rFonts w:hint="eastAsia"/>
-          <w:lang w:val="en-US" w:eastAsia="zh-CN"/>
-        </w:rPr>
-        <w:t xml:space="preserve"> </w:t>
-      </w:r>
-      <w:r>
-        <w:rPr>
-          <w:lang w:val="en-US" w:eastAsia="zh-CN"/>
-        </w:rPr>
-        <w:t xml:space="preserve">Such support becomes increasingly important as neuromorphic systems scale to hundreds or thousands of </w:t>
-      </w:r>
-      <w:r>
-        <w:rPr>
-          <w:rFonts w:hint="eastAsia"/>
-          <w:lang w:val="en-US" w:eastAsia="zh-CN"/>
-        </w:rPr>
-        <w:t>PEs</w:t>
-      </w:r>
-      <w:r>
-        <w:rPr>
-          <w:lang w:val="en-US" w:eastAsia="zh-CN"/>
-        </w:rPr>
-        <w:t xml:space="preserve">, where repeated unicasts increase injection traffic and duplicate transmissions along shared paths </w:t>
-      </w:r>
-      <w:r>
-        <w:rPr>
-          <w:rFonts w:hint="eastAsia"/>
-          <w:lang w:val="en-US" w:eastAsia="zh-CN"/>
-        </w:rPr>
-        <w:t>[2], [3], [5], [6]</w:t>
-      </w:r>
-      <w:r>
-        <w:rPr>
-          <w:lang w:val="en-US" w:eastAsia="zh-CN"/>
-        </w:rPr>
-        <w:t>.</w:t>
-      </w:r>
-      <w:r>
-        <w:rPr>
-          <w:lang w:val="en-US" w:eastAsia="zh-CN"/>
-        </w:rPr>
-        <w:t xml:space="preserve"> </w:t>
-      </w:r>
-      <w:r>
-        <w:rPr>
-          <w:lang w:val="en-US" w:eastAsia="zh-CN"/>
-        </w:rPr>
-        <w:t xml:space="preserve">Fully asynchronous </w:t>
-      </w:r>
-      <w:proofErr w:type="spellStart"/>
-      <w:r>
-        <w:rPr>
-          <w:lang w:val="en-US" w:eastAsia="zh-CN"/>
-        </w:rPr>
-        <w:t>NoCs</w:t>
-      </w:r>
-      <w:proofErr w:type="spellEnd"/>
-      <w:r>
-        <w:rPr>
-          <w:lang w:val="en-US" w:eastAsia="zh-CN"/>
-        </w:rPr>
-        <w:t xml:space="preserve"> are also well matched to sparse and irregular event activity, since communication proceeds through local ha</w:t>
-      </w:r>
-      <w:r>
-        <w:rPr>
-          <w:color w:val="000000" w:themeColor="text1"/>
-          <w:lang w:val="en-US" w:eastAsia="zh-CN"/>
-        </w:rPr>
-        <w:t>ndshakes without requiring a global network clock [</w:t>
-      </w:r>
-      <w:r>
-        <w:rPr>
-          <w:rFonts w:hint="eastAsia"/>
-          <w:color w:val="000000" w:themeColor="text1"/>
-          <w:lang w:val="en-US" w:eastAsia="zh-CN"/>
-        </w:rPr>
-        <w:t>7</w:t>
-      </w:r>
-      <w:r>
-        <w:rPr>
-          <w:color w:val="000000" w:themeColor="text1"/>
-          <w:lang w:val="en-US" w:eastAsia="zh-CN"/>
-        </w:rPr>
-        <w:t>], [</w:t>
-      </w:r>
-      <w:r>
-        <w:rPr>
-          <w:rFonts w:hint="eastAsia"/>
-          <w:color w:val="000000" w:themeColor="text1"/>
-          <w:lang w:val="en-US" w:eastAsia="zh-CN"/>
-        </w:rPr>
-        <w:t>8</w:t>
-      </w:r>
-      <w:r>
-        <w:rPr>
-          <w:color w:val="000000" w:themeColor="text1"/>
-          <w:lang w:val="en-US" w:eastAsia="zh-CN"/>
-        </w:rPr>
-        <w:t>].</w:t>
-      </w:r>
-      <w:r>
-        <w:rPr>
-          <w:color w:val="000000" w:themeColor="text1"/>
-          <w:lang w:val="en-US" w:eastAsia="zh-CN"/>
-        </w:rPr>
-        <w:t xml:space="preserve"> </w:t>
-      </w:r>
-      <w:r>
-        <w:rPr>
-          <w:color w:val="000000" w:themeColor="text1"/>
-          <w:highlight w:val="yellow"/>
-          <w:lang w:val="en-US" w:eastAsia="zh-CN"/>
-        </w:rPr>
-        <w:t>At larger scales, topology becomes an equally important part of the communication problem.</w:t>
-      </w:r>
-      <w:r>
-        <w:rPr>
-          <w:spacing w:val="0"/>
-          <w:lang w:val="en-US" w:eastAsia="en-US"/>
-        </w:rPr>
-        <w:t xml:space="preserve"> </w:t>
-      </w:r>
-      <w:r>
-        <w:rPr>
-          <w:color w:val="000000" w:themeColor="text1"/>
-          <w:lang w:val="en-US" w:eastAsia="zh-CN"/>
-        </w:rPr>
-        <w:t>In a</w:t>
-      </w:r>
-      <w:r>
-        <w:rPr>
-          <w:rFonts w:hint="eastAsia"/>
-          <w:color w:val="000000" w:themeColor="text1"/>
-          <w:lang w:val="en-US" w:eastAsia="zh-CN"/>
-        </w:rPr>
-        <w:t xml:space="preserve"> conventional</w:t>
-      </w:r>
-      <w:r>
-        <w:rPr>
-          <w:color w:val="000000" w:themeColor="text1"/>
-          <w:lang w:val="en-US" w:eastAsia="zh-CN"/>
-        </w:rPr>
-        <w:t xml:space="preserve"> flat 2-D mesh</w:t>
-      </w:r>
-      <w:r>
-        <w:rPr>
-          <w:rFonts w:hint="eastAsia"/>
-          <w:color w:val="000000" w:themeColor="text1"/>
-          <w:lang w:val="en-US" w:eastAsia="zh-CN"/>
-        </w:rPr>
-        <w:t xml:space="preserve"> network</w:t>
-      </w:r>
-      <w:r>
-        <w:rPr>
-          <w:color w:val="000000" w:themeColor="text1"/>
-          <w:lang w:val="en-US" w:eastAsia="zh-CN"/>
-        </w:rPr>
-        <w:t>, routing resources remain directly associated with the endpoint array, while long-distance packets traverse more routers as the network grow</w:t>
-      </w:r>
-      <w:r>
-        <w:rPr>
-          <w:rFonts w:hint="eastAsia"/>
-          <w:color w:val="000000" w:themeColor="text1"/>
-          <w:lang w:val="en-US" w:eastAsia="zh-CN"/>
-        </w:rPr>
-        <w:t>.</w:t>
-      </w:r>
-      <w:r>
-        <w:rPr>
-          <w:rFonts w:hint="eastAsia"/>
-          <w:color w:val="000000" w:themeColor="text1"/>
-          <w:lang w:val="en-US" w:eastAsia="zh-CN"/>
-        </w:rPr>
-        <w:t xml:space="preserve"> </w:t>
-      </w:r>
-      <w:r>
-        <w:rPr>
-          <w:rFonts w:hint="eastAsia"/>
-          <w:color w:val="000000" w:themeColor="text1"/>
-          <w:lang w:val="en-US" w:eastAsia="zh-CN"/>
-        </w:rPr>
-        <w:t>H</w:t>
-      </w:r>
-      <w:r>
-        <w:rPr>
-          <w:color w:val="000000" w:themeColor="text1"/>
-          <w:lang w:val="en-US" w:eastAsia="zh-CN"/>
-        </w:rPr>
-        <w:t>ierarchical organizations provide another scaling approach by handling nearby communication within smaller groups and using an upper network only when traffic leaves those groups [1].</w:t>
-      </w:r>
-      <w:r>
-        <w:rPr>
-          <w:spacing w:val="0"/>
-          <w:lang w:val="en-US" w:eastAsia="en-US"/>
-        </w:rPr>
-        <w:t xml:space="preserve"> </w:t>
-      </w:r>
-      <w:r>
-        <w:rPr>
-          <w:color w:val="000000" w:themeColor="text1"/>
-          <w:highlight w:val="yellow"/>
-          <w:lang w:val="en-US" w:eastAsia="zh-CN"/>
-        </w:rPr>
-        <w:t>The scale-out challenge</w:t>
-      </w:r>
-      <w:r>
-        <w:rPr>
-          <w:color w:val="000000" w:themeColor="text1"/>
-          <w:lang w:val="en-US" w:eastAsia="zh-CN"/>
-        </w:rPr>
-        <w:t xml:space="preserve"> is therefore to retain efficient multicast while </w:t>
-      </w:r>
-      <w:r>
-        <w:rPr>
-          <w:rFonts w:hint="eastAsia"/>
-          <w:color w:val="000000" w:themeColor="text1"/>
-          <w:lang w:val="en-US" w:eastAsia="zh-CN"/>
-        </w:rPr>
-        <w:t>reducing</w:t>
-      </w:r>
-      <w:r>
-        <w:rPr>
-          <w:color w:val="000000" w:themeColor="text1"/>
-          <w:lang w:val="en-US" w:eastAsia="zh-CN"/>
-        </w:rPr>
-        <w:t xml:space="preserve"> the </w:t>
-      </w:r>
-      <w:r>
-        <w:rPr>
-          <w:rFonts w:hint="eastAsia"/>
-          <w:color w:val="000000" w:themeColor="text1"/>
-          <w:lang w:val="en-US" w:eastAsia="zh-CN"/>
-        </w:rPr>
-        <w:t>amount of routing</w:t>
-      </w:r>
-      <w:r>
-        <w:rPr>
-          <w:color w:val="000000" w:themeColor="text1"/>
-          <w:lang w:val="en-US" w:eastAsia="zh-CN"/>
-        </w:rPr>
-        <w:t xml:space="preserve"> structure</w:t>
-      </w:r>
-      <w:r>
-        <w:rPr>
-          <w:rFonts w:hint="eastAsia"/>
-          <w:color w:val="000000" w:themeColor="text1"/>
-          <w:lang w:val="en-US" w:eastAsia="zh-CN"/>
-        </w:rPr>
-        <w:t xml:space="preserve"> and traffic exposed to the global network as the number of PEs </w:t>
-      </w:r>
-      <w:proofErr w:type="gramStart"/>
-      <w:r>
-        <w:rPr>
-          <w:rFonts w:hint="eastAsia"/>
-          <w:color w:val="000000" w:themeColor="text1"/>
-          <w:lang w:val="en-US" w:eastAsia="zh-CN"/>
-        </w:rPr>
-        <w:t>grows</w:t>
-      </w:r>
-      <w:r>
-        <w:rPr>
-          <w:color w:val="000000" w:themeColor="text1"/>
-          <w:lang w:val="en-US" w:eastAsia="zh-CN"/>
-        </w:rPr>
-        <w:t>.</w:t>
-      </w:r>
-      <w:r>
-        <w:rPr>
-          <w:rFonts w:hint="eastAsia"/>
-          <w:color w:val="000000" w:themeColor="text1"/>
-          <w:lang w:val="en-US" w:eastAsia="zh-CN"/>
-        </w:rPr>
-        <w:t>(</w:t>
-      </w:r>
-      <w:proofErr w:type="gramEnd"/>
-      <w:r>
-        <w:rPr>
-          <w:rFonts w:hint="eastAsia"/>
-          <w:color w:val="000000" w:themeColor="text1"/>
-          <w:lang w:val="en-US" w:eastAsia="zh-CN"/>
-        </w:rPr>
-        <w:t>Main topic: Scale out problem of NoC)</w:t>
-      </w:r>
-    </w:p>
-    <w:p>
-      <w:pPr>
-        <w:pStyle w:val="a3"/>
-        <w:ind w:firstLine="0pt"/>
-        <w:rPr>
-          <w:rFonts w:hint="eastAsia"/>
-          <w:color w:val="000000" w:themeColor="text1"/>
-          <w:lang w:val="en-US" w:eastAsia="zh-CN"/>
-        </w:rPr>
-      </w:pPr>
-      <w:r>
-        <w:rPr>
-          <w:color w:val="000000" w:themeColor="text1"/>
-          <w:lang w:val="en-US" w:eastAsia="zh-CN"/>
-        </w:rPr>
-        <w:tab/>
-      </w:r>
-      <w:r>
-        <w:rPr>
-          <w:rFonts w:hint="eastAsia"/>
-          <w:color w:val="000000" w:themeColor="text1"/>
-          <w:lang w:val="en-US" w:eastAsia="zh-CN"/>
-        </w:rPr>
-        <w:t>Figure.1: Multicast &amp; Topology</w:t>
-      </w:r>
-    </w:p>
-    <w:p>
-      <w:pPr>
-        <w:pStyle w:val="a3"/>
-        <w:rPr>
-          <w:rFonts w:hint="eastAsia"/>
-          <w:lang w:val="en-US" w:eastAsia="zh-CN"/>
-        </w:rPr>
-      </w:pPr>
-      <w:r>
-        <w:rPr>
-          <w:lang w:val="en-US" w:eastAsia="zh-CN"/>
-        </w:rPr>
-        <w:t xml:space="preserve">Existing </w:t>
-      </w:r>
-      <w:proofErr w:type="spellStart"/>
-      <w:r>
-        <w:rPr>
-          <w:lang w:val="en-US" w:eastAsia="zh-CN"/>
-        </w:rPr>
-        <w:t>NoCs</w:t>
-      </w:r>
-      <w:proofErr w:type="spellEnd"/>
-      <w:r>
-        <w:rPr>
-          <w:lang w:val="en-US" w:eastAsia="zh-CN"/>
-        </w:rPr>
-        <w:t xml:space="preserve"> address different parts of this </w:t>
-      </w:r>
-      <w:r>
-        <w:rPr>
-          <w:color w:val="000000" w:themeColor="text1"/>
-          <w:lang w:val="en-US" w:eastAsia="zh-CN"/>
-        </w:rPr>
-        <w:t xml:space="preserve">scale-out </w:t>
-      </w:r>
-      <w:r>
-        <w:rPr>
-          <w:lang w:val="en-US" w:eastAsia="zh-CN"/>
-        </w:rPr>
-        <w:t xml:space="preserve">problem. </w:t>
-      </w:r>
-      <w:r>
-        <w:rPr>
-          <w:color w:val="000000" w:themeColor="text1"/>
-          <w:highlight w:val="yellow"/>
-          <w:lang w:val="en-US" w:eastAsia="zh-CN"/>
-        </w:rPr>
-        <w:t>One approach is to extend a regular mesh through system tilin</w:t>
-      </w:r>
-      <w:r>
-        <w:rPr>
-          <w:rFonts w:hint="eastAsia"/>
-          <w:color w:val="000000" w:themeColor="text1"/>
-          <w:lang w:val="en-US" w:eastAsia="zh-CN"/>
-        </w:rPr>
-        <w:t xml:space="preserve">g. </w:t>
-      </w:r>
-      <w:r>
-        <w:rPr>
-          <w:lang w:val="en-US" w:eastAsia="zh-CN"/>
-        </w:rPr>
-        <w:t xml:space="preserve">IBM TrueNorth supports seamless 2-D chip tiling, while Intel </w:t>
-      </w:r>
-      <w:proofErr w:type="spellStart"/>
-      <w:r>
-        <w:rPr>
-          <w:lang w:val="en-US" w:eastAsia="zh-CN"/>
-        </w:rPr>
-        <w:t>Loihi</w:t>
-      </w:r>
-      <w:proofErr w:type="spellEnd"/>
-      <w:r>
-        <w:rPr>
-          <w:lang w:val="en-US" w:eastAsia="zh-CN"/>
-        </w:rPr>
-        <w:t xml:space="preserve"> 2 extends its on-chip mesh through parallel interfaces and has been scaled to 1,152 processors in the Hala Point system </w:t>
-      </w:r>
-      <w:r>
-        <w:rPr>
-          <w:rFonts w:hint="eastAsia"/>
-          <w:lang w:val="en-US" w:eastAsia="zh-CN"/>
-        </w:rPr>
-        <w:t>[9], [10], [11]</w:t>
-      </w:r>
-      <w:r>
-        <w:rPr>
-          <w:lang w:val="en-US" w:eastAsia="zh-CN"/>
-        </w:rPr>
-        <w:t xml:space="preserve">. Such systems demonstrate that regular mesh fabrics can reach very large scales through tiled integration and substantial communication bandwidth. </w:t>
-      </w:r>
-      <w:r>
-        <w:rPr>
-          <w:color w:val="000000" w:themeColor="text1"/>
-          <w:highlight w:val="yellow"/>
-          <w:lang w:val="en-US" w:eastAsia="zh-CN"/>
-        </w:rPr>
-        <w:t xml:space="preserve">Hierarchical </w:t>
-      </w:r>
-      <w:proofErr w:type="spellStart"/>
-      <w:r>
-        <w:rPr>
-          <w:color w:val="000000" w:themeColor="text1"/>
-          <w:highlight w:val="yellow"/>
-          <w:lang w:val="en-US" w:eastAsia="zh-CN"/>
-        </w:rPr>
-        <w:t>NoCs</w:t>
-      </w:r>
-      <w:proofErr w:type="spellEnd"/>
-      <w:r>
-        <w:rPr>
-          <w:color w:val="000000" w:themeColor="text1"/>
-          <w:highlight w:val="yellow"/>
-          <w:lang w:val="en-US" w:eastAsia="zh-CN"/>
-        </w:rPr>
-        <w:t xml:space="preserve"> provide another approach by keeping local traffic away from the upper network</w:t>
-      </w:r>
-      <w:r>
-        <w:rPr>
-          <w:highlight w:val="yellow"/>
-          <w:lang w:val="en-US" w:eastAsia="zh-CN"/>
-        </w:rPr>
-        <w:t>.</w:t>
-      </w:r>
-      <w:r>
-        <w:rPr>
-          <w:lang w:val="en-US" w:eastAsia="zh-CN"/>
-        </w:rPr>
-        <w:t xml:space="preserve"> DYNAPs combines R1/R2 hierarchical routing with an R3 2-D mesh and reports </w:t>
-      </w:r>
-      <w:r>
-        <w:rPr>
-          <w:lang w:val="en-US" w:eastAsia="zh-CN"/>
-        </w:rPr>
-        <w:t>that its hierarchy significantly reduces the traffic reaching R3 compared with a plain 2-D mesh [1]. However, communication to remote targets is generated as point-to-point copies and forwarded through R3 according to their individual mesh destinations. PAICORE instead supports multicast in a five-level quadtree whose number of parallel data paths progressively increases toward the root [1</w:t>
-      </w:r>
-      <w:r>
-        <w:rPr>
-          <w:rFonts w:hint="eastAsia"/>
-          <w:lang w:val="en-US" w:eastAsia="zh-CN"/>
-        </w:rPr>
-        <w:t>2</w:t>
-      </w:r>
-      <w:r>
-        <w:rPr>
-          <w:lang w:val="en-US" w:eastAsia="zh-CN"/>
-        </w:rPr>
-        <w:t xml:space="preserve">]. Its routing nodes remain locally clocked domains connected through asynchronous two-phase interfaces, while its 2-D mesh is used for communication between chips rather than between local on-chip clusters. Recent designs have further explored multicast in two-tier </w:t>
-      </w:r>
-      <w:proofErr w:type="spellStart"/>
-      <w:r>
-        <w:rPr>
-          <w:lang w:val="en-US" w:eastAsia="zh-CN"/>
-        </w:rPr>
-        <w:t>NoCs</w:t>
-      </w:r>
-      <w:proofErr w:type="spellEnd"/>
-      <w:r>
-        <w:rPr>
-          <w:lang w:val="en-US" w:eastAsia="zh-CN"/>
-        </w:rPr>
-        <w:t>, hierarchical Mesh-of-Trees organizations, and fully asynchronous hierarchical multicast trees [1</w:t>
-      </w:r>
-      <w:r>
-        <w:rPr>
-          <w:rFonts w:hint="eastAsia"/>
-          <w:lang w:val="en-US" w:eastAsia="zh-CN"/>
-        </w:rPr>
-        <w:t>3</w:t>
-      </w:r>
-      <w:r>
-        <w:rPr>
-          <w:lang w:val="en-US" w:eastAsia="zh-CN"/>
-        </w:rPr>
-        <w:t>]</w:t>
-      </w:r>
-      <w:r>
-        <w:rPr>
-          <w:rFonts w:hint="eastAsia"/>
-          <w:lang w:val="en-US" w:eastAsia="zh-CN"/>
-        </w:rPr>
-        <w:t>, [1</w:t>
-      </w:r>
-      <w:r>
-        <w:rPr>
-          <w:rFonts w:hint="eastAsia"/>
-          <w:lang w:val="en-US" w:eastAsia="zh-CN"/>
-        </w:rPr>
-        <w:t>4</w:t>
-      </w:r>
-      <w:r>
-        <w:rPr>
-          <w:rFonts w:hint="eastAsia"/>
-          <w:lang w:val="en-US" w:eastAsia="zh-CN"/>
-        </w:rPr>
-        <w:t xml:space="preserve">], </w:t>
-      </w:r>
-      <w:r>
-        <w:rPr>
-          <w:lang w:val="en-US" w:eastAsia="zh-CN"/>
-        </w:rPr>
-        <w:t>[1</w:t>
-      </w:r>
-      <w:r>
-        <w:rPr>
-          <w:rFonts w:hint="eastAsia"/>
-          <w:lang w:val="en-US" w:eastAsia="zh-CN"/>
-        </w:rPr>
-        <w:t>5</w:t>
-      </w:r>
-      <w:r>
-        <w:rPr>
-          <w:lang w:val="en-US" w:eastAsia="zh-CN"/>
-        </w:rPr>
-        <w:t xml:space="preserve">]. </w:t>
-      </w:r>
-      <w:r>
-        <w:rPr>
-          <w:highlight w:val="yellow"/>
-          <w:lang w:val="en-US" w:eastAsia="zh-CN"/>
-        </w:rPr>
-        <w:t>These works extend multicast and hierarchical communication in different directions</w:t>
-      </w:r>
-      <w:r>
-        <w:rPr>
-          <w:lang w:val="en-US" w:eastAsia="zh-CN"/>
-        </w:rPr>
-        <w:t xml:space="preserve">, but do not provide a fully asynchronous architecture in which </w:t>
-      </w:r>
-      <w:r>
-        <w:rPr>
-          <w:highlight w:val="yellow"/>
-          <w:lang w:val="en-US" w:eastAsia="zh-CN"/>
-        </w:rPr>
-        <w:t>a multicast transaction remains multicast while traversing both local tree structures and an upper on-chip mesh</w:t>
-      </w:r>
-      <w:r>
-        <w:rPr>
-          <w:lang w:val="en-US" w:eastAsia="zh-CN"/>
-        </w:rPr>
-        <w:t>, without being converted into separate point-to-point transactions for different clusters.</w:t>
-      </w:r>
-      <w:r>
-        <w:rPr>
-          <w:lang w:val="en-US" w:eastAsia="zh-CN"/>
-        </w:rPr>
-        <w:t xml:space="preserve"> Implementing this communication with multiple physical lanes in a fully asynchronous network introduces a second challenge, </w:t>
-      </w:r>
-      <w:r>
-        <w:rPr>
-          <w:highlight w:val="yellow"/>
-          <w:lang w:val="en-US" w:eastAsia="zh-CN"/>
-        </w:rPr>
-        <w:t>since lane selection and arbitration must maintain the correct two-phase handshake state without relying on local clocks</w:t>
-      </w:r>
-      <w:r>
-        <w:rPr>
-          <w:lang w:val="en-US" w:eastAsia="zh-CN"/>
-        </w:rPr>
-        <w:t>.</w:t>
-      </w:r>
-      <w:r>
-        <w:rPr>
-          <w:rFonts w:hint="eastAsia"/>
-          <w:lang w:val="en-US" w:eastAsia="zh-CN"/>
-        </w:rPr>
-        <w:t xml:space="preserve"> </w:t>
-      </w:r>
-      <w:r>
-        <w:rPr>
-          <w:rFonts w:hint="eastAsia"/>
-          <w:lang w:val="en-US" w:eastAsia="zh-CN"/>
-        </w:rPr>
-        <w:t xml:space="preserve">(multicast algorithm &amp; </w:t>
-      </w:r>
-      <w:proofErr w:type="spellStart"/>
-      <w:r>
-        <w:rPr>
-          <w:rFonts w:hint="eastAsia"/>
-          <w:lang w:val="en-US" w:eastAsia="zh-CN"/>
-        </w:rPr>
-        <w:t>laneSelction</w:t>
-      </w:r>
-      <w:proofErr w:type="spellEnd"/>
-      <w:r>
-        <w:rPr>
-          <w:rFonts w:hint="eastAsia"/>
-          <w:lang w:val="en-US" w:eastAsia="zh-CN"/>
-        </w:rPr>
-        <w:t>)</w:t>
-      </w:r>
-    </w:p>
-    <w:p>
-      <w:pPr>
-        <w:pStyle w:val="a3"/>
-        <w:ind w:firstLine="0pt"/>
-        <w:rPr>
-          <w:lang w:val="en-US" w:eastAsia="zh-CN"/>
-        </w:rPr>
-      </w:pPr>
-      <w:r>
-        <w:rPr>
-          <w:lang w:val="en-US" w:eastAsia="zh-CN"/>
-        </w:rPr>
-        <w:tab/>
-      </w:r>
-      <w:r>
-        <w:rPr>
-          <w:lang w:val="en-US" w:eastAsia="zh-CN"/>
-        </w:rPr>
-        <w:t xml:space="preserve">To address these challenges, we propose </w:t>
-      </w:r>
-      <w:r>
-        <w:rPr>
-          <w:highlight w:val="yellow"/>
-          <w:lang w:val="en-US" w:eastAsia="zh-CN"/>
-        </w:rPr>
-        <w:t>a fully asynchronous hierarchical NoC</w:t>
-      </w:r>
-      <w:r>
-        <w:rPr>
-          <w:lang w:val="en-US" w:eastAsia="zh-CN"/>
-        </w:rPr>
-        <w:t xml:space="preserve"> in which PEs are organized into local trees and these trees are connected by an on-chip 2-D mesh. A source injects one multicast packet, which is replicated as needed in both parts of the network without being reinjected as separate unicast packets when communication crosses the boundary between the tree and mesh. The two parts use the same destination description but apply different routing rules suited to their respective topologies, allowing the multicast transaction to continue through the complete hierarchy. Each local tree uses </w:t>
-      </w:r>
-      <w:r>
-        <w:rPr>
-          <w:highlight w:val="yellow"/>
-          <w:lang w:val="en-US" w:eastAsia="zh-CN"/>
-        </w:rPr>
-        <w:t>a limited number of parallel physical lanes to provide additional bandwidth without allowing the number of lanes to continue increasing toward the upper levels</w:t>
-      </w:r>
-      <w:r>
-        <w:rPr>
-          <w:lang w:val="en-US" w:eastAsia="zh-CN"/>
-        </w:rPr>
-        <w:t>. To operate these lanes entirely under two-phase asynchronous control, each multicast branch is assigned to one physical lane until the packet completes, while the control logic maintains the correct handshake state during lane selection and arbitration.</w:t>
-      </w:r>
-    </w:p>
-    <w:p>
-      <w:pPr>
-        <w:pStyle w:val="a3"/>
-        <w:ind w:firstLine="0pt"/>
-        <w:rPr>
-          <w:lang w:val="en-US" w:eastAsia="zh-CN"/>
-        </w:rPr>
-      </w:pPr>
-      <w:r>
-        <w:rPr>
-          <w:lang w:val="en-US" w:eastAsia="zh-CN"/>
-        </w:rPr>
-        <w:tab/>
-      </w:r>
-      <w:r>
-        <w:rPr>
-          <w:lang w:val="en-US" w:eastAsia="zh-CN"/>
-        </w:rPr>
-        <w:t>Together, these design choices allow multicast communication to span the complete hierarchy while preserving fully asynchronous operation. The main contributions of this work are summarized as follows:</w:t>
-      </w:r>
-    </w:p>
-    <w:p>
-      <w:pPr>
-        <w:pStyle w:val="a3"/>
-        <w:rPr>
-          <w:rFonts w:hint="eastAsia"/>
-          <w:lang w:val="en-US" w:eastAsia="zh-CN"/>
+          <w:lang w:eastAsia="zh-CN"/>
+        </w:rPr>
+        <w:t>Scale-out NoC Architectures</w:t>
+      </w:r>
+    </w:p>
+    <w:p>
+      <w:pPr>
+        <w:ind w:firstLine="14.40pt"/>
+        <w:jc w:val="both"/>
+        <w:rPr>
+          <w:lang w:eastAsia="zh-CN"/>
+        </w:rPr>
+      </w:pPr>
+      <w:r>
+        <w:rPr>
+          <w:lang w:eastAsia="zh-CN"/>
+        </w:rPr>
+        <w:t xml:space="preserve">Prior work has attacked the NoC performance problem at several abstraction levels. At the network level, topology determines how far packets travel and where traffic tends to accumulate. Routing then decides how the available paths are used, while multicast can reduce duplicated communication </w:t>
+      </w:r>
+      <w:r>
+        <w:rPr>
+          <w:lang w:eastAsia="zh-CN"/>
+        </w:rPr>
+        <w:t>for one-to-many traffic. At the router level, microarchitecture determines how quickly each hop can accept and forward packets. These optimizations address different sources of communication cost, but their effects become increasingly coupled as the network grows.</w:t>
+      </w:r>
+    </w:p>
+    <w:p>
+      <w:pPr>
+        <w:ind w:firstLine="14.40pt"/>
+        <w:jc w:val="both"/>
+        <w:rPr>
+          <w:lang w:eastAsia="zh-CN"/>
         </w:rPr>
       </w:pPr>
       <w:r>
         <w:rPr>
           <w:b/>
           <w:bCs/>
-          <w:lang w:val="en-US" w:eastAsia="zh-CN"/>
-        </w:rPr>
-        <w:t>•</w:t>
-      </w:r>
+          <w:lang w:eastAsia="zh-CN"/>
+        </w:rPr>
+        <w:t>First, topology optimization aims to reduce costly router traversals while avoiding severe traffic concentration.</w:t>
+      </w:r>
+      <w:r>
+        <w:rPr>
+          <w:lang w:eastAsia="zh-CN"/>
+        </w:rPr>
+        <w:t xml:space="preserve"> Regular 2-D meshes are attractive because they are simple and modular, but their diameter grows with network size. Prior work has therefore explored higher-connectivity and hierarchical organizations to shorten long routes or keep local traffic away from the global network (Flattened Butterfly; DYNAPs; Hierarchical Mesh-of-Trees). Fat-tree structures further add bandwidth near aggregation points to alleviate convergence (PAICORE). Such changes can reduce path cost, but they also introduce additional links, larger routers, or heavier traffic concentration at upper levels. In this sense, topology optimization often relocates the bottleneck rather than removing it.</w:t>
+      </w:r>
+    </w:p>
+    <w:p>
+      <w:pPr>
+        <w:ind w:firstLine="14.40pt"/>
+        <w:jc w:val="both"/>
+        <w:rPr>
+          <w:lang w:eastAsia="zh-CN"/>
+        </w:rPr>
+      </w:pPr>
       <w:r>
         <w:rPr>
           <w:b/>
           <w:bCs/>
-          <w:spacing w:val="0"/>
-          <w:lang w:val="en-US" w:eastAsia="en-US"/>
-        </w:rPr>
-        <w:t xml:space="preserve"> </w:t>
-      </w:r>
+          <w:lang w:eastAsia="zh-CN"/>
+        </w:rPr>
+        <w:t>Second, routing and multicast improve performance by using the available network resources more efficiently.</w:t>
+      </w:r>
+      <w:r>
+        <w:rPr>
+          <w:lang w:eastAsia="zh-CN"/>
+        </w:rPr>
+        <w:t xml:space="preserve"> Adaptive routing can steer packets away from congested regions, whereas hardware multicast is especially useful for high-fanout traffic because it avoids repeatedly injecting the same information for different destinations. Tree-based replication and recursive partitioning allow a packet to be copied only where delivery paths diverge, while compact destination representations reduce the routing information carried by multicast packets (VCTM; Multicast Tree Router; CMR; HBS). These techniques can substantially reduce redundant traffic, but lower traffic volume alone does not guarantee low latency when packets still follow long routes or converge at busy routers.</w:t>
+      </w:r>
+    </w:p>
+    <w:p>
+      <w:pPr>
+        <w:ind w:firstLine="14.40pt"/>
+        <w:jc w:val="both"/>
+        <w:rPr>
+          <w:lang w:eastAsia="zh-CN"/>
+        </w:rPr>
+      </w:pPr>
       <w:r>
         <w:rPr>
           <w:b/>
           <w:bCs/>
-          <w:highlight w:val="yellow"/>
-          <w:lang w:val="en-US" w:eastAsia="zh-CN"/>
-        </w:rPr>
-        <w:t>Multicast routing across local trees and an upper mesh.</w:t>
-      </w:r>
-      <w:r>
-        <w:rPr>
-          <w:b/>
-          <w:bCs/>
-          <w:lang w:val="en-US" w:eastAsia="zh-CN"/>
-        </w:rPr>
-        <w:t xml:space="preserve"> </w:t>
-      </w:r>
-      <w:r>
-        <w:rPr>
-          <w:lang w:val="en-US" w:eastAsia="zh-CN"/>
-        </w:rPr>
-        <w:t xml:space="preserve">We use the same destination description in both parts of the network and develop routing methods suited to each topology. A multicast transaction initiated by a single source injection can be routed and replicated through the upper mesh </w:t>
-      </w:r>
-      <w:r>
-        <w:rPr>
-          <w:lang w:val="en-US" w:eastAsia="zh-CN"/>
-        </w:rPr>
-        <w:lastRenderedPageBreak/>
-        <w:t xml:space="preserve">and subsequently distributed within the destination trees without being converted into separate unicast transactions for individual </w:t>
-      </w:r>
-      <w:proofErr w:type="gramStart"/>
-      <w:r>
-        <w:rPr>
-          <w:lang w:val="en-US" w:eastAsia="zh-CN"/>
-        </w:rPr>
-        <w:t>clusters.</w:t>
-      </w:r>
-      <w:r>
-        <w:rPr>
-          <w:rFonts w:hint="eastAsia"/>
-          <w:lang w:val="en-US" w:eastAsia="zh-CN"/>
-        </w:rPr>
-        <w:t>(</w:t>
-      </w:r>
-      <w:proofErr w:type="gramEnd"/>
-      <w:r>
-        <w:rPr>
-          <w:rFonts w:hint="eastAsia"/>
-          <w:lang w:val="en-US" w:eastAsia="zh-CN"/>
-        </w:rPr>
-        <w:t>routing-based algorithms)</w:t>
-      </w:r>
-    </w:p>
-    <w:p>
-      <w:pPr>
-        <w:pStyle w:val="a3"/>
-        <w:rPr>
-          <w:rFonts w:hint="eastAsia"/>
-          <w:lang w:val="en-US" w:eastAsia="zh-CN"/>
-        </w:rPr>
-      </w:pPr>
-      <w:r>
-        <w:rPr>
-          <w:b/>
-          <w:bCs/>
-          <w:highlight w:val="yellow"/>
-          <w:lang w:val="en-US" w:eastAsia="zh-CN"/>
-        </w:rPr>
-        <w:t>• Fully asynchronous control of multiple physical lanes</w:t>
-      </w:r>
-      <w:r>
-        <w:rPr>
-          <w:b/>
-          <w:bCs/>
-          <w:lang w:val="en-US" w:eastAsia="zh-CN"/>
-        </w:rPr>
-        <w:t>.</w:t>
-      </w:r>
-      <w:r>
-        <w:rPr>
-          <w:lang w:val="en-US" w:eastAsia="zh-CN"/>
-        </w:rPr>
-        <w:t xml:space="preserve"> We allow each multicast branch to use an available physical lane while keeping that lane assigned until the packet completes. The control logic maintains the correct state of the two-phase handshake during lane selection and arbitration, enabling dynamic lane use without local clocks.</w:t>
-      </w:r>
-      <w:r>
-        <w:rPr>
-          <w:rFonts w:hint="eastAsia"/>
-          <w:lang w:val="en-US" w:eastAsia="zh-CN"/>
-        </w:rPr>
-        <w:t xml:space="preserve"> </w:t>
-      </w:r>
-      <w:proofErr w:type="gramStart"/>
-      <w:r>
-        <w:rPr>
-          <w:rFonts w:hint="eastAsia"/>
-          <w:lang w:val="en-US" w:eastAsia="zh-CN"/>
-        </w:rPr>
-        <w:t>(</w:t>
-      </w:r>
-      <w:proofErr w:type="gramEnd"/>
-      <w:r>
-        <w:rPr>
-          <w:rFonts w:hint="eastAsia"/>
-          <w:lang w:val="en-US" w:eastAsia="zh-CN"/>
-        </w:rPr>
-        <w:t>multi-lane adapta</w:t>
-      </w:r>
-      <w:r>
-        <w:rPr>
-          <w:rFonts w:hint="eastAsia"/>
-          <w:lang w:val="en-US" w:eastAsia="zh-CN"/>
-        </w:rPr>
-        <w:t>tion</w:t>
-      </w:r>
-      <w:r>
-        <w:rPr>
-          <w:rFonts w:hint="eastAsia"/>
-          <w:lang w:val="en-US" w:eastAsia="zh-CN"/>
-        </w:rPr>
-        <w:t>)</w:t>
-      </w:r>
-    </w:p>
-    <w:p>
-      <w:pPr>
-        <w:pStyle w:val="a3"/>
-        <w:rPr>
-          <w:rFonts w:hint="eastAsia"/>
-          <w:lang w:val="en-US" w:eastAsia="zh-CN"/>
-        </w:rPr>
-      </w:pPr>
-      <w:r>
-        <w:rPr>
-          <w:b/>
-          <w:bCs/>
-          <w:lang w:val="en-US" w:eastAsia="zh-CN"/>
-        </w:rPr>
-        <w:t xml:space="preserve">• </w:t>
-      </w:r>
-      <w:r>
-        <w:rPr>
-          <w:b/>
-          <w:bCs/>
-          <w:highlight w:val="yellow"/>
-          <w:lang w:val="en-US" w:eastAsia="zh-CN"/>
-        </w:rPr>
-        <w:t>A scale-out NoC organization with local trees and an upper on-chip mesh</w:t>
-      </w:r>
-      <w:r>
-        <w:rPr>
-          <w:b/>
-          <w:bCs/>
-          <w:lang w:val="en-US" w:eastAsia="zh-CN"/>
-        </w:rPr>
-        <w:t>.</w:t>
-      </w:r>
-      <w:r>
-        <w:rPr>
-          <w:lang w:val="en-US" w:eastAsia="zh-CN"/>
-        </w:rPr>
-        <w:t xml:space="preserve"> We organize PEs into local trees with a fixed number of levels and connect these trees through an on-chip 2-D mesh. A </w:t>
-      </w:r>
-      <w:r>
-        <w:rPr>
-          <w:highlight w:val="yellow"/>
-          <w:lang w:val="en-US" w:eastAsia="zh-CN"/>
-        </w:rPr>
-        <w:t>limited number of parallel physical lanes</w:t>
-      </w:r>
-      <w:r>
-        <w:rPr>
-          <w:lang w:val="en-US" w:eastAsia="zh-CN"/>
-        </w:rPr>
-        <w:t xml:space="preserve"> provides additional bandwidth inside each tree, while system size increases by adding tree clusters to the mesh rather than by continuously extending a single hierarchy.</w:t>
-      </w:r>
-    </w:p>
-    <w:p>
-      <w:pPr>
-        <w:pStyle w:val="1"/>
-        <w:rPr>
-          <w:lang w:eastAsia="zh-CN"/>
-        </w:rPr>
-      </w:pPr>
-      <w:r>
-        <w:rPr>
-          <w:rFonts w:hint="eastAsia"/>
-          <w:lang w:eastAsia="zh-CN"/>
-        </w:rPr>
-        <w:t>Backgroud &amp; Motivation</w:t>
-      </w:r>
-    </w:p>
-    <w:p>
-      <w:pPr>
-        <w:jc w:val="both"/>
-        <w:rPr>
-          <w:rFonts w:hint="eastAsia"/>
-          <w:lang w:eastAsia="zh-CN"/>
-        </w:rPr>
-      </w:pPr>
-      <w:r>
-        <w:rPr>
-          <w:rFonts w:hint="eastAsia"/>
-          <w:lang w:eastAsia="zh-CN"/>
-        </w:rPr>
-        <w:t xml:space="preserve">Asynchronous Router design </w:t>
-      </w:r>
-      <w:r>
-        <w:rPr>
-          <w:lang w:eastAsia="zh-CN"/>
-        </w:rPr>
-        <w:t>–</w:t>
-      </w:r>
-      <w:r>
-        <w:rPr>
-          <w:rFonts w:hint="eastAsia"/>
-          <w:lang w:eastAsia="zh-CN"/>
-        </w:rPr>
-        <w:t xml:space="preserve"> NoC structure - Propose</w:t>
-      </w:r>
-    </w:p>
-    <w:p>
-      <w:pPr>
-        <w:pStyle w:val="2"/>
-      </w:pPr>
-      <w:r>
-        <w:t>Asynchronous NoC Communication</w:t>
-      </w:r>
-    </w:p>
-    <w:p>
-      <w:pPr>
-        <w:pStyle w:val="a3"/>
-        <w:rPr>
-          <w:lang w:eastAsia="zh-CN"/>
-        </w:rPr>
-      </w:pPr>
-      <w:r>
-        <w:rPr>
-          <w:lang w:eastAsia="zh-CN"/>
-        </w:rPr>
-        <w:t xml:space="preserve">Asynchronous </w:t>
+          <w:lang w:eastAsia="zh-CN"/>
+        </w:rPr>
+        <w:t>Finally, router design determines the cost of each hop and the rate at which local traffic can be served.</w:t>
+      </w:r>
+      <w:r>
+        <w:rPr>
+          <w:lang w:eastAsia="zh-CN"/>
+        </w:rPr>
+        <w:t xml:space="preserve"> Previous work has reduced forwarding latency through more efficient buffering, arbitration, bypassing, and parallel </w:t>
       </w:r>
       <w:proofErr w:type="spellStart"/>
       <w:r>
         <w:rPr>
           <w:lang w:eastAsia="zh-CN"/>
         </w:rPr>
-        <w:t>NoCs</w:t>
+        <w:t>datapaths</w:t>
       </w:r>
       <w:proofErr w:type="spellEnd"/>
       <w:r>
         <w:rPr>
           <w:lang w:eastAsia="zh-CN"/>
         </w:rPr>
-        <w:t xml:space="preserve"> replace global clocked synchronization with local handshakes between neighboring routers and pipeline stages [7], [8]. As illustrated in Fig. X, a communication channel typically uses a forward request (Req) and a backward acknowledgment (Ack). In a four-phase protocol, Req and Ack are asserted to complete a transfer and then </w:t>
-      </w:r>
-      <w:proofErr w:type="spellStart"/>
-      <w:r>
-        <w:rPr>
-          <w:lang w:eastAsia="zh-CN"/>
-        </w:rPr>
-        <w:t>deasserted</w:t>
-      </w:r>
-      <w:proofErr w:type="spellEnd"/>
-      <w:r>
-        <w:rPr>
-          <w:lang w:eastAsia="zh-CN"/>
-        </w:rPr>
-        <w:t xml:space="preserve"> to return the channel to its initial state, requiring two round-trip communications per transaction. In contrast, two-phase, or transition-signaling, communication treats each transition as a new event: the sender toggles Req after presenting valid data, the receiver accepts the transfer and toggles Ack, and the next transaction proceeds using the opposite signal phases without a return-to-zero step [7], [8]. This reduces handshake overhead, but makes the Req/Ack phase part of the channel state and therefore increases the complexity of arbitration and dynamic resource selection. In bundled-data implementations, conventional single-rail data are accompanied by Req/Ack control, with a local timing constraint ensuring that the data become valid before the corresponding request is observed [8], [18].</w:t>
-      </w:r>
-    </w:p>
-    <w:p>
-      <w:pPr>
-        <w:pStyle w:val="a3"/>
-        <w:rPr>
-          <w:rFonts w:hint="eastAsia"/>
-          <w:lang w:eastAsia="zh-CN"/>
-        </w:rPr>
-      </w:pPr>
-      <w:r>
-        <w:rPr>
-          <w:lang w:eastAsia="zh-CN"/>
-        </w:rPr>
-        <w:t xml:space="preserve">A broad range of asynchronous </w:t>
-      </w:r>
-      <w:proofErr w:type="spellStart"/>
-      <w:r>
-        <w:rPr>
-          <w:lang w:eastAsia="zh-CN"/>
-        </w:rPr>
-        <w:t>NoCs</w:t>
-      </w:r>
-      <w:proofErr w:type="spellEnd"/>
-      <w:r>
-        <w:rPr>
-          <w:lang w:eastAsia="zh-CN"/>
-        </w:rPr>
-        <w:t xml:space="preserve"> has explored these implementation trade-offs, including QDI networks, lightweight bundled-data interconnects, transition-signaling switches, two-phase delay-insensitive routers, advanced-node implementations, and recent standard-cell methodologies [16]–[19], [21], [23]. For example, the transition-signaling router in [18] extends two-phase bundled-data communication throughout a complete five-port switch, while [21] evaluates a related asynchronous architecture against an industrial synchronous router in a 14-nm </w:t>
-      </w:r>
-      <w:proofErr w:type="spellStart"/>
-      <w:r>
-        <w:rPr>
-          <w:lang w:eastAsia="zh-CN"/>
-        </w:rPr>
-        <w:t>FinFET</w:t>
-      </w:r>
-      <w:proofErr w:type="spellEnd"/>
-      <w:r>
-        <w:rPr>
-          <w:lang w:eastAsia="zh-CN"/>
-        </w:rPr>
-        <w:t xml:space="preserve"> library. More recently, [23] demonstrates a fully asynchronous standard-cell router and design methodology in 22 nm. Hardware multicast is also well established: local speculation enables parallel multicast in an asynchronous variant of a Mesh-of-Trees network [20], CMR supports continuous-time replication of multi-flit packets with independently progressing output branches [6], and Ultra specializes asynchronous routing for low-cost multicast in neuromorphic systems [22]. These works establish asynchronous routing and hardware multicast as important building blocks for the architecture considered here.</w:t>
-      </w:r>
-    </w:p>
-    <w:p>
-      <w:pPr>
-        <w:pStyle w:val="a3"/>
-        <w:ind w:firstLine="0pt"/>
-        <w:rPr>
-          <w:rFonts w:hint="eastAsia"/>
-          <w:lang w:val="en-US" w:eastAsia="zh-CN"/>
-        </w:rPr>
-      </w:pPr>
-      <w:r>
-        <w:rPr>
-          <w:lang w:val="en-US" w:eastAsia="zh-CN"/>
-        </w:rPr>
-        <w:tab/>
-      </w:r>
-      <w:r>
-        <w:rPr>
-          <w:rFonts w:hint="eastAsia"/>
-          <w:lang w:val="en-US" w:eastAsia="zh-CN"/>
-        </w:rPr>
-        <w:t>PICTURE: Two phase and four phase</w:t>
-      </w:r>
-      <w:r>
-        <w:rPr>
-          <w:rFonts w:hint="eastAsia"/>
-          <w:lang w:val="en-US" w:eastAsia="zh-CN"/>
-        </w:rPr>
-        <w:t xml:space="preserve"> protocol</w:t>
-      </w:r>
-    </w:p>
-    <w:p>
-      <w:pPr>
-        <w:pStyle w:val="2"/>
-        <w:rPr>
-          <w:lang w:eastAsia="zh-CN"/>
-        </w:rPr>
-      </w:pPr>
-      <w:r>
-        <w:rPr>
-          <w:rFonts w:hint="eastAsia"/>
-          <w:lang w:eastAsia="zh-CN"/>
-        </w:rPr>
-        <w:t>Scale-out NoC Architectures</w:t>
-      </w:r>
-    </w:p>
-    <w:p>
-      <w:pPr>
-        <w:ind w:start="14.40pt" w:firstLine="21.60pt"/>
-        <w:jc w:val="both"/>
-        <w:rPr>
-          <w:lang w:eastAsia="zh-CN"/>
-        </w:rPr>
-      </w:pPr>
-      <w:r>
-        <w:rPr>
-          <w:lang w:eastAsia="zh-CN"/>
-        </w:rPr>
-        <w:t xml:space="preserve">Hierarchical organizations provide another dimension for scaling </w:t>
-      </w:r>
-      <w:proofErr w:type="spellStart"/>
-      <w:r>
-        <w:rPr>
-          <w:lang w:eastAsia="zh-CN"/>
-        </w:rPr>
-        <w:t>NoCs</w:t>
-      </w:r>
-      <w:proofErr w:type="spellEnd"/>
-      <w:r>
-        <w:rPr>
-          <w:lang w:eastAsia="zh-CN"/>
-        </w:rPr>
-        <w:t xml:space="preserve"> by keeping nearby communication within smaller groups and exposing only longer-distance traffic to the upper network. </w:t>
-      </w:r>
-      <w:r>
-        <w:rPr>
-          <w:highlight w:val="yellow"/>
-          <w:lang w:eastAsia="zh-CN"/>
-        </w:rPr>
-        <w:t>DYNAPs</w:t>
-      </w:r>
-      <w:r>
-        <w:rPr>
-          <w:lang w:eastAsia="zh-CN"/>
-        </w:rPr>
-        <w:t xml:space="preserve"> combines tree-based R1/R2 routing with an R3 2-D mesh and reports that the hierarchy substantially reduces the amount of traffic reaching R3 compared with a plain 2-D mesh [1]. For each event, its routing-memory loop can sequentially read multiple destination entries; each entry is then directed to a local broadcast, a point-to-point transfer to another core, or mesh routing toward a remote core according to its destination information [1]. Thus, hierarchy and mesh routing are already established in an asynchronous event-driven network, but communication to multiple remote targets is represented by individually addressed transfers rather than by a multicast transaction that continues through both structures. </w:t>
-      </w:r>
-    </w:p>
-    <w:p>
-      <w:pPr>
-        <w:ind w:start="14.40pt" w:firstLine="21.60pt"/>
-        <w:jc w:val="both"/>
-        <w:rPr>
-          <w:lang w:eastAsia="zh-CN"/>
-        </w:rPr>
-      </w:pPr>
-      <w:r>
-        <w:rPr>
-          <w:highlight w:val="yellow"/>
-          <w:lang w:eastAsia="zh-CN"/>
-        </w:rPr>
-        <w:t>PAICORE</w:t>
-      </w:r>
-      <w:r>
-        <w:rPr>
-          <w:lang w:eastAsia="zh-CN"/>
-        </w:rPr>
-        <w:t xml:space="preserve"> addresses another scaling problem: traffic convergence within a large hierarchy. Its five-level quadtree increases the number of parallel paths toward the root, alleviating the progressively larger convergence ratio of a conventional tree [12]. The selected 4:2 fat-tree organization achieves 1.42× the throughput of the non-fat tree while requiring only 0.39× the routing paths of a 4:4 implementation [12]. This demonstrates that selectively increasing bandwidth can effectively alleviate hierarchy bottlenecks, but also introduces a design trade-off between available bandwidth and the amount of routing hardware provisioned toward the upper levels. </w:t>
-      </w:r>
-    </w:p>
-    <w:p>
-      <w:pPr>
-        <w:ind w:start="14.40pt" w:firstLine="21.60pt"/>
-        <w:jc w:val="both"/>
-        <w:rPr>
-          <w:rFonts w:hint="eastAsia"/>
-          <w:lang w:eastAsia="zh-CN"/>
-        </w:rPr>
-      </w:pPr>
-      <w:r>
-        <w:rPr>
-          <w:lang w:eastAsia="zh-CN"/>
-        </w:rPr>
-        <w:t xml:space="preserve">Recent designs further explore multicast-optimized two-tier </w:t>
-      </w:r>
-      <w:proofErr w:type="spellStart"/>
-      <w:r>
-        <w:rPr>
-          <w:lang w:eastAsia="zh-CN"/>
-        </w:rPr>
-        <w:t>NoCs</w:t>
-      </w:r>
-      <w:proofErr w:type="spellEnd"/>
-      <w:r>
-        <w:rPr>
-          <w:lang w:eastAsia="zh-CN"/>
-        </w:rPr>
-        <w:t xml:space="preserve"> [13], hierarchical Mesh-of-Trees organizations [14], fully asynchronous hierarchical multicast trees [15], and bandwidth-tapered fat-tree networks with aggregated multicast [24]. These works establish hierarchical organization, combinations of tree and mesh structures, and nonuniform bandwidth provisioning as existing scale-out techniques. The remaining problem addressed in this work is how a multicast transaction can be routed through both local trees and an upper on-chip mesh without being reconstructed as separate point-to-point transfers, while providing additional bandwidth without requiring the number of physical paths to continue increasing with the hierarchy.</w:t>
-      </w:r>
-    </w:p>
-    <w:p>
-      <w:pPr>
-        <w:pStyle w:val="2"/>
-        <w:rPr>
-          <w:lang w:eastAsia="zh-CN"/>
-        </w:rPr>
-      </w:pPr>
-      <w:r>
-        <w:rPr>
-          <w:rFonts w:hint="eastAsia"/>
-          <w:lang w:eastAsia="zh-CN"/>
-        </w:rPr>
-        <w:t>Design Motivation</w:t>
+        <w:t xml:space="preserve"> (SMART; STORM). Asynchronous routers approach the same problem from the implementation side: local handshakes remove the need for a network-wide clock, while two-phase signaling avoids the return-to-zero phase of conventional four-phase communication (Transition DATE'13; 14-nm Asynchronous Router; Reusable DATE'26). This can reduce per-hop latency and energy, but higher local parallelism also increases area, arbitration complexity, and control overhead. In particular, dynamically selecting among multiple physical resources is more involved in a two-phase design because the request and acknowledgment phases form part of the communication state.</w:t>
       </w:r>
     </w:p>
     <w:p>
@@ -1852,6 +1711,55 @@
         <w:rPr>
           <w:lang w:eastAsia="zh-CN"/>
         </w:rPr>
+        <w:t>Taken together, these studies show that path length, network traffic, and router service capacity can each be improved independently. The difficulty at large scale is that optimizing one of them can expose another as the new bottleneck.</w:t>
+      </w:r>
+    </w:p>
+    <w:p>
+      <w:pPr>
+        <w:ind w:firstLine="14.40pt"/>
+        <w:jc w:val="both"/>
+        <w:rPr>
+          <w:lang w:eastAsia="zh-CN"/>
+        </w:rPr>
+      </w:pPr>
+    </w:p>
+    <w:p>
+      <w:pPr>
+        <w:ind w:firstLine="14.40pt"/>
+        <w:jc w:val="both"/>
+        <w:rPr>
+          <w:rFonts w:hint="eastAsia"/>
+          <w:lang w:eastAsia="zh-CN"/>
+        </w:rPr>
+      </w:pPr>
+    </w:p>
+    <w:p>
+      <w:pPr>
+        <w:pStyle w:val="2"/>
+        <w:rPr>
+          <w:lang w:eastAsia="zh-CN"/>
+        </w:rPr>
+      </w:pPr>
+      <w:r>
+        <w:rPr>
+          <w:rFonts w:hint="eastAsia"/>
+          <w:lang w:eastAsia="zh-CN"/>
+        </w:rPr>
+        <w:t>Design Motivation</w:t>
+      </w:r>
+    </w:p>
+    <w:p>
+      <w:pPr>
+        <w:ind w:firstLine="14.40pt"/>
+        <w:jc w:val="both"/>
+        <w:rPr>
+          <w:lang w:eastAsia="zh-CN"/>
+        </w:rPr>
+      </w:pPr>
+      <w:r>
+        <w:rPr>
+          <w:lang w:eastAsia="zh-CN"/>
+        </w:rPr>
         <w:t xml:space="preserve">These observations motivate three design objectives. First, </w:t>
       </w:r>
       <w:r>
@@ -1865,7 +1773,14 @@
         <w:rPr>
           <w:lang w:eastAsia="zh-CN"/>
         </w:rPr>
-        <w:t xml:space="preserve"> The two parts of the network should operate on the same destination description while applying routing rules suited to their respective topologies. Second, </w:t>
+        <w:t xml:space="preserve"> The two parts of the </w:t>
+      </w:r>
+      <w:r>
+        <w:rPr>
+          <w:lang w:eastAsia="zh-CN"/>
+        </w:rPr>
+        <w:lastRenderedPageBreak/>
+        <w:t xml:space="preserve">network should operate on the same destination description while applying routing rules suited to their respective topologies. Second, </w:t>
       </w:r>
       <w:r>
         <w:rPr>
@@ -1891,15 +1806,17 @@
         <w:rPr>
           <w:lang w:eastAsia="zh-CN"/>
         </w:rPr>
-        <w:t>. A limited number of parallel physical lanes can provide additional bandwidth inside each tree with</w:t>
-      </w:r>
-      <w:r>
-        <w:rPr>
-          <w:lang w:eastAsia="zh-CN"/>
-        </w:rPr>
-        <w:lastRenderedPageBreak/>
-        <w:t>out requiring the number of lanes to continue increasing toward the upper levels. Section III presents the architecture and routing mechanisms that realize these objectives.</w:t>
-      </w:r>
+        <w:t>. A limited number of parallel physical lanes can provide additional bandwidth inside each tree without requiring the number of lanes to continue increasing toward the upper levels. Section III presents the architecture and routing mechanisms that realize these objectives.</w:t>
+      </w:r>
+    </w:p>
+    <w:p>
+      <w:pPr>
+        <w:ind w:firstLine="14.40pt"/>
+        <w:jc w:val="both"/>
+        <w:rPr>
+          <w:lang w:eastAsia="zh-CN"/>
+        </w:rPr>
+      </w:pPr>
     </w:p>
     <w:p>
       <w:pPr>
@@ -2089,7 +2006,10 @@
         <w:pStyle w:val="a3"/>
       </w:pPr>
       <w:r>
-        <w:t>The equations are an exception to the prescribed specifications of this template. You will need to determine whether or not your equation should be typed using either the Times New Roman or the Symbol font (please no other font). To create multileveled equations, it may be necessary to treat the equation as a graphic and insert it into the text after your paper is styled.</w:t>
+        <w:t xml:space="preserve">The equations are an exception to the prescribed specifications of this template. You will need to determine whether or not your equation should be typed using either the Times New Roman or the Symbol font (please no other font). To create multileveled equations, it may be necessary to treat </w:t>
+      </w:r>
+      <w:r>
+        <w:t>the equation as a graphic and insert it into the text after your paper is styled.</w:t>
       </w:r>
     </w:p>
     <w:p>
@@ -2311,6 +2231,7 @@
         <w:pStyle w:val="1"/>
       </w:pPr>
       <w:r>
+        <w:lastRenderedPageBreak/>
         <w:t xml:space="preserve">Using the </w:t>
       </w:r>
       <w:r>
@@ -2406,11 +2327,7 @@
         <w:t xml:space="preserve">A minimum of one author is required for all conference articles. </w:t>
       </w:r>
       <w:r>
-        <w:t xml:space="preserve">Author names should be listed starting from left to </w:t>
-      </w:r>
-      <w:r>
-        <w:lastRenderedPageBreak/>
-        <w:t>right and then moving down to the next line. This is the author sequence that will be used in future citations and by indexing services.</w:t>
+        <w:t>Author names should be listed starting from left to right and then moving down to the next line. This is the author sequence that will be used in future citations and by indexing services.</w:t>
       </w:r>
       <w:r>
         <w:t xml:space="preserve"> </w:t>
@@ -2604,7 +2521,13 @@
         <w:rPr>
           <w:i w:val="0"/>
         </w:rPr>
-        <w:t>Place figures and tables at the top and bottom of columns. Avoid placing them in the middle of columns. Large figures and tables may span across both columns. Figure captions should be below the figures; table heads should appear above the tables. Insert figures and tables after they are cited in the text. Use the abbreviation “Fig. 1”, even at the beginning of a sentence.</w:t>
+        <w:t xml:space="preserve">Place figures and tables at the top and bottom of columns. Avoid placing them in the middle of columns. Large figures and tables may span across both columns. Figure captions should be below the figures; table heads should appear above the tables. Insert </w:t>
+      </w:r>
+      <w:r>
+        <w:rPr>
+          <w:i w:val="0"/>
+        </w:rPr>
+        <w:t>figures and tables after they are cited in the text. Use the abbreviation “Fig. 1”, even at the beginning of a sentence.</w:t>
       </w:r>
     </w:p>
     <w:p>
@@ -2887,10 +2810,7 @@
         <w:pStyle w:val="a3"/>
       </w:pPr>
       <w:r>
-        <w:t xml:space="preserve">Figure Labels: Use 8 point Times New Roman for Figure labels. Use words rather than symbols or abbreviations when writing Figure axis labels to avoid confusing the reader. As an </w:t>
-      </w:r>
-      <w:r>
-        <w:t>example, write the quantity “Magnetization”, or “Magnetization, M”, not just “M”. If including units in the label, present them within parentheses. Do not label axes only with units. In the example, write “Magnetization (A/m)” or “Magnetization {A[m(1)]}”, not just “A/m”. Do not label axes</w:t>
+        <w:t>Figure Labels: Use 8 point Times New Roman for Figure labels. Use words rather than symbols or abbreviations when writing Figure axis labels to avoid confusing the reader. As an example, write the quantity “Magnetization”, or “Magnetization, M”, not just “M”. If including units in the label, present them within parentheses. Do not label axes only with units. In the example, write “Magnetization (A/m)” or “Magnetization {A[m(1)]}”, not just “A/m”. Do not label axes</w:t>
       </w:r>
       <w:r>
         <w:t xml:space="preserve"> </w:t>
@@ -3129,6 +3049,7 @@
         <w:pStyle w:val="references"/>
       </w:pPr>
       <w:r>
+        <w:lastRenderedPageBreak/>
         <w:t xml:space="preserve"> M. Davies </w:t>
       </w:r>
       <w:r>
@@ -3218,15 +3139,7 @@
           <w:i/>
           <w:iCs/>
         </w:rPr>
-        <w:t xml:space="preserve">IEEE </w:t>
-      </w:r>
-      <w:r>
-        <w:rPr>
-          <w:i/>
-          <w:iCs/>
-        </w:rPr>
-        <w:lastRenderedPageBreak/>
-        <w:t>Micro</w:t>
+        <w:t>IEEE Micro</w:t>
       </w:r>
       <w:r>
         <w:t>, vol. 41, no. 1, pp. 69–81, Jan./Feb. 2021, doi: 10.1109/MM.2020.3002790.</w:t>
@@ -5827,6 +5740,25 @@
       <w:noProof/>
     </w:rPr>
   </w:style>
+  <w:style w:type="paragraph" w:styleId="ae">
+    <w:name w:val="Normal (Web)"/>
+    <w:basedOn w:val="a"/>
+    <w:rsid w:val="00BC0129"/>
+    <w:rPr>
+      <w:sz w:val="24"/>
+      <w:szCs w:val="24"/>
+    </w:rPr>
+  </w:style>
+  <w:style w:type="character" w:styleId="af">
+    <w:name w:val="Placeholder Text"/>
+    <w:basedOn w:val="a0"/>
+    <w:uiPriority w:val="99"/>
+    <w:semiHidden/>
+    <w:rsid w:val="00D21837"/>
+    <w:rPr>
+      <w:color w:val="666666"/>
+    </w:rPr>
+  </w:style>
 </w:styles>
 </file>
 

</xml_diff>

<commit_message>
Archive PROP_temp 64/256 experiment figures and sync Static4/sync/B8 flows.
Capture latest paper64/paper256 UR and F16 result panels plus PROP/PFAT temp RTL, DC/GLS runners, and DATE plan refresh for the current cohort.

Co-authored-by: Cursor <cursoragent@cursor.com>
</commit_message>
<xml_diff>
--- a/DATE paper/paper/A Scalable Asynchronous Hierachical NoC for High-Performance Multicst.docx
+++ b/DATE paper/paper/A Scalable Asynchronous Hierachical NoC for High-Performance Multicst.docx
@@ -22,7 +22,7 @@
           <w:szCs w:val="48"/>
           <w:lang w:eastAsia="zh-CN"/>
         </w:rPr>
-        <w:t>A Fully Asynchronous Hierarchical NoC with Multicast Routing Across Tree and Mesh Tiers</w:t>
+        <w:t>A Fully Asynchronous Hierarchical NoC for Scalable High-Fanout Communication</w:t>
       </w:r>
     </w:p>
     <w:p>
@@ -255,253 +255,65 @@
         <w:t>—</w:t>
       </w:r>
       <w:r>
-        <w:t xml:space="preserve">This electronic document is a “live” template and already defines the components of your paper [title, text, heads, etc.] in its style sheet. </w:t>
-      </w:r>
+        <w:t>Large-scale neuromorphic and event-driven processors increasingly rely on the on-chip network to support growing numbers of processing elements and high-fanout event transfers. As network scale increases, communication performance is limited by traversal overhead, redundant multicast traffic, and contention at aggregation points. This work presents a fully asynchronous hierarchical NoC combining a parallel-path hierarchy with a multi-plane upper mesh, cross-tier native multicast, and phase-adaptive multi-lane control under two-phase bundled-data handshaking. The architecture increases path diversity and aggregation capacity, preserves multicast sharing across hierarchy levels, and enables dynamic use of parallel physical lanes while maintaining correct channel phase relationships. Post-synthesis evaluation shows 379.2 Mflit/s/port peak delivered network throughput, a 93.8% reduction in multicast completion latency, and 3.00 Gflit/s aggregate throughput for a representative four-lane router. These results demonstrate a scalable fully asynchronous NoC with strong network, multicast, and router-level performance.</w:t>
+      </w:r>
+    </w:p>
+    <w:p>
+      <w:pPr>
+        <w:pStyle w:val="Keywords"/>
+      </w:pPr>
+      <w:r>
+        <w:t>Keywords—</w:t>
+      </w:r>
+      <w:r>
+        <w:t>component</w:t>
+      </w:r>
+      <w:r>
+        <w:t>,</w:t>
+      </w:r>
+      <w:r>
+        <w:t xml:space="preserve"> formatting</w:t>
+      </w:r>
+      <w:r>
+        <w:t>,</w:t>
+      </w:r>
+      <w:r>
+        <w:t xml:space="preserve"> style</w:t>
+      </w:r>
+      <w:r>
+        <w:t>,</w:t>
+      </w:r>
+      <w:r>
+        <w:t xml:space="preserve"> styling</w:t>
+      </w:r>
+      <w:r>
+        <w:t>,</w:t>
+      </w:r>
+      <w:r>
+        <w:t xml:space="preserve"> insert (</w:t>
+      </w:r>
+      <w:r>
+        <w:rPr>
+          <w:b w:val="0"/>
+        </w:rPr>
+        <w:t>key words</w:t>
+      </w:r>
+      <w:r>
+        <w:t>)</w:t>
+      </w:r>
+    </w:p>
+    <w:p>
+      <w:pPr>
+        <w:pStyle w:val="1"/>
+      </w:pPr>
+      <w:bookmarkStart w:id="0" w:name="_Ref239451333"/>
+      <w:r>
+        <w:t>Introduction</w:t>
+      </w:r>
+      <w:bookmarkEnd w:id="0"/>
       <w:r>
         <w:t xml:space="preserve"> </w:t>
       </w:r>
-      <w:r>
-        <w:rPr>
-          <w:i/>
-        </w:rPr>
-        <w:t>*</w:t>
-      </w:r>
-      <w:r>
-        <w:rPr>
-          <w:i/>
-        </w:rPr>
-        <w:t>CRITICAL:  Do</w:t>
-      </w:r>
-      <w:r>
-        <w:rPr>
-          <w:rFonts w:eastAsia="Times New Roman"/>
-          <w:i/>
-        </w:rPr>
-        <w:t xml:space="preserve"> </w:t>
-      </w:r>
-      <w:r>
-        <w:rPr>
-          <w:i/>
-        </w:rPr>
-        <w:t>Not</w:t>
-      </w:r>
-      <w:r>
-        <w:rPr>
-          <w:rFonts w:eastAsia="Times New Roman"/>
-          <w:i/>
-        </w:rPr>
-        <w:t xml:space="preserve"> </w:t>
-      </w:r>
-      <w:r>
-        <w:rPr>
-          <w:i/>
-        </w:rPr>
-        <w:t>Use</w:t>
-      </w:r>
-      <w:r>
-        <w:rPr>
-          <w:rFonts w:eastAsia="Times New Roman"/>
-          <w:i/>
-        </w:rPr>
-        <w:t xml:space="preserve"> </w:t>
-      </w:r>
-      <w:r>
-        <w:rPr>
-          <w:i/>
-        </w:rPr>
-        <w:t>Symbols,</w:t>
-      </w:r>
-      <w:r>
-        <w:rPr>
-          <w:rFonts w:eastAsia="Times New Roman"/>
-          <w:i/>
-        </w:rPr>
-        <w:t xml:space="preserve"> </w:t>
-      </w:r>
-      <w:r>
-        <w:rPr>
-          <w:i/>
-        </w:rPr>
-        <w:t>Special</w:t>
-      </w:r>
-      <w:r>
-        <w:rPr>
-          <w:rFonts w:eastAsia="Times New Roman"/>
-          <w:i/>
-        </w:rPr>
-        <w:t xml:space="preserve"> </w:t>
-      </w:r>
-      <w:r>
-        <w:rPr>
-          <w:i/>
-        </w:rPr>
-        <w:t>Characters,</w:t>
-      </w:r>
-      <w:r>
-        <w:rPr>
-          <w:rFonts w:eastAsia="Times New Roman"/>
-          <w:i/>
-        </w:rPr>
-        <w:t xml:space="preserve"> </w:t>
-      </w:r>
-      <w:r>
-        <w:rPr>
-          <w:rFonts w:eastAsia="Times New Roman"/>
-          <w:i/>
-        </w:rPr>
-        <w:t xml:space="preserve">Footnotes, </w:t>
-      </w:r>
-      <w:r>
-        <w:rPr>
-          <w:i/>
-        </w:rPr>
-        <w:t>or</w:t>
-      </w:r>
-      <w:r>
-        <w:rPr>
-          <w:rFonts w:eastAsia="Times New Roman"/>
-          <w:i/>
-        </w:rPr>
-        <w:t xml:space="preserve"> </w:t>
-      </w:r>
-      <w:r>
-        <w:rPr>
-          <w:i/>
-        </w:rPr>
-        <w:t>Math</w:t>
-      </w:r>
-      <w:r>
-        <w:rPr>
-          <w:rFonts w:eastAsia="Times New Roman"/>
-          <w:i/>
-        </w:rPr>
-        <w:t xml:space="preserve"> </w:t>
-      </w:r>
-      <w:r>
-        <w:rPr>
-          <w:i/>
-        </w:rPr>
-        <w:t>in</w:t>
-      </w:r>
-      <w:r>
-        <w:rPr>
-          <w:rFonts w:eastAsia="Times New Roman"/>
-          <w:i/>
-        </w:rPr>
-        <w:t xml:space="preserve"> Paper </w:t>
-      </w:r>
-      <w:r>
-        <w:rPr>
-          <w:i/>
-        </w:rPr>
-        <w:t>Title</w:t>
-      </w:r>
-      <w:r>
-        <w:rPr>
-          <w:rFonts w:eastAsia="Times New Roman"/>
-          <w:i/>
-        </w:rPr>
-        <w:t xml:space="preserve"> o</w:t>
-      </w:r>
-      <w:r>
-        <w:rPr>
-          <w:i/>
-        </w:rPr>
-        <w:t>r</w:t>
-      </w:r>
-      <w:r>
-        <w:rPr>
-          <w:rFonts w:eastAsia="Times New Roman"/>
-          <w:i/>
-        </w:rPr>
-        <w:t xml:space="preserve"> </w:t>
-      </w:r>
-      <w:r>
-        <w:rPr>
-          <w:i/>
-        </w:rPr>
-        <w:t>Abstract</w:t>
-      </w:r>
-      <w:r>
-        <w:t xml:space="preserve">. </w:t>
-      </w:r>
-      <w:r>
-        <w:rPr>
-          <w:iCs/>
-        </w:rPr>
-        <w:t>(</w:t>
-      </w:r>
-      <w:r>
-        <w:rPr>
-          <w:b w:val="0"/>
-          <w:i/>
-          <w:iCs/>
-        </w:rPr>
-        <w:t>Abstract</w:t>
-      </w:r>
-      <w:r>
-        <w:rPr>
-          <w:iCs/>
-        </w:rPr>
-        <w:t>)</w:t>
-      </w:r>
-    </w:p>
-    <w:p>
-      <w:pPr>
-        <w:pStyle w:val="Keywords"/>
-      </w:pPr>
-      <w:r>
-        <w:t>Keywords—</w:t>
-      </w:r>
-      <w:r>
-        <w:t>component</w:t>
-      </w:r>
-      <w:r>
-        <w:t>,</w:t>
-      </w:r>
-      <w:r>
-        <w:t xml:space="preserve"> formatting</w:t>
-      </w:r>
-      <w:r>
-        <w:t>,</w:t>
-      </w:r>
-      <w:r>
-        <w:t xml:space="preserve"> style</w:t>
-      </w:r>
-      <w:r>
-        <w:t>,</w:t>
-      </w:r>
-      <w:r>
-        <w:t xml:space="preserve"> styling</w:t>
-      </w:r>
-      <w:r>
-        <w:t>,</w:t>
-      </w:r>
-      <w:r>
-        <w:t xml:space="preserve"> insert (</w:t>
-      </w:r>
-      <w:r>
-        <w:rPr>
-          <w:b w:val="0"/>
-        </w:rPr>
-        <w:t>key words</w:t>
-      </w:r>
-      <w:r>
-        <w:t>)</w:t>
-      </w:r>
-    </w:p>
-    <w:p>
-      <w:pPr>
-        <w:pStyle w:val="1"/>
-      </w:pPr>
-      <w:bookmarkStart w:id="0" w:name="_Ref239451333"/>
-      <w:r>
-        <w:t>Introduction</w:t>
-      </w:r>
-      <w:bookmarkEnd w:id="0"/>
-      <w:r>
-        <w:t xml:space="preserve"> </w:t>
-      </w:r>
     </w:p>
     <w:p>
       <w:pPr>
@@ -514,49 +326,7 @@
         <w:rPr>
           <w:lang w:eastAsia="zh-CN"/>
         </w:rPr>
-        <w:t xml:space="preserve">Large-scale neuromorphic and event-driven processors increasingly depend on the scalability of their on-chip communication fabrics. IBM TrueNorth integrates 4,096 neurosynaptic cores on a single chip (TrueNorth), while the more recent PAICORE integrates 1,024 neuromorphic cores with an on-chip hierarchical interconnect (PAICORE). Intel’s </w:t>
-      </w:r>
-      <w:proofErr w:type="spellStart"/>
-      <w:r>
-        <w:rPr>
-          <w:lang w:eastAsia="zh-CN"/>
-        </w:rPr>
-        <w:t>Loihi</w:t>
-      </w:r>
-      <w:proofErr w:type="spellEnd"/>
-      <w:r>
-        <w:rPr>
-          <w:lang w:eastAsia="zh-CN"/>
-        </w:rPr>
-        <w:t xml:space="preserve"> 2 contains up to 128 fully asynchronous neuron cores connected by an on-chip network (</w:t>
-      </w:r>
-      <w:proofErr w:type="spellStart"/>
-      <w:r>
-        <w:rPr>
-          <w:lang w:eastAsia="zh-CN"/>
-        </w:rPr>
-        <w:t>Loihi</w:t>
-      </w:r>
-      <w:proofErr w:type="spellEnd"/>
-      <w:r>
-        <w:rPr>
-          <w:lang w:eastAsia="zh-CN"/>
-        </w:rPr>
-        <w:t xml:space="preserve"> 2 Technology Brief), and Hala Point further scales 1,152 </w:t>
-      </w:r>
-      <w:proofErr w:type="spellStart"/>
-      <w:r>
-        <w:rPr>
-          <w:lang w:eastAsia="zh-CN"/>
-        </w:rPr>
-        <w:t>Loihi</w:t>
-      </w:r>
-      <w:proofErr w:type="spellEnd"/>
-      <w:r>
-        <w:rPr>
-          <w:lang w:eastAsia="zh-CN"/>
-        </w:rPr>
-        <w:t xml:space="preserve"> 2 processors to 140,544 neuromorphic cores (Hala Point). Neural connectivity meanwhile requires sparse events to be delivered to both nearby and distant destinations with inherently high fanout. As system size grows, the network must therefore sustain more concurrent communication while meeting increasingly stringent latency, throughput, and energy constraints. Communication bandwidth, routing latency, and routing resources have consequently become important scalability concerns in large neuromorphic systems (DYNAPs; PAICORE; Ultra). This pressure is further amplified by high-fanout communication, where a single event may generate traffic toward many destinations and increase network load even when computation itself is sparse (Multicast Tree Router; HBS). The central interconnect challenge is therefore not simply to connect more processing elements, but to maintain NoC performance as both network scale and communication fanout increase.</w:t>
+        <w:t>Large-scale neuromorphic and event-driven processors increasingly depend on the scalability of their on-chip communication fabrics. IBM TrueNorth integrates 4,096 neurosynaptic cores on a single chip (TrueNorth), while the more recent PAICORE integrates 1,024 neuromorphic cores with an on-chip hierarchical interconnect (PAICORE). Intel’s Loihi 2 contains up to 128 fully asynchronous neuron cores connected by an on-chip network (Loihi 2 Technology Brief), and Hala Point further scales 1,152 Loihi 2 processors to 140,544 neuromorphic cores (Hala Point). Neural connectivity meanwhile requires sparse events to be delivered to both nearby and distant destinations with inherently high fanout. As system size grows, the network must therefore sustain more concurrent communication while meeting increasingly stringent latency, throughput, and energy constraints. Communication bandwidth, routing latency, and routing resources have consequently become important scalability concerns in large neuromorphic systems (DYNAPs; PAICORE; Ultra). This pressure is further amplified by high-fanout communication, where a single event may generate traffic toward many destinations and increase network load even when computation itself is sparse (Multicast Tree Router; HBS). The central interconnect challenge is therefore not simply to connect more processing elements, but to maintain NoC performance as both network scale and communication fanout increase.</w:t>
       </w:r>
     </w:p>
     <w:p>
@@ -570,7 +340,13 @@
         <w:rPr>
           <w:lang w:eastAsia="zh-CN"/>
         </w:rPr>
-        <w:t>Prior work has improved NoC performance by targeting different components of packet delivery. Following the standard latency decomposition used in interconnection-network analysis (Dally &amp; Towles; SMART), the communication latency can be expressed as</w:t>
+        <w:t>Prior work has improved NoC performance by targeting different components of packet delivery. Following the standard latency decomposition used in interconnection-</w:t>
+      </w:r>
+      <w:r>
+        <w:rPr>
+          <w:lang w:eastAsia="zh-CN"/>
+        </w:rPr>
+        <w:t>network analysis (Dally &amp; Towles; SMART), the communication latency can be expressed as</w:t>
       </w:r>
     </w:p>
     <w:p>
@@ -796,12 +572,6 @@
               </m:e>
             </m:mr>
           </m:m>
-          <m:r>
-            <w:rPr>
-              <w:lang w:eastAsia="zh-CN"/>
-            </w:rPr>
-            <w:br/>
-          </m:r>
         </m:oMath>
       </m:oMathPara>
     </w:p>
@@ -983,13 +753,7 @@
         <w:rPr>
           <w:lang w:eastAsia="zh-CN"/>
         </w:rPr>
-        <w:t xml:space="preserve">by shortening communication paths, while additional connectivity or bandwidth can also </w:t>
-      </w:r>
-      <w:r>
-        <w:rPr>
-          <w:lang w:eastAsia="zh-CN"/>
-        </w:rPr>
-        <w:t xml:space="preserve">relieve </w:t>
+        <w:t xml:space="preserve">by shortening communication paths, while additional connectivity or bandwidth can also relieve </w:t>
       </w:r>
       <m:oMath>
         <m:sSub>
@@ -1198,29 +962,29 @@
       <w:pPr>
         <w:pStyle w:val="a3"/>
         <w:rPr>
-          <w:lang w:eastAsia="zh-CN"/>
-        </w:rPr>
-      </w:pPr>
-      <w:r>
-        <w:rPr>
-          <w:lang w:eastAsia="zh-CN"/>
-        </w:rPr>
-        <w:t xml:space="preserve">However, network scale and communication fanout couple the terms in (1), making isolated optimization increasingly insufficient. As the network grows, communication over larger distances tends to increase </w:t>
+          <w:lang w:val="en-US" w:eastAsia="zh-CN"/>
+        </w:rPr>
+      </w:pPr>
+      <w:r>
+        <w:rPr>
+          <w:lang w:val="en-US" w:eastAsia="zh-CN"/>
+        </w:rPr>
+        <w:t xml:space="preserve">However, network scale and communication fanout couple the terms in (1), making isolated optimization increasingly insufficient. As the network grows, communication over longer distances tends to increase </w:t>
       </w:r>
       <m:oMath>
         <m:r>
           <w:rPr>
             <w:rFonts w:ascii="Cambria Math" w:hAnsi="Cambria Math"/>
-            <w:lang w:eastAsia="zh-CN"/>
+            <w:lang w:val="en-US" w:eastAsia="zh-CN"/>
           </w:rPr>
           <m:t>H</m:t>
         </m:r>
       </m:oMath>
       <w:r>
         <w:rPr>
-          <w:lang w:eastAsia="zh-CN"/>
-        </w:rPr>
-        <w:t xml:space="preserve">, exposing each packet to more routers and links. High-fanout communication further increases </w:t>
+          <w:lang w:val="en-US" w:eastAsia="zh-CN"/>
+        </w:rPr>
+        <w:t xml:space="preserve">, causing packets to accumulate more router and link traversal delay. High-fanout communication further increases </w:t>
       </w:r>
       <m:oMath>
         <m:sSub>
@@ -1228,7 +992,7 @@
             <m:ctrlPr>
               <w:rPr>
                 <w:rFonts w:ascii="Cambria Math" w:hAnsi="Cambria Math"/>
-                <w:lang w:eastAsia="zh-CN"/>
+                <w:lang w:val="en-US" w:eastAsia="zh-CN"/>
               </w:rPr>
             </m:ctrlPr>
           </m:sSubPr>
@@ -1236,7 +1000,7 @@
             <m:r>
               <w:rPr>
                 <w:rFonts w:ascii="Cambria Math" w:hAnsi="Cambria Math"/>
-                <w:lang w:eastAsia="zh-CN"/>
+                <w:lang w:val="en-US" w:eastAsia="zh-CN"/>
               </w:rPr>
               <m:t>T</m:t>
             </m:r>
@@ -1245,7 +1009,7 @@
             <m:r>
               <w:rPr>
                 <w:rFonts w:ascii="Cambria Math" w:hAnsi="Cambria Math"/>
-                <w:lang w:eastAsia="zh-CN"/>
+                <w:lang w:val="en-US" w:eastAsia="zh-CN"/>
               </w:rPr>
               <m:t>c</m:t>
             </m:r>
@@ -1254,158 +1018,77 @@
       </m:oMath>
       <w:r>
         <w:rPr>
-          <w:lang w:eastAsia="zh-CN"/>
-        </w:rPr>
-        <w:t xml:space="preserve">when implemented as repeated point-to-point transfers, since multiple copies compete for injection bandwidth and repeatedly occupy shared paths. Hierarchical organizations can reduce </w:t>
+          <w:lang w:val="en-US" w:eastAsia="zh-CN"/>
+        </w:rPr>
+        <w:t xml:space="preserve">when one-to-many transfers are realized through repeated point-to-point transmissions, since multiple copies compete for injection bandwidth and repeatedly occupy shared paths. Hierarchical organizations can reduce </w:t>
       </w:r>
       <m:oMath>
         <m:r>
           <w:rPr>
             <w:rFonts w:ascii="Cambria Math" w:hAnsi="Cambria Math"/>
-            <w:lang w:eastAsia="zh-CN"/>
+            <w:lang w:val="en-US" w:eastAsia="zh-CN"/>
           </w:rPr>
           <m:t>H</m:t>
         </m:r>
       </m:oMath>
       <w:r>
         <w:rPr>
-          <w:lang w:eastAsia="zh-CN"/>
-        </w:rPr>
-        <w:t xml:space="preserve">by keeping nearby communication local, but the resulting traffic convergence may instead increase </w:t>
-      </w:r>
-      <m:oMath>
-        <m:sSub>
-          <m:sSubPr>
-            <m:ctrlPr>
-              <w:rPr>
-                <w:rFonts w:ascii="Cambria Math" w:hAnsi="Cambria Math"/>
-                <w:lang w:eastAsia="zh-CN"/>
-              </w:rPr>
-            </m:ctrlPr>
-          </m:sSubPr>
-          <m:e>
-            <m:r>
-              <w:rPr>
-                <w:rFonts w:ascii="Cambria Math" w:hAnsi="Cambria Math"/>
-                <w:lang w:eastAsia="zh-CN"/>
-              </w:rPr>
-              <m:t>T</m:t>
-            </m:r>
-          </m:e>
-          <m:sub>
-            <m:r>
-              <w:rPr>
-                <w:rFonts w:ascii="Cambria Math" w:hAnsi="Cambria Math"/>
-                <w:lang w:eastAsia="zh-CN"/>
-              </w:rPr>
-              <m:t>c</m:t>
-            </m:r>
-          </m:sub>
-        </m:sSub>
-      </m:oMath>
-      <w:r>
-        <w:rPr>
-          <w:lang w:eastAsia="zh-CN"/>
-        </w:rPr>
-        <w:t xml:space="preserve">at upper-level aggregation points when their service capacity is insufficient. Increasing router or link capacity can reduce </w:t>
-      </w:r>
-      <m:oMath>
-        <m:sSub>
-          <m:sSubPr>
-            <m:ctrlPr>
-              <w:rPr>
-                <w:rFonts w:ascii="Cambria Math" w:hAnsi="Cambria Math"/>
-                <w:lang w:eastAsia="zh-CN"/>
-              </w:rPr>
-            </m:ctrlPr>
-          </m:sSubPr>
-          <m:e>
-            <m:r>
-              <w:rPr>
-                <w:rFonts w:ascii="Cambria Math" w:hAnsi="Cambria Math"/>
-                <w:lang w:eastAsia="zh-CN"/>
-              </w:rPr>
-              <m:t>t</m:t>
-            </m:r>
-          </m:e>
-          <m:sub>
-            <m:r>
-              <w:rPr>
-                <w:rFonts w:ascii="Cambria Math" w:hAnsi="Cambria Math"/>
-                <w:lang w:eastAsia="zh-CN"/>
-              </w:rPr>
-              <m:t>r</m:t>
-            </m:r>
-          </m:sub>
-        </m:sSub>
-      </m:oMath>
-      <w:r>
-        <w:rPr>
-          <w:lang w:eastAsia="zh-CN"/>
-        </w:rPr>
-        <w:t xml:space="preserve">, </w:t>
-      </w:r>
-      <m:oMath>
-        <m:sSub>
-          <m:sSubPr>
-            <m:ctrlPr>
-              <w:rPr>
-                <w:rFonts w:ascii="Cambria Math" w:hAnsi="Cambria Math"/>
-                <w:lang w:eastAsia="zh-CN"/>
-              </w:rPr>
-            </m:ctrlPr>
-          </m:sSubPr>
-          <m:e>
-            <m:r>
-              <w:rPr>
-                <w:rFonts w:ascii="Cambria Math" w:hAnsi="Cambria Math"/>
-                <w:lang w:eastAsia="zh-CN"/>
-              </w:rPr>
-              <m:t>T</m:t>
-            </m:r>
-          </m:e>
-          <m:sub>
-            <m:r>
-              <w:rPr>
-                <w:rFonts w:ascii="Cambria Math" w:hAnsi="Cambria Math"/>
-                <w:lang w:eastAsia="zh-CN"/>
-              </w:rPr>
-              <m:t>c</m:t>
-            </m:r>
-          </m:sub>
-        </m:sSub>
-      </m:oMath>
-      <w:r>
-        <w:rPr>
-          <w:lang w:eastAsia="zh-CN"/>
-        </w:rPr>
-        <w:t>, or serialization overhead, but incurs additional hardware cost and does not eliminate redundant traffic or unnecessarily long routes. Improving large-scale high-fanout NoC performance therefore requires coordinated optimization of topology, communication mechanisms, and router microarchitecture rather than minimizing any single term in isolation.</w:t>
+          <w:rFonts w:hint="eastAsia"/>
+          <w:lang w:val="en-US" w:eastAsia="zh-CN"/>
+        </w:rPr>
+        <w:t xml:space="preserve"> </w:t>
+      </w:r>
+      <w:r>
+        <w:rPr>
+          <w:lang w:val="en-US" w:eastAsia="zh-CN"/>
+        </w:rPr>
+        <w:t>by keeping nearby communication local, but traffic is often progressively concentrated toward fewer upper-level routers and links. When the available path diversity and service capacity are insufficient, this concentration increases contention and can cause early throughput saturation. Simply widening a small number of upper-level resources can allevi</w:t>
+      </w:r>
+      <w:r>
+        <w:rPr>
+          <w:lang w:val="en-US" w:eastAsia="zh-CN"/>
+        </w:rPr>
+        <w:lastRenderedPageBreak/>
+        <w:t>ate the bottleneck, but may introduce higher arbitration complexity and hardware cost. Improving large-scale high-fanout NoC performance therefore requires coordina</w:t>
+      </w:r>
+      <w:r>
+        <w:rPr>
+          <w:rFonts w:hint="eastAsia"/>
+          <w:lang w:val="en-US" w:eastAsia="zh-CN"/>
+        </w:rPr>
+        <w:t>ted</w:t>
+      </w:r>
+      <w:r>
+        <w:rPr>
+          <w:lang w:val="en-US" w:eastAsia="zh-CN"/>
+        </w:rPr>
+        <w:t xml:space="preserve"> optimization of path length, traffic replication, and service capacity across topology, routing, and router microarchitecture.</w:t>
       </w:r>
     </w:p>
     <w:p>
       <w:pPr>
         <w:pStyle w:val="a3"/>
         <w:rPr>
-          <w:lang w:eastAsia="zh-CN"/>
-        </w:rPr>
-      </w:pPr>
-      <w:r>
-        <w:rPr>
-          <w:lang w:eastAsia="zh-CN"/>
-        </w:rPr>
-        <w:t>Guided by this cross-layer view, we propose a fully asynchronous hierarchical NoC that jointly addresses the performance factors in (1). The main contributions of this work are summarized as follows:</w:t>
+          <w:lang w:val="en-US" w:eastAsia="zh-CN"/>
+        </w:rPr>
+      </w:pPr>
+      <w:r>
+        <w:rPr>
+          <w:lang w:val="en-US" w:eastAsia="zh-CN"/>
+        </w:rPr>
+        <w:t>Guided by this cross-layer view, we propose a fully asynchronous hierarchical NoC that jointly addresses path length, redundant traffic, and service bottlenecks under large-scale high-fanout communication. The main contributions of this work are summarized as follows:</w:t>
       </w:r>
     </w:p>
     <w:p>
       <w:pPr>
         <w:pStyle w:val="a3"/>
         <w:rPr>
-          <w:lang w:eastAsia="zh-CN"/>
-        </w:rPr>
-      </w:pPr>
-      <w:r>
-        <w:rPr>
-          <w:lang w:eastAsia="zh-CN"/>
+          <w:lang w:val="en-US" w:eastAsia="zh-CN"/>
+        </w:rPr>
+      </w:pPr>
+      <w:r>
+        <w:rPr>
+          <w:lang w:val="en-US" w:eastAsia="zh-CN"/>
         </w:rPr>
         <w:t xml:space="preserve">• </w:t>
       </w:r>
@@ -1413,34 +1096,27 @@
         <w:rPr>
           <w:b/>
           <w:bCs/>
-          <w:lang w:eastAsia="zh-CN"/>
-        </w:rPr>
-        <w:t>A hierarchical network organization for scale-out:</w:t>
-      </w:r>
-      <w:r>
-        <w:rPr>
-          <w:lang w:eastAsia="zh-CN"/>
-        </w:rPr>
-        <w:t xml:space="preserve"> PEs are organized into fixed-depth local trees connected by an upper on-chip mesh. Local communication remains within small tree clusters, while larger systems are formed by adding </w:t>
-      </w:r>
-      <w:r>
-        <w:rPr>
-          <w:lang w:eastAsia="zh-CN"/>
-        </w:rPr>
-        <w:lastRenderedPageBreak/>
-        <w:t>clusters to the mesh, limiting hop-count growth while reducing the amount of traffic exposed to the global network.</w:t>
+          <w:lang w:val="en-US" w:eastAsia="zh-CN"/>
+        </w:rPr>
+        <w:t>A parallel-path hierarchical network organization:</w:t>
+      </w:r>
+      <w:r>
+        <w:rPr>
+          <w:lang w:val="en-US" w:eastAsia="zh-CN"/>
+        </w:rPr>
+        <w:t xml:space="preserve"> The local hierarchy provides multiple alternative paths through replicated intermediate routers instead of progressively concentrating traffic into a small number of wide upper-level routers. At larger scales, hierarchical tiles are connected through multiple independent mesh planes. This organization preserves short local communication paths while distributing converging traffic over parallel network resources.</w:t>
       </w:r>
     </w:p>
     <w:p>
       <w:pPr>
         <w:pStyle w:val="a3"/>
         <w:rPr>
-          <w:lang w:eastAsia="zh-CN"/>
-        </w:rPr>
-      </w:pPr>
-      <w:r>
-        <w:rPr>
-          <w:lang w:eastAsia="zh-CN"/>
+          <w:lang w:val="en-US" w:eastAsia="zh-CN"/>
+        </w:rPr>
+      </w:pPr>
+      <w:r>
+        <w:rPr>
+          <w:lang w:val="en-US" w:eastAsia="zh-CN"/>
         </w:rPr>
         <w:t xml:space="preserve">• </w:t>
       </w:r>
@@ -1448,28 +1124,27 @@
         <w:rPr>
           <w:b/>
           <w:bCs/>
-          <w:lang w:eastAsia="zh-CN"/>
-        </w:rPr>
-        <w:t>Multicast routing across local trees and the upper mesh:</w:t>
-      </w:r>
-      <w:r>
-        <w:rPr>
-          <w:lang w:eastAsia="zh-CN"/>
-        </w:rPr>
-        <w:t xml:space="preserve"> A multicast transaction initiated by a single source injection remains multicast as it traverses both parts of the network. This avoids converting communication into separate point-to-point transmissions at the hierarchy boundary, reducing redundant traffic and its contribution to contention.</w:t>
+          <w:lang w:val="en-US" w:eastAsia="zh-CN"/>
+        </w:rPr>
+        <w:t>Multicast routing across the local hierarchy and upper mesh planes:</w:t>
+      </w:r>
+      <w:r>
+        <w:rPr>
+          <w:lang w:val="en-US" w:eastAsia="zh-CN"/>
+        </w:rPr>
+        <w:t xml:space="preserve"> A multicast transaction initiated by a single source injection remains multicast throughout the network. Routing replicates the transaction only where required as it traverses the local hierarchy and the upper mesh planes, avoiding conversion into separate point-to-point transmissions at the hierarchy boundary and reducing redundant network traffic.</w:t>
       </w:r>
     </w:p>
     <w:p>
       <w:pPr>
         <w:pStyle w:val="a3"/>
         <w:rPr>
-          <w:rFonts w:hint="eastAsia"/>
-          <w:lang w:eastAsia="zh-CN"/>
-        </w:rPr>
-      </w:pPr>
-      <w:r>
-        <w:rPr>
-          <w:lang w:eastAsia="zh-CN"/>
+          <w:lang w:val="en-US" w:eastAsia="zh-CN"/>
+        </w:rPr>
+      </w:pPr>
+      <w:r>
+        <w:rPr>
+          <w:lang w:val="en-US" w:eastAsia="zh-CN"/>
         </w:rPr>
         <w:t xml:space="preserve">• </w:t>
       </w:r>
@@ -1477,15 +1152,15 @@
         <w:rPr>
           <w:b/>
           <w:bCs/>
-          <w:lang w:eastAsia="zh-CN"/>
-        </w:rPr>
-        <w:t>Fully asynchronous control of multiple physical lanes:</w:t>
-      </w:r>
-      <w:r>
-        <w:rPr>
-          <w:lang w:eastAsia="zh-CN"/>
-        </w:rPr>
-        <w:t xml:space="preserve"> Selected parts of the hierarchy use multiple physical lanes to increase service capacity where traffic converges. Each multicast branch is assigned to an available lane until the packet completes, while the control logic preserves the request and acknowledgment state of the two-phase handshake, reducing local forwarding and contention delays without relying on local clocks.</w:t>
+          <w:lang w:val="en-US" w:eastAsia="zh-CN"/>
+        </w:rPr>
+        <w:t>Fully asynchronous dynamic multi-lane control:</w:t>
+      </w:r>
+      <w:r>
+        <w:rPr>
+          <w:lang w:val="en-US" w:eastAsia="zh-CN"/>
+        </w:rPr>
+        <w:t xml:space="preserve"> Routers dynamically select among available physical lanes and retain the selected lane for the lifetime of each packet branch. The control logic maintains the request and acknowledgment phase state required by two-phase communication during lane selection and arbitration, increasing local service capacity and reducing contention without relying on local clocks.</w:t>
       </w:r>
     </w:p>
     <w:p>
@@ -1543,21 +1218,13 @@
         <w:rPr>
           <w:lang w:val="en-US" w:eastAsia="zh-CN"/>
         </w:rPr>
-        <w:t xml:space="preserve">As the system grows, these characteristics place several simultaneous demands on the NoC. Longer-distance communication increases the routing work required to reach remote destinations, while high fanout increases the amount of traffic injected into and carried by the network. Traffic from multiple sources can also converge on shared routers and links, making local service capacity increasingly important. Accordingly, bandwidth, latency, and routing-resource requirements have been identified as major scalability concerns in large neuromorphic systems (DYNAPs), while multicast addressing and routing metadata also contribute to communication energy and storage overhead (HBS). The event-driven nature of these systems further makes asynchronous communication a natural implementation choice, since transfers can proceed through local handshakes without a global network clock (Asynchronous Design; Reusable DATE’26). Large-scale neuromorphic </w:t>
-      </w:r>
-      <w:proofErr w:type="spellStart"/>
+        <w:t xml:space="preserve">As the system grows, these characteristics place several simultaneous demands on the NoC. Longer-distance communication increases the routing work required to reach remote destinations, while high fanout increases the amount of traffic injected into and carried by the network. Traffic from multiple sources can also converge on shared routers and links, making local service capacity increasingly important. Accordingly, bandwidth, latency, and routing-resource requirements have </w:t>
+      </w:r>
       <w:r>
         <w:rPr>
           <w:lang w:val="en-US" w:eastAsia="zh-CN"/>
         </w:rPr>
-        <w:t>NoCs</w:t>
-      </w:r>
-      <w:proofErr w:type="spellEnd"/>
-      <w:r>
-        <w:rPr>
-          <w:lang w:val="en-US" w:eastAsia="zh-CN"/>
-        </w:rPr>
-        <w:t xml:space="preserve"> therefore face concurrent pressure from communication distance, traffic volume, and local service demand, which have motivated optimization at multiple levels of the network.</w:t>
+        <w:t>been identified as major scalability concerns in large neuromorphic systems (DYNAPs), while multicast addressing and routing metadata also contribute to communication energy and storage overhead (HBS). The event-driven nature of these systems further makes asynchronous communication a natural implementation choice, since transfers can proceed through local handshakes without a global network clock (Asynchronous Design; Reusable DATE’26). Large-scale neuromorphic NoCs therefore face concurrent pressure from communication distance, traffic volume, and local service demand, which have motivated optimization at multiple levels of the network.</w:t>
       </w:r>
       <w:r>
         <w:rPr>
@@ -1607,13 +1274,7 @@
         <w:rPr>
           <w:lang w:eastAsia="zh-CN"/>
         </w:rPr>
-        <w:t xml:space="preserve">Prior work has attacked the NoC performance problem at several abstraction levels. At the network level, topology determines how far packets travel and where traffic tends to accumulate. Routing then decides how the available paths are used, while multicast can reduce duplicated communication </w:t>
-      </w:r>
-      <w:r>
-        <w:rPr>
-          <w:lang w:eastAsia="zh-CN"/>
-        </w:rPr>
-        <w:t>for one-to-many traffic. At the router level, microarchitecture determines how quickly each hop can accept and forward packets. These optimizations address different sources of communication cost, but their effects become increasingly coupled as the network grows.</w:t>
+        <w:t>Prior work has attacked the NoC performance problem at several abstraction levels. At the network level, topology determines how far packets travel and where traffic tends to accumulate. Routing then decides how the available paths are used, while multicast can reduce duplicated communication for one-to-many traffic. At the router level, microarchitecture determines how quickly each hop can accept and forward packets. These optimizations address different sources of communication cost, but their effects become increasingly coupled as the network grows.</w:t>
       </w:r>
     </w:p>
     <w:p>
@@ -1682,21 +1343,14 @@
         <w:rPr>
           <w:lang w:eastAsia="zh-CN"/>
         </w:rPr>
-        <w:t xml:space="preserve"> Previous work has reduced forwarding latency through more efficient buffering, arbitration, bypassing, and parallel </w:t>
-      </w:r>
-      <w:proofErr w:type="spellStart"/>
-      <w:r>
-        <w:rPr>
-          <w:lang w:eastAsia="zh-CN"/>
-        </w:rPr>
-        <w:t>datapaths</w:t>
-      </w:r>
-      <w:proofErr w:type="spellEnd"/>
-      <w:r>
-        <w:rPr>
-          <w:lang w:eastAsia="zh-CN"/>
-        </w:rPr>
-        <w:t xml:space="preserve"> (SMART; STORM). Asynchronous routers approach the same problem from the implementation side: local handshakes remove the need for a network-wide clock, while two-phase signaling avoids the return-to-zero phase of conventional four-phase communication (Transition DATE'13; 14-nm Asynchronous Router; Reusable DATE'26). This can reduce per-hop latency and energy, but higher local parallelism also increases area, arbitration complexity, and control overhead. In particular, dynamically selecting among multiple physical resources is more involved in a two-phase design because the request and acknowledgment phases form part of the communication state.</w:t>
+        <w:t xml:space="preserve"> Previous work has reduced forwarding latency through more efficient buffering, arbitration, bypassing, and parallel datapaths (SMART; STORM). Asynchronous routers approach the same problem from the implementation side: local handshakes remove the need for a network-wide clock, while two-phase signaling avoids the return-to-zero phase of conventional four-phase communication (Transition DATE'13; 14-nm Asynchronous Router; Reusable DATE'26). This can reduce per-hop latency and energy, but higher local parallelism </w:t>
+      </w:r>
+      <w:r>
+        <w:rPr>
+          <w:lang w:eastAsia="zh-CN"/>
+        </w:rPr>
+        <w:lastRenderedPageBreak/>
+        <w:t>also increases area, arbitration complexity, and control overhead. In particular, dynamically selecting among multiple physical resources is more involved in a two-phase design because the request and acknowledgment phases form part of the communication state.</w:t>
       </w:r>
     </w:p>
     <w:p>
@@ -1704,6 +1358,7 @@
         <w:ind w:firstLine="14.40pt"/>
         <w:jc w:val="both"/>
         <w:rPr>
+          <w:rFonts w:hint="eastAsia"/>
           <w:lang w:eastAsia="zh-CN"/>
         </w:rPr>
       </w:pPr>
@@ -1712,6 +1367,21 @@
           <w:lang w:eastAsia="zh-CN"/>
         </w:rPr>
         <w:t>Taken together, these studies show that path length, network traffic, and router service capacity can each be improved independently. The difficulty at large scale is that optimizing one of them can expose another as the new bottleneck.</w:t>
+      </w:r>
+    </w:p>
+    <w:p>
+      <w:pPr>
+        <w:pStyle w:val="2"/>
+        <w:rPr>
+          <w:lang w:eastAsia="zh-CN"/>
+        </w:rPr>
+      </w:pPr>
+      <w:r>
+        <w:rPr>
+          <w:rFonts w:hint="eastAsia"/>
+          <w:lang w:eastAsia="zh-CN"/>
+        </w:rPr>
+        <w:t>Design Motivation</w:t>
       </w:r>
     </w:p>
     <w:p>
@@ -1719,145 +1389,115 @@
         <w:ind w:firstLine="14.40pt"/>
         <w:jc w:val="both"/>
         <w:rPr>
-          <w:lang w:eastAsia="zh-CN"/>
-        </w:rPr>
-      </w:pPr>
-    </w:p>
-    <w:p>
-      <w:pPr>
-        <w:ind w:firstLine="14.40pt"/>
-        <w:jc w:val="both"/>
-        <w:rPr>
           <w:rFonts w:hint="eastAsia"/>
           <w:lang w:eastAsia="zh-CN"/>
         </w:rPr>
       </w:pPr>
+      <w:r>
+        <w:rPr>
+          <w:lang w:eastAsia="zh-CN"/>
+        </w:rPr>
+        <w:t xml:space="preserve">These observations motivate three design objectives. First, </w:t>
+      </w:r>
+      <w:r>
+        <w:rPr>
+          <w:highlight w:val="yellow"/>
+          <w:lang w:eastAsia="zh-CN"/>
+        </w:rPr>
+        <w:t>multicast communication should span both local trees and an upper on-chip mesh without being replaced by separate unicast packets for individual clusters.</w:t>
+      </w:r>
+      <w:r>
+        <w:rPr>
+          <w:lang w:eastAsia="zh-CN"/>
+        </w:rPr>
+        <w:t xml:space="preserve"> The two parts of the network should operate on the same destination description while applying routing rules suited to their respective topologies. Second, </w:t>
+      </w:r>
+      <w:r>
+        <w:rPr>
+          <w:highlight w:val="yellow"/>
+          <w:lang w:eastAsia="zh-CN"/>
+        </w:rPr>
+        <w:t>multiple physical lanes should be controlled entirely asynchronously</w:t>
+      </w:r>
+      <w:r>
+        <w:rPr>
+          <w:lang w:eastAsia="zh-CN"/>
+        </w:rPr>
+        <w:t>: each multicast branch should remain assigned to one physical lane until the packet completes, while the correct two-phase handshake state is maintained during lane selection and arbitration. Third</w:t>
+      </w:r>
+      <w:r>
+        <w:rPr>
+          <w:highlight w:val="yellow"/>
+          <w:lang w:eastAsia="zh-CN"/>
+        </w:rPr>
+        <w:t>, system scale-out should be achieved by organizing PEs into local trees with a fixed number of levels and connecting these trees through an on-chip 2-D mesh</w:t>
+      </w:r>
+      <w:r>
+        <w:rPr>
+          <w:lang w:eastAsia="zh-CN"/>
+        </w:rPr>
+        <w:t>. A limited number of parallel physical lanes can provide additional bandwidth inside each tree without requiring the number of lanes to continue increasing toward the upper levels. Section III presents the architecture and routing mechanisms that realize these objectives.</w:t>
+      </w:r>
+    </w:p>
+    <w:p>
+      <w:pPr>
+        <w:pStyle w:val="1"/>
+      </w:pPr>
+      <w:r>
+        <w:t xml:space="preserve">Prepare Your Paper </w:t>
+      </w:r>
+      <w:r>
+        <w:t>Before</w:t>
+      </w:r>
+      <w:r>
+        <w:t xml:space="preserve"> Styling</w:t>
+      </w:r>
+    </w:p>
+    <w:p>
+      <w:pPr>
+        <w:pStyle w:val="a3"/>
+        <w:rPr>
+          <w:lang w:val="en-US"/>
+        </w:rPr>
+      </w:pPr>
+      <w:r>
+        <w:t>Before</w:t>
+      </w:r>
+      <w:r>
+        <w:t xml:space="preserve"> you begin to format your paper, first write and save the content as a separate text file. </w:t>
+      </w:r>
+      <w:r>
+        <w:rPr>
+          <w:lang w:val="en-US"/>
+        </w:rPr>
+        <w:t>Complete all content and organizational editing before formatting. Please note sections A-D below for more information on proofreading, spelling and grammar.</w:t>
+      </w:r>
+    </w:p>
+    <w:p>
+      <w:pPr>
+        <w:pStyle w:val="a3"/>
+      </w:pPr>
+      <w:r>
+        <w:t>Keep your text and graphic files separate until after the text has been formatted and styled. Do not use hard tabs, and limit use of hard returns to only one return at the end of a paragraph. Do not add any kind of pagination anywhere in the paper. Do not number text heads-the template will do that for you.</w:t>
+      </w:r>
     </w:p>
     <w:p>
       <w:pPr>
         <w:pStyle w:val="2"/>
-        <w:rPr>
-          <w:lang w:eastAsia="zh-CN"/>
-        </w:rPr>
-      </w:pPr>
-      <w:r>
-        <w:rPr>
-          <w:rFonts w:hint="eastAsia"/>
-          <w:lang w:eastAsia="zh-CN"/>
-        </w:rPr>
-        <w:t>Design Motivation</w:t>
-      </w:r>
-    </w:p>
-    <w:p>
-      <w:pPr>
-        <w:ind w:firstLine="14.40pt"/>
-        <w:jc w:val="both"/>
-        <w:rPr>
-          <w:lang w:eastAsia="zh-CN"/>
-        </w:rPr>
-      </w:pPr>
-      <w:r>
-        <w:rPr>
-          <w:lang w:eastAsia="zh-CN"/>
-        </w:rPr>
-        <w:t xml:space="preserve">These observations motivate three design objectives. First, </w:t>
-      </w:r>
-      <w:r>
-        <w:rPr>
-          <w:highlight w:val="yellow"/>
-          <w:lang w:eastAsia="zh-CN"/>
-        </w:rPr>
-        <w:t>multicast communication should span both local trees and an upper on-chip mesh without being replaced by separate unicast packets for individual clusters.</w:t>
-      </w:r>
-      <w:r>
-        <w:rPr>
-          <w:lang w:eastAsia="zh-CN"/>
-        </w:rPr>
-        <w:t xml:space="preserve"> The two parts of the </w:t>
-      </w:r>
-      <w:r>
-        <w:rPr>
-          <w:lang w:eastAsia="zh-CN"/>
-        </w:rPr>
-        <w:lastRenderedPageBreak/>
-        <w:t xml:space="preserve">network should operate on the same destination description while applying routing rules suited to their respective topologies. Second, </w:t>
-      </w:r>
-      <w:r>
-        <w:rPr>
-          <w:highlight w:val="yellow"/>
-          <w:lang w:eastAsia="zh-CN"/>
-        </w:rPr>
-        <w:t>multiple physical lanes should be controlled entirely asynchronously</w:t>
-      </w:r>
-      <w:r>
-        <w:rPr>
-          <w:lang w:eastAsia="zh-CN"/>
-        </w:rPr>
-        <w:t>: each multicast branch should remain assigned to one physical lane until the packet completes, while the correct two-phase handshake state is maintained during lane selection and arbitration. Third</w:t>
-      </w:r>
-      <w:r>
-        <w:rPr>
-          <w:highlight w:val="yellow"/>
-          <w:lang w:eastAsia="zh-CN"/>
-        </w:rPr>
-        <w:t>, system scale-out should be achieved by organizing PEs into local trees with a fixed number of levels and connecting these trees through an on-chip 2-D mesh</w:t>
-      </w:r>
-      <w:r>
-        <w:rPr>
-          <w:lang w:eastAsia="zh-CN"/>
-        </w:rPr>
-        <w:t>. A limited number of parallel physical lanes can provide additional bandwidth inside each tree without requiring the number of lanes to continue increasing toward the upper levels. Section III presents the architecture and routing mechanisms that realize these objectives.</w:t>
-      </w:r>
-    </w:p>
-    <w:p>
-      <w:pPr>
-        <w:ind w:firstLine="14.40pt"/>
-        <w:jc w:val="both"/>
-        <w:rPr>
-          <w:lang w:eastAsia="zh-CN"/>
-        </w:rPr>
-      </w:pPr>
-    </w:p>
-    <w:p>
-      <w:pPr>
-        <w:pStyle w:val="1"/>
-      </w:pPr>
-      <w:r>
-        <w:t xml:space="preserve">Prepare Your Paper </w:t>
-      </w:r>
-      <w:r>
-        <w:t>Before</w:t>
-      </w:r>
-      <w:r>
-        <w:t xml:space="preserve"> Styling</w:t>
+      </w:pPr>
+      <w:r>
+        <w:t>Abbreviations</w:t>
+      </w:r>
+      <w:r>
+        <w:t xml:space="preserve"> and Acronyms</w:t>
       </w:r>
     </w:p>
     <w:p>
       <w:pPr>
         <w:pStyle w:val="a3"/>
-        <w:rPr>
-          <w:lang w:val="en-US"/>
-        </w:rPr>
-      </w:pPr>
-      <w:r>
-        <w:t>Before</w:t>
-      </w:r>
-      <w:r>
-        <w:t xml:space="preserve"> you begin to format your paper, first write and save the content as a separate text file. </w:t>
-      </w:r>
-      <w:r>
-        <w:rPr>
-          <w:lang w:val="en-US"/>
-        </w:rPr>
-        <w:t>Complete all content and organizational editing before formatting. Please note sections A-D below for more information on proofreading, spelling and grammar.</w:t>
-      </w:r>
-    </w:p>
-    <w:p>
-      <w:pPr>
-        <w:pStyle w:val="a3"/>
-      </w:pPr>
-      <w:r>
-        <w:t>Keep your text and graphic files separate until after the text has been formatted and styled. Do not use hard tabs, and limit use of hard returns to only one return at the end of a paragraph. Do not add any kind of pagination anywhere in the paper. Do not number text heads-the template will do that for you.</w:t>
+      </w:pPr>
+      <w:r>
+        <w:t>Define abbreviations and acronyms the first time they are used in the text, even after they have been defined in the abstract. Abbreviations such as IEEE, SI, MKS, CGS, sc, dc, and rms do not have to be defined. Do not use abbreviations in the title or heads unless they are unavoidable.</w:t>
       </w:r>
     </w:p>
     <w:p>
@@ -1865,33 +1505,6 @@
         <w:pStyle w:val="2"/>
       </w:pPr>
       <w:r>
-        <w:t>Abbreviations</w:t>
-      </w:r>
-      <w:r>
-        <w:t xml:space="preserve"> and Acronyms</w:t>
-      </w:r>
-    </w:p>
-    <w:p>
-      <w:pPr>
-        <w:pStyle w:val="a3"/>
-      </w:pPr>
-      <w:r>
-        <w:t xml:space="preserve">Define abbreviations and acronyms the first time they are used in the text, even after they have been defined in the abstract. Abbreviations such as IEEE, SI, MKS, CGS, </w:t>
-      </w:r>
-      <w:proofErr w:type="spellStart"/>
-      <w:r>
-        <w:t>sc</w:t>
-      </w:r>
-      <w:proofErr w:type="spellEnd"/>
-      <w:r>
-        <w:t>, dc, and rms do not have to be defined. Do not use abbreviations in the title or heads unless they are unavoidable.</w:t>
-      </w:r>
-    </w:p>
-    <w:p>
-      <w:pPr>
-        <w:pStyle w:val="2"/>
-      </w:pPr>
-      <w:r>
         <w:t>Units</w:t>
       </w:r>
     </w:p>
@@ -1914,15 +1527,10 @@
         <w:pStyle w:val="bulletlist"/>
       </w:pPr>
       <w:r>
-        <w:t xml:space="preserve">Avoid combining SI and CGS units, such as current in amperes and magnetic field in </w:t>
-      </w:r>
-      <w:proofErr w:type="spellStart"/>
-      <w:r>
-        <w:t>oersteds</w:t>
-      </w:r>
-      <w:proofErr w:type="spellEnd"/>
-      <w:r>
-        <w:t>. This often leads to confusion because equations do not balance dimensionally. If you must use mixed units, clearly state the units for each quantity that you use in an equation.</w:t>
+        <w:t xml:space="preserve">Avoid combining SI and CGS units, such as current in amperes and magnetic field in oersteds. This often leads to confusion because equations do not balance dimensionally. If you must use mixed units, clearly </w:t>
+      </w:r>
+      <w:r>
+        <w:t>state the units for each quantity that you use in an equation.</w:t>
       </w:r>
     </w:p>
     <w:p>
@@ -1930,15 +1538,7 @@
         <w:pStyle w:val="bulletlist"/>
       </w:pPr>
       <w:r>
-        <w:t xml:space="preserve">Do not mix complete spellings and abbreviations of units: “Wb/m2” or “webers per square meter”, not “webers/m2”.  Spell out units when they appear in text: “. . . a few </w:t>
-      </w:r>
-      <w:proofErr w:type="spellStart"/>
-      <w:r>
-        <w:t>henries</w:t>
-      </w:r>
-      <w:proofErr w:type="spellEnd"/>
-      <w:r>
-        <w:t>”, not “. . . a few H”.</w:t>
+        <w:t>Do not mix complete spellings and abbreviations of units: “Wb/m2” or “webers per square meter”, not “webers/m2”.  Spell out units when they appear in text: “. . . a few henries”, not “. . . a few H”.</w:t>
       </w:r>
     </w:p>
     <w:p>
@@ -2006,10 +1606,7 @@
         <w:pStyle w:val="a3"/>
       </w:pPr>
       <w:r>
-        <w:t xml:space="preserve">The equations are an exception to the prescribed specifications of this template. You will need to determine whether or not your equation should be typed using either the Times New Roman or the Symbol font (please no other font). To create multileveled equations, it may be necessary to treat </w:t>
-      </w:r>
-      <w:r>
-        <w:t>the equation as a graphic and insert it into the text after your paper is styled.</w:t>
+        <w:t>The equations are an exception to the prescribed specifications of this template. You will need to determine whether or not your equation should be typed using either the Times New Roman or the Symbol font (please no other font). To create multileveled equations, it may be necessary to treat the equation as a graphic and insert it into the text after your paper is styled.</w:t>
       </w:r>
     </w:p>
     <w:p>
@@ -2183,6 +1780,7 @@
         <w:pStyle w:val="bulletlist"/>
       </w:pPr>
       <w:r>
+        <w:lastRenderedPageBreak/>
         <w:t>Be aware of the different meanings of the homophones “affect” and “effect”, “complement” and “compliment”, “discreet” and “discrete”, “principal” and “principle”.</w:t>
       </w:r>
     </w:p>
@@ -2231,7 +1829,6 @@
         <w:pStyle w:val="1"/>
       </w:pPr>
       <w:r>
-        <w:lastRenderedPageBreak/>
         <w:t xml:space="preserve">Using the </w:t>
       </w:r>
       <w:r>
@@ -2521,13 +2118,7 @@
         <w:rPr>
           <w:i w:val="0"/>
         </w:rPr>
-        <w:t xml:space="preserve">Place figures and tables at the top and bottom of columns. Avoid placing them in the middle of columns. Large figures and tables may span across both columns. Figure captions should be below the figures; table heads should appear above the tables. Insert </w:t>
-      </w:r>
-      <w:r>
-        <w:rPr>
-          <w:i w:val="0"/>
-        </w:rPr>
-        <w:t>figures and tables after they are cited in the text. Use the abbreviation “Fig. 1”, even at the beginning of a sentence.</w:t>
+        <w:t>Place figures and tables at the top and bottom of columns. Avoid placing them in the middle of columns. Large figures and tables may span across both columns. Figure captions should be below the figures; table heads should appear above the tables. Insert figures and tables after they are cited in the text. Use the abbreviation “Fig. 1”, even at the beginning of a sentence.</w:t>
       </w:r>
     </w:p>
     <w:p>
@@ -2862,7 +2453,6 @@
       <w:r>
         <w:t>”. Avoid the stilted expression “</w:t>
       </w:r>
-      <w:proofErr w:type="spellStart"/>
       <w:r>
         <w:rPr>
           <w:lang w:val="en-US"/>
@@ -2870,11 +2460,7 @@
         <w:t>o</w:t>
       </w:r>
       <w:r>
-        <w:t>ne</w:t>
-      </w:r>
-      <w:proofErr w:type="spellEnd"/>
-      <w:r>
-        <w:t xml:space="preserve"> of us (R. B. G.) thanks </w:t>
+        <w:t xml:space="preserve">ne of us (R. B. G.) thanks </w:t>
       </w:r>
       <w:r>
         <w:t>...</w:t>
@@ -2980,6 +2566,7 @@
         <w:pStyle w:val="a3"/>
       </w:pPr>
       <w:r>
+        <w:lastRenderedPageBreak/>
         <w:t xml:space="preserve">For </w:t>
       </w:r>
       <w:r>
@@ -3049,7 +2636,6 @@
         <w:pStyle w:val="references"/>
       </w:pPr>
       <w:r>
-        <w:lastRenderedPageBreak/>
         <w:t xml:space="preserve"> M. Davies </w:t>
       </w:r>
       <w:r>
@@ -5370,6 +4956,7 @@
   <w:style w:type="character" w:default="1" w:styleId="a0">
     <w:name w:val="Default Paragraph Font"/>
     <w:uiPriority w:val="1"/>
+    <w:semiHidden/>
     <w:unhideWhenUsed/>
   </w:style>
   <w:style w:type="table" w:default="1" w:styleId="a1">

</xml_diff>

<commit_message>
Archive latest 256-node evidence and DATE paper draft
</commit_message>
<xml_diff>
--- a/DATE paper/paper/A Scalable Asynchronous Hierachical NoC for High-Performance Multicst.docx
+++ b/DATE paper/paper/A Scalable Asynchronous Hierachical NoC for High-Performance Multicst.docx
@@ -1042,27 +1042,27 @@
         <w:rPr>
           <w:lang w:val="en-US" w:eastAsia="zh-CN"/>
         </w:rPr>
-        <w:t>by keeping nearby communication local, but traffic is often progressively concentrated toward fewer upper-level routers and links. When the available path diversity and service capacity are insufficient, this concentration increases contention and can cause early throughput saturation. Simply widening a small number of upper-level resources can allevi</w:t>
+        <w:t>by keeping nearby communication local, but traffic is often progressively concentrated toward fewer upper-level routers and links. When the available path diversity and service capacity are insufficient, this concentration increases contention and can cause early throughput saturation. Simply widening a small number of upper-level resources may allevi</w:t>
       </w:r>
       <w:r>
         <w:rPr>
           <w:lang w:val="en-US" w:eastAsia="zh-CN"/>
         </w:rPr>
         <w:lastRenderedPageBreak/>
-        <w:t>ate the bottleneck, but may introduce higher arbitration complexity and hardware cost. Improving large-scale high-fanout NoC performance therefore requires coordina</w:t>
+        <w:t xml:space="preserve">ate part of the bottleneck, but also increases arbitration complexity and hardware cost. A scalable design therefore needs sufficient parallel connectivity </w:t>
       </w:r>
       <w:r>
         <w:rPr>
           <w:rFonts w:hint="eastAsia"/>
           <w:lang w:val="en-US" w:eastAsia="zh-CN"/>
         </w:rPr>
-        <w:t>ted</w:t>
+        <w:t xml:space="preserve">across </w:t>
       </w:r>
       <w:r>
         <w:rPr>
           <w:lang w:val="en-US" w:eastAsia="zh-CN"/>
         </w:rPr>
-        <w:t xml:space="preserve"> optimization of path length, traffic replication, and service capacity across topology, routing, and router microarchitecture.</w:t>
+        <w:t>the hierarchy, efficient multicast to avoid redundant traffic, and control mechanisms that can safely coordinate these physical paths.</w:t>
       </w:r>
     </w:p>
     <w:p>
@@ -1076,7 +1076,7 @@
         <w:rPr>
           <w:lang w:val="en-US" w:eastAsia="zh-CN"/>
         </w:rPr>
-        <w:t>Guided by this cross-layer view, we propose a fully asynchronous hierarchical NoC that jointly addresses path length, redundant traffic, and service bottlenecks under large-scale high-fanout communication. The main contributions of this work are summarized as follows:</w:t>
+        <w:t>Guided by this cross-layer view, we propose a fully asynchronous parallel-path hierarchical NoC for high-fanout communication. The main contributions of this work are summarized as follows:</w:t>
       </w:r>
     </w:p>
     <w:p>
@@ -1098,13 +1098,13 @@
           <w:bCs/>
           <w:lang w:val="en-US" w:eastAsia="zh-CN"/>
         </w:rPr>
-        <w:t>A parallel-path hierarchical network organization:</w:t>
+        <w:t>A multi-lane parallel-path hierarchical fabric:</w:t>
       </w:r>
       <w:r>
         <w:rPr>
           <w:lang w:val="en-US" w:eastAsia="zh-CN"/>
         </w:rPr>
-        <w:t xml:space="preserve"> The local hierarchy provides multiple alternative paths through replicated intermediate routers instead of progressively concentrating traffic into a small number of wide upper-level routers. At larger scales, hierarchical tiles are connected through multiple independent mesh planes. This organization preserves short local communication paths while distributing converging traffic over parallel network resources.</w:t>
+        <w:t xml:space="preserve"> Multiple physical lanes are provided along each hierarchical direction and connected to replicated intermediate routers, forming several alternative paths between stages rather than progressively merging traffic into a small number of wide routers. At larger scales, hierarchical tiles are connected through multiple independent mesh planes. This structure preserves short local paths while distributing converging traffic over parallel network resources.</w:t>
       </w:r>
     </w:p>
     <w:p>
@@ -1126,19 +1126,20 @@
           <w:bCs/>
           <w:lang w:val="en-US" w:eastAsia="zh-CN"/>
         </w:rPr>
-        <w:t>Multicast routing across the local hierarchy and upper mesh planes:</w:t>
+        <w:t>Native multicast across the local hierarchy and upper mesh planes:</w:t>
       </w:r>
       <w:r>
         <w:rPr>
           <w:lang w:val="en-US" w:eastAsia="zh-CN"/>
         </w:rPr>
-        <w:t xml:space="preserve"> A multicast transaction initiated by a single source injection remains multicast throughout the network. Routing replicates the transaction only where required as it traverses the local hierarchy and the upper mesh planes, avoiding conversion into separate point-to-point transmissions at the hierarchy boundary and reducing redundant network traffic.</w:t>
+        <w:t xml:space="preserve"> A multicast transaction initiated by a single source injection remains multicast throughout the network. Replication occurs only where required by the routing decision, allowing common path segments to be shared across destinations and avoiding source-side expansion into multiple point-to-point packets.</w:t>
       </w:r>
     </w:p>
     <w:p>
       <w:pPr>
         <w:pStyle w:val="a3"/>
         <w:rPr>
+          <w:rFonts w:hint="eastAsia"/>
           <w:lang w:val="en-US" w:eastAsia="zh-CN"/>
         </w:rPr>
       </w:pPr>
@@ -1154,13 +1155,13 @@
           <w:bCs/>
           <w:lang w:val="en-US" w:eastAsia="zh-CN"/>
         </w:rPr>
-        <w:t>Fully asynchronous dynamic multi-lane control:</w:t>
+        <w:t>Phase-safe asynchronous control for parallel paths:</w:t>
       </w:r>
       <w:r>
         <w:rPr>
           <w:lang w:val="en-US" w:eastAsia="zh-CN"/>
         </w:rPr>
-        <w:t xml:space="preserve"> Routers dynamically select among available physical lanes and retain the selected lane for the lifetime of each packet branch. The control logic maintains the request and acknowledgment phase state required by two-phase communication during lane selection and arbitration, increasing local service capacity and reducing contention without relying on local clocks.</w:t>
+        <w:t xml:space="preserve"> The router supports packet-lifetime binding of a multicast branch to one physical path while preserving the request and acknowledgment phase state of the two-phase protocol. This control allows multiple physical paths to be used without introducing local clocks or violating handshake correctness during path selection and arbitration.</w:t>
       </w:r>
     </w:p>
     <w:p>
@@ -1218,13 +1219,13 @@
         <w:rPr>
           <w:lang w:val="en-US" w:eastAsia="zh-CN"/>
         </w:rPr>
-        <w:t xml:space="preserve">As the system grows, these characteristics place several simultaneous demands on the NoC. Longer-distance communication increases the routing work required to reach remote destinations, while high fanout increases the amount of traffic injected into and carried by the network. Traffic from multiple sources can also converge on shared routers and links, making local service capacity increasingly important. Accordingly, bandwidth, latency, and routing-resource requirements have </w:t>
+        <w:t xml:space="preserve">As the system grows, these characteristics place several simultaneous demands on the NoC. Longer-distance communication increases the routing work required to reach remote destinations, while high fanout increases the amount of traffic injected into and carried by the network. Traffic from multiple sources can also converge on shared routers and links, making local service capacity increasingly important. Accordingly, bandwidth, latency, and routing-resource requirements have been identified as major scalability concerns in large neuromorphic systems (DYNAPs), while multicast addressing and </w:t>
       </w:r>
       <w:r>
         <w:rPr>
           <w:lang w:val="en-US" w:eastAsia="zh-CN"/>
         </w:rPr>
-        <w:t>been identified as major scalability concerns in large neuromorphic systems (DYNAPs), while multicast addressing and routing metadata also contribute to communication energy and storage overhead (HBS). The event-driven nature of these systems further makes asynchronous communication a natural implementation choice, since transfers can proceed through local handshakes without a global network clock (Asynchronous Design; Reusable DATE’26). Large-scale neuromorphic NoCs therefore face concurrent pressure from communication distance, traffic volume, and local service demand, which have motivated optimization at multiple levels of the network.</w:t>
+        <w:t>routing metadata also contribute to communication energy and storage overhead (HBS). The event-driven nature of these systems further makes asynchronous communication a natural implementation choice, since transfers can proceed through local handshakes without a global network clock (Asynchronous Design; Reusable DATE’26). Large-scale neuromorphic NoCs therefore face concurrent pressure from communication distance, traffic volume, and local service demand, which have motivated optimization at multiple levels of the network.</w:t>
       </w:r>
       <w:r>
         <w:rPr>
@@ -1330,6 +1331,13 @@
         <w:rPr>
           <w:lang w:eastAsia="zh-CN"/>
         </w:rPr>
+        <w:sectPr>
+          <w:type w:val="continuous"/>
+          <w:pgSz w:w="595.30pt" w:h="841.90pt" w:code="9"/>
+          <w:pgMar w:top="54pt" w:right="45.35pt" w:bottom="72pt" w:left="45.35pt" w:header="36pt" w:footer="36pt" w:gutter="0pt"/>
+          <w:cols w:num="2" w:space="18pt"/>
+          <w:docGrid w:linePitch="360"/>
+        </w:sectPr>
       </w:pPr>
       <w:r>
         <w:rPr>
@@ -1349,7 +1357,244 @@
         <w:rPr>
           <w:lang w:eastAsia="zh-CN"/>
         </w:rPr>
-        <w:lastRenderedPageBreak/>
+        <w:br w:type="column"/>
+      </w:r>
+    </w:p>
+    <w:p>
+      <w:pPr>
+        <w:jc w:val="both"/>
+        <w:rPr>
+          <w:rFonts w:hint="eastAsia"/>
+          <w:noProof/>
+          <w:lang w:eastAsia="zh-CN"/>
+        </w:rPr>
+      </w:pPr>
+      <w:r>
+        <w:rPr>
+          <w:noProof/>
+        </w:rPr>
+        <w:drawing>
+          <wp:inline distT="0" distB="0" distL="0" distR="0" wp14:anchorId="46D16F52" wp14:editId="4F20D9A6">
+            <wp:extent cx="6408420" cy="2409190"/>
+            <wp:effectExtent l="0" t="0" r="0" b="0"/>
+            <wp:docPr id="374634192" name="图形 1"/>
+            <wp:cNvGraphicFramePr>
+              <a:graphicFrameLocks xmlns:a="http://purl.oclc.org/ooxml/drawingml/main" noChangeAspect="1"/>
+            </wp:cNvGraphicFramePr>
+            <a:graphic xmlns:a="http://purl.oclc.org/ooxml/drawingml/main">
+              <a:graphicData uri="http://purl.oclc.org/ooxml/drawingml/picture">
+                <pic:pic xmlns:pic="http://purl.oclc.org/ooxml/drawingml/picture">
+                  <pic:nvPicPr>
+                    <pic:cNvPr id="374634192" name=""/>
+                    <pic:cNvPicPr/>
+                  </pic:nvPicPr>
+                  <pic:blipFill>
+                    <a:blip r:embed="rId9">
+                      <a:extLst>
+                        <a:ext uri="{96DAC541-7B7A-43D3-8B79-37D633B846F1}">
+                          <asvg:svgBlip xmlns:asvg="http://schemas.microsoft.com/office/drawing/2016/SVG/main" r:embed="rId10"/>
+                        </a:ext>
+                      </a:extLst>
+                    </a:blip>
+                    <a:stretch>
+                      <a:fillRect/>
+                    </a:stretch>
+                  </pic:blipFill>
+                  <pic:spPr>
+                    <a:xfrm>
+                      <a:off x="0" y="0"/>
+                      <a:ext cx="6408420" cy="2409190"/>
+                    </a:xfrm>
+                    <a:prstGeom prst="rect">
+                      <a:avLst/>
+                    </a:prstGeom>
+                  </pic:spPr>
+                </pic:pic>
+              </a:graphicData>
+            </a:graphic>
+          </wp:inline>
+        </w:drawing>
+      </w:r>
+    </w:p>
+    <w:p>
+      <w:pPr>
+        <w:pStyle w:val="af0"/>
+        <w:jc w:val="start"/>
+        <w:rPr>
+          <w:rFonts w:ascii="Times New Roman" w:hAnsi="Times New Roman" w:cs="Times New Roman" w:hint="eastAsia"/>
+          <w:sz w:val="16"/>
+          <w:szCs w:val="16"/>
+          <w:lang w:eastAsia="zh-CN"/>
+        </w:rPr>
+        <w:sectPr>
+          <w:type w:val="continuous"/>
+          <w:pgSz w:w="595.30pt" w:h="841.90pt" w:code="9"/>
+          <w:pgMar w:top="54pt" w:right="45.35pt" w:bottom="72pt" w:left="45.35pt" w:header="36pt" w:footer="36pt" w:gutter="0pt"/>
+          <w:cols w:space="18pt"/>
+          <w:docGrid w:linePitch="360"/>
+        </w:sectPr>
+      </w:pPr>
+      <w:r>
+        <w:rPr>
+          <w:rFonts w:ascii="Times New Roman" w:hAnsi="Times New Roman" w:cs="Times New Roman"/>
+          <w:sz w:val="16"/>
+          <w:szCs w:val="16"/>
+        </w:rPr>
+        <w:t xml:space="preserve">Fig. </w:t>
+      </w:r>
+      <w:r>
+        <w:rPr>
+          <w:rFonts w:ascii="Times New Roman" w:hAnsi="Times New Roman" w:cs="Times New Roman"/>
+          <w:sz w:val="16"/>
+          <w:szCs w:val="16"/>
+        </w:rPr>
+        <w:fldChar w:fldCharType="begin"/>
+      </w:r>
+      <w:r>
+        <w:rPr>
+          <w:rFonts w:ascii="Times New Roman" w:hAnsi="Times New Roman" w:cs="Times New Roman"/>
+          <w:sz w:val="16"/>
+          <w:szCs w:val="16"/>
+        </w:rPr>
+        <w:instrText xml:space="preserve"> SEQ Fig. \* ARABIC </w:instrText>
+      </w:r>
+      <w:r>
+        <w:rPr>
+          <w:rFonts w:ascii="Times New Roman" w:hAnsi="Times New Roman" w:cs="Times New Roman"/>
+          <w:sz w:val="16"/>
+          <w:szCs w:val="16"/>
+        </w:rPr>
+        <w:fldChar w:fldCharType="separate"/>
+      </w:r>
+      <w:r>
+        <w:rPr>
+          <w:rFonts w:ascii="Times New Roman" w:hAnsi="Times New Roman" w:cs="Times New Roman"/>
+          <w:noProof/>
+          <w:sz w:val="16"/>
+          <w:szCs w:val="16"/>
+        </w:rPr>
+        <w:t>1</w:t>
+      </w:r>
+      <w:r>
+        <w:rPr>
+          <w:rFonts w:ascii="Times New Roman" w:hAnsi="Times New Roman" w:cs="Times New Roman"/>
+          <w:sz w:val="16"/>
+          <w:szCs w:val="16"/>
+        </w:rPr>
+        <w:fldChar w:fldCharType="end"/>
+      </w:r>
+      <w:r>
+        <w:rPr>
+          <w:rFonts w:ascii="Times New Roman" w:hAnsi="Times New Roman" w:cs="Times New Roman" w:hint="eastAsia"/>
+          <w:sz w:val="16"/>
+          <w:szCs w:val="16"/>
+          <w:lang w:eastAsia="zh-CN"/>
+        </w:rPr>
+        <w:t xml:space="preserve">. </w:t>
+      </w:r>
+      <w:r>
+        <w:rPr>
+          <w:rFonts w:ascii="Times New Roman" w:hAnsi="Times New Roman" w:cs="Times New Roman"/>
+          <w:b/>
+          <w:bCs/>
+          <w:sz w:val="16"/>
+          <w:szCs w:val="16"/>
+          <w:lang w:eastAsia="zh-CN"/>
+        </w:rPr>
+        <w:t>Proposed parallel-path hierarchical NoC topology.</w:t>
+      </w:r>
+      <w:r>
+        <w:rPr>
+          <w:rFonts w:ascii="Times New Roman" w:hAnsi="Times New Roman" w:cs="Times New Roman" w:hint="eastAsia"/>
+          <w:sz w:val="16"/>
+          <w:szCs w:val="16"/>
+          <w:lang w:eastAsia="zh-CN"/>
+        </w:rPr>
+        <w:t xml:space="preserve"> </w:t>
+      </w:r>
+      <w:r>
+        <w:rPr>
+          <w:rFonts w:ascii="Times New Roman" w:hAnsi="Times New Roman" w:cs="Times New Roman"/>
+          <w:sz w:val="16"/>
+          <w:szCs w:val="16"/>
+          <w:lang w:eastAsia="zh-CN"/>
+        </w:rPr>
+        <w:t>(a) Overall organization of the 64-PE local hierarchy and upper mesh layer.</w:t>
+      </w:r>
+      <w:r>
+        <w:rPr>
+          <w:rFonts w:ascii="Times New Roman" w:hAnsi="Times New Roman" w:cs="Times New Roman" w:hint="eastAsia"/>
+          <w:sz w:val="16"/>
+          <w:szCs w:val="16"/>
+          <w:lang w:eastAsia="zh-CN"/>
+        </w:rPr>
+        <w:t xml:space="preserve"> </w:t>
+      </w:r>
+      <w:r>
+        <w:rPr>
+          <w:rFonts w:ascii="Times New Roman" w:hAnsi="Times New Roman" w:cs="Times New Roman"/>
+          <w:sz w:val="16"/>
+          <w:szCs w:val="16"/>
+          <w:lang w:eastAsia="zh-CN"/>
+        </w:rPr>
+        <w:t>(b) Parallel connectivity between adjacent hierarchical stages.</w:t>
+      </w:r>
+      <w:r>
+        <w:rPr>
+          <w:rFonts w:ascii="Times New Roman" w:hAnsi="Times New Roman" w:cs="Times New Roman" w:hint="eastAsia"/>
+          <w:sz w:val="16"/>
+          <w:szCs w:val="16"/>
+          <w:lang w:eastAsia="zh-CN"/>
+        </w:rPr>
+        <w:t xml:space="preserve"> </w:t>
+      </w:r>
+      <w:r>
+        <w:rPr>
+          <w:rFonts w:ascii="Times New Roman" w:hAnsi="Times New Roman" w:cs="Times New Roman"/>
+          <w:sz w:val="16"/>
+          <w:szCs w:val="16"/>
+          <w:lang w:eastAsia="zh-CN"/>
+        </w:rPr>
+        <w:t>(c) Planar view of the local interconnect.</w:t>
+      </w:r>
+      <w:r>
+        <w:rPr>
+          <w:rFonts w:ascii="Times New Roman" w:hAnsi="Times New Roman" w:cs="Times New Roman" w:hint="eastAsia"/>
+          <w:sz w:val="16"/>
+          <w:szCs w:val="16"/>
+          <w:lang w:eastAsia="zh-CN"/>
+        </w:rPr>
+        <w:t xml:space="preserve"> </w:t>
+      </w:r>
+      <w:r>
+        <w:rPr>
+          <w:rFonts w:ascii="Times New Roman" w:hAnsi="Times New Roman" w:cs="Times New Roman"/>
+          <w:sz w:val="16"/>
+          <w:szCs w:val="16"/>
+          <w:lang w:eastAsia="zh-CN"/>
+        </w:rPr>
+        <w:t>(d) Representative L3-to-mesh attachment through parallel lanes.</w:t>
+      </w:r>
+    </w:p>
+    <w:p>
+      <w:pPr>
+        <w:jc w:val="both"/>
+        <w:rPr>
+          <w:lang w:eastAsia="zh-CN"/>
+        </w:rPr>
+      </w:pPr>
+    </w:p>
+    <w:p>
+      <w:pPr>
+        <w:jc w:val="both"/>
+        <w:rPr>
+          <w:lang w:eastAsia="zh-CN"/>
+        </w:rPr>
+      </w:pPr>
+      <w:r>
+        <w:rPr>
+          <w:lang w:eastAsia="zh-CN"/>
+        </w:rPr>
         <w:t>also increases area, arbitration complexity, and control overhead. In particular, dynamically selecting among multiple physical resources is more involved in a two-phase design because the request and acknowledgment phases form part of the communication state.</w:t>
       </w:r>
     </w:p>
@@ -1358,21 +1603,21 @@
         <w:ind w:firstLine="14.40pt"/>
         <w:jc w:val="both"/>
         <w:rPr>
+          <w:lang w:eastAsia="zh-CN"/>
+        </w:rPr>
+      </w:pPr>
+      <w:r>
+        <w:rPr>
+          <w:lang w:eastAsia="zh-CN"/>
+        </w:rPr>
+        <w:t>Taken together, these studies show that path length, network traffic, and router service capacity can each be improved independently. The difficulty at large scale is that optimizing one of them can expose another as the new bottleneck.</w:t>
+      </w:r>
+    </w:p>
+    <w:p>
+      <w:pPr>
+        <w:pStyle w:val="2"/>
+        <w:rPr>
           <w:rFonts w:hint="eastAsia"/>
-          <w:lang w:eastAsia="zh-CN"/>
-        </w:rPr>
-      </w:pPr>
-      <w:r>
-        <w:rPr>
-          <w:lang w:eastAsia="zh-CN"/>
-        </w:rPr>
-        <w:t>Taken together, these studies show that path length, network traffic, and router service capacity can each be improved independently. The difficulty at large scale is that optimizing one of them can expose another as the new bottleneck.</w:t>
-      </w:r>
-    </w:p>
-    <w:p>
-      <w:pPr>
-        <w:pStyle w:val="2"/>
-        <w:rPr>
           <w:lang w:eastAsia="zh-CN"/>
         </w:rPr>
       </w:pPr>
@@ -1389,6 +1634,29 @@
         <w:ind w:firstLine="14.40pt"/>
         <w:jc w:val="both"/>
         <w:rPr>
+          <w:lang w:eastAsia="zh-CN"/>
+        </w:rPr>
+      </w:pPr>
+      <w:r>
+        <w:rPr>
+          <w:lang w:eastAsia="zh-CN"/>
+        </w:rPr>
+        <w:t xml:space="preserve">The techniques discussed above improve different components of NoC performance, but their benefits are not independent. Topology optimization can shorten communication paths or provide additional bandwidth, yet hierarchical networks naturally concentrate traffic toward shared aggregation resources. Increasing the capacity of these resources can alleviate congestion, but concentrating more connectivity within increasingly wide routers also enlarges arbitration and multiplexing structures (Flattened Butterfly; PAICORE). Routing and multicast reduce traffic imbalance and redundant transmissions, especially for high-fanout communication, but their effectiveness still depends on the physical paths and forwarding capacity provided by the network (Multicast Tree Router; CMR). Conversely, a faster router can reduce per-hop delay and improve local throughput, but it cannot remove unnecessarily long routes or repeated traffic by </w:t>
+      </w:r>
+      <w:proofErr w:type="spellStart"/>
+      <w:r>
+        <w:rPr>
+          <w:lang w:eastAsia="zh-CN"/>
+        </w:rPr>
+        <w:t>itself.</w:t>
+      </w:r>
+      <w:proofErr w:type="spellEnd"/>
+    </w:p>
+    <w:p>
+      <w:pPr>
+        <w:ind w:firstLine="14.40pt"/>
+        <w:jc w:val="both"/>
+        <w:rPr>
           <w:rFonts w:hint="eastAsia"/>
           <w:lang w:eastAsia="zh-CN"/>
         </w:rPr>
@@ -1397,60 +1665,47 @@
         <w:rPr>
           <w:lang w:eastAsia="zh-CN"/>
         </w:rPr>
-        <w:t xml:space="preserve">These observations motivate three design objectives. First, </w:t>
-      </w:r>
-      <w:r>
-        <w:rPr>
-          <w:highlight w:val="yellow"/>
-          <w:lang w:eastAsia="zh-CN"/>
-        </w:rPr>
-        <w:t>multicast communication should span both local trees and an upper on-chip mesh without being replaced by separate unicast packets for individual clusters.</w:t>
-      </w:r>
-      <w:r>
-        <w:rPr>
-          <w:lang w:eastAsia="zh-CN"/>
-        </w:rPr>
-        <w:t xml:space="preserve"> The two parts of the network should operate on the same destination description while applying routing rules suited to their respective topologies. Second, </w:t>
-      </w:r>
-      <w:r>
-        <w:rPr>
-          <w:highlight w:val="yellow"/>
-          <w:lang w:eastAsia="zh-CN"/>
-        </w:rPr>
-        <w:t>multiple physical lanes should be controlled entirely asynchronously</w:t>
-      </w:r>
-      <w:r>
-        <w:rPr>
-          <w:lang w:eastAsia="zh-CN"/>
-        </w:rPr>
-        <w:t>: each multicast branch should remain assigned to one physical lane until the packet completes, while the correct two-phase handshake state is maintained during lane selection and arbitration. Third</w:t>
-      </w:r>
-      <w:r>
-        <w:rPr>
-          <w:highlight w:val="yellow"/>
-          <w:lang w:eastAsia="zh-CN"/>
-        </w:rPr>
-        <w:t>, system scale-out should be achieved by organizing PEs into local trees with a fixed number of levels and connecting these trees through an on-chip 2-D mesh</w:t>
-      </w:r>
-      <w:r>
-        <w:rPr>
-          <w:lang w:eastAsia="zh-CN"/>
-        </w:rPr>
-        <w:t>. A limited number of parallel physical lanes can provide additional bandwidth inside each tree without requiring the number of lanes to continue increasing toward the upper levels. Section III presents the architecture and routing mechanisms that realize these objectives.</w:t>
+        <w:t xml:space="preserve">These observations suggest that large high-fanout </w:t>
+      </w:r>
+      <w:proofErr w:type="spellStart"/>
+      <w:r>
+        <w:rPr>
+          <w:lang w:eastAsia="zh-CN"/>
+        </w:rPr>
+        <w:t>NoCs</w:t>
+      </w:r>
+      <w:proofErr w:type="spellEnd"/>
+      <w:r>
+        <w:rPr>
+          <w:lang w:eastAsia="zh-CN"/>
+        </w:rPr>
+        <w:t xml:space="preserve"> should coordinate network organization, traffic reduction, and router implementation rather than optimize them in isolation. The network should provide sufficient aggregation bandwidth without relying solely on progressively wider routing structures; multicast should preserve shared communication as long as possible instead of repeatedly injecting the same information; and the router should map packet branches onto the available physical resources while correctly maintaining asynchronous flow-control state. This motivates a cross-layer design that combines a parallel-path hierarchical fabric, native multicast across local and global network levels, and phase-safe asynchronous path binding.</w:t>
       </w:r>
     </w:p>
     <w:p>
       <w:pPr>
         <w:pStyle w:val="1"/>
-      </w:pPr>
-      <w:r>
-        <w:t xml:space="preserve">Prepare Your Paper </w:t>
-      </w:r>
-      <w:r>
-        <w:t>Before</w:t>
-      </w:r>
-      <w:r>
-        <w:t xml:space="preserve"> Styling</w:t>
+        <w:rPr>
+          <w:lang w:eastAsia="zh-CN"/>
+        </w:rPr>
+      </w:pPr>
+      <w:r>
+        <w:rPr>
+          <w:rFonts w:hint="eastAsia"/>
+          <w:lang w:eastAsia="zh-CN"/>
+        </w:rPr>
+        <w:t>Proposed NoC</w:t>
+      </w:r>
+    </w:p>
+    <w:p>
+      <w:pPr>
+        <w:pStyle w:val="2"/>
+        <w:rPr>
+          <w:rFonts w:hint="eastAsia"/>
+        </w:rPr>
+      </w:pPr>
+      <w:r>
+        <w:t>Parallel-Path Hierarchical Topology</w:t>
       </w:r>
     </w:p>
     <w:p>
@@ -1461,24 +1716,931 @@
         </w:rPr>
       </w:pPr>
       <w:r>
-        <w:t>Before</w:t>
-      </w:r>
-      <w:r>
-        <w:t xml:space="preserve"> you begin to format your paper, first write and save the content as a separate text file. </w:t>
-      </w:r>
-      <w:r>
         <w:rPr>
           <w:lang w:val="en-US"/>
         </w:rPr>
-        <w:t>Complete all content and organizational editing before formatting. Please note sections A-D below for more information on proofreading, spelling and grammar.</w:t>
+        <w:t>Motivated by the scalability tradeoff discussed in Section II, we organize the NoC as a fixed-depth local hierarchy with distributed parallel paths and an upper multi-plane mesh, as shown in Fig. 1. Each 64-PE tile contains three local routing stages, L1–L3, followed by 16 mesh routers for inter-tile communication. The hierarchy confines nearby traffic to lower levels and preserves short tree-like paths, while replicated physical paths prevent traffic from progressively collapsing onto a few upper-level resources. Rather than increasing bandwidth by continuously widening a small number of routers, the proposed topology distributes bandwidth across multiple bounded-radix routing elements, forming a uniform and scalable communication fabric.</w:t>
       </w:r>
     </w:p>
     <w:p>
       <w:pPr>
         <w:pStyle w:val="a3"/>
-      </w:pPr>
-      <w:r>
-        <w:t>Keep your text and graphic files separate until after the text has been formatted and styled. Do not use hard tabs, and limit use of hard returns to only one return at the end of a paragraph. Do not add any kind of pagination anywhere in the paper. Do not number text heads-the template will do that for you.</w:t>
+        <w:rPr>
+          <w:lang w:val="en-US"/>
+        </w:rPr>
+      </w:pPr>
+      <w:r>
+        <w:rPr>
+          <w:lang w:val="en-US"/>
+        </w:rPr>
+        <w:t xml:space="preserve">As shown in Fig. 1(b) and (c), parallelism is introduced through two cascaded </w:t>
+      </w:r>
+      <m:oMath>
+        <m:r>
+          <w:rPr>
+            <w:rFonts w:ascii="Cambria Math" w:hAnsi="Cambria Math"/>
+            <w:lang w:val="en-US"/>
+          </w:rPr>
+          <m:t>4×4</m:t>
+        </m:r>
+      </m:oMath>
+      <w:r>
+        <w:rPr>
+          <w:lang w:val="en-US"/>
+        </w:rPr>
+        <w:t xml:space="preserve">interconnection stages. Within each quadrant </w:t>
+      </w:r>
+      <m:oMath>
+        <m:r>
+          <w:rPr>
+            <w:rFonts w:ascii="Cambria Math" w:hAnsi="Cambria Math"/>
+            <w:lang w:val="en-US"/>
+          </w:rPr>
+          <m:t>q</m:t>
+        </m:r>
+      </m:oMath>
+      <w:r>
+        <w:rPr>
+          <w:lang w:val="en-US"/>
+        </w:rPr>
+        <w:t xml:space="preserve">, the four L1 routers </w:t>
+      </w:r>
+      <m:oMath>
+        <m:r>
+          <w:rPr>
+            <w:rFonts w:ascii="Cambria Math" w:hAnsi="Cambria Math"/>
+            <w:lang w:val="en-US"/>
+          </w:rPr>
+          <m:t>L1</m:t>
+        </m:r>
+        <m:d>
+          <m:dPr>
+            <m:sepChr m:val=","/>
+            <m:ctrlPr>
+              <w:rPr>
+                <w:rFonts w:ascii="Cambria Math" w:hAnsi="Cambria Math"/>
+                <w:lang w:val="en-US"/>
+              </w:rPr>
+            </m:ctrlPr>
+          </m:dPr>
+          <m:e>
+            <m:r>
+              <w:rPr>
+                <w:rFonts w:ascii="Cambria Math" w:hAnsi="Cambria Math"/>
+                <w:lang w:val="en-US"/>
+              </w:rPr>
+              <m:t>q</m:t>
+            </m:r>
+          </m:e>
+          <m:e>
+            <m:r>
+              <w:rPr>
+                <w:rFonts w:ascii="Cambria Math" w:hAnsi="Cambria Math"/>
+                <w:lang w:val="en-US"/>
+              </w:rPr>
+              <m:t>i</m:t>
+            </m:r>
+          </m:e>
+        </m:d>
+      </m:oMath>
+      <w:r>
+        <w:rPr>
+          <w:lang w:val="en-US"/>
+        </w:rPr>
+        <w:t xml:space="preserve">are fully connected to four replicated L2 routers </w:t>
+      </w:r>
+      <m:oMath>
+        <m:r>
+          <w:rPr>
+            <w:rFonts w:ascii="Cambria Math" w:hAnsi="Cambria Math"/>
+            <w:lang w:val="en-US"/>
+          </w:rPr>
+          <m:t>L2</m:t>
+        </m:r>
+        <m:d>
+          <m:dPr>
+            <m:sepChr m:val=","/>
+            <m:ctrlPr>
+              <w:rPr>
+                <w:rFonts w:ascii="Cambria Math" w:hAnsi="Cambria Math"/>
+                <w:lang w:val="en-US"/>
+              </w:rPr>
+            </m:ctrlPr>
+          </m:dPr>
+          <m:e>
+            <m:r>
+              <w:rPr>
+                <w:rFonts w:ascii="Cambria Math" w:hAnsi="Cambria Math"/>
+                <w:lang w:val="en-US"/>
+              </w:rPr>
+              <m:t>q</m:t>
+            </m:r>
+          </m:e>
+          <m:e>
+            <m:r>
+              <w:rPr>
+                <w:rFonts w:ascii="Cambria Math" w:hAnsi="Cambria Math"/>
+                <w:lang w:val="en-US"/>
+              </w:rPr>
+              <m:t>k</m:t>
+            </m:r>
+          </m:e>
+        </m:d>
+      </m:oMath>
+      <w:r>
+        <w:rPr>
+          <w:lang w:val="en-US"/>
+        </w:rPr>
+        <w:t xml:space="preserve">: each L1 can therefore select any of four upward L2 paths, while every L2 retains connectivity to all four L1 groups in the quadrant. At the next stage, for each </w:t>
+      </w:r>
+      <m:oMath>
+        <m:r>
+          <w:rPr>
+            <w:rFonts w:ascii="Cambria Math" w:hAnsi="Cambria Math"/>
+            <w:lang w:val="en-US"/>
+          </w:rPr>
+          <m:t>k</m:t>
+        </m:r>
+      </m:oMath>
+      <w:r>
+        <w:rPr>
+          <w:lang w:val="en-US"/>
+        </w:rPr>
+        <w:t xml:space="preserve">, the four </w:t>
+      </w:r>
+      <m:oMath>
+        <m:r>
+          <w:rPr>
+            <w:rFonts w:ascii="Cambria Math" w:hAnsi="Cambria Math"/>
+            <w:lang w:val="en-US"/>
+          </w:rPr>
+          <m:t>L2</m:t>
+        </m:r>
+        <m:d>
+          <m:dPr>
+            <m:sepChr m:val=","/>
+            <m:ctrlPr>
+              <w:rPr>
+                <w:rFonts w:ascii="Cambria Math" w:hAnsi="Cambria Math"/>
+                <w:lang w:val="en-US"/>
+              </w:rPr>
+            </m:ctrlPr>
+          </m:dPr>
+          <m:e>
+            <m:r>
+              <w:rPr>
+                <w:rFonts w:ascii="Cambria Math" w:hAnsi="Cambria Math"/>
+                <w:lang w:val="en-US"/>
+              </w:rPr>
+              <m:t>q</m:t>
+            </m:r>
+          </m:e>
+          <m:e>
+            <m:r>
+              <w:rPr>
+                <w:rFonts w:ascii="Cambria Math" w:hAnsi="Cambria Math"/>
+                <w:lang w:val="en-US"/>
+              </w:rPr>
+              <m:t>k</m:t>
+            </m:r>
+          </m:e>
+        </m:d>
+      </m:oMath>
+      <w:r>
+        <w:rPr>
+          <w:lang w:val="en-US"/>
+        </w:rPr>
+        <w:t xml:space="preserve">routers from different quadrants are similarly connected to four </w:t>
+      </w:r>
+      <m:oMath>
+        <m:r>
+          <w:rPr>
+            <w:rFonts w:ascii="Cambria Math" w:hAnsi="Cambria Math"/>
+            <w:lang w:val="en-US"/>
+          </w:rPr>
+          <m:t>L3</m:t>
+        </m:r>
+        <m:d>
+          <m:dPr>
+            <m:sepChr m:val=","/>
+            <m:ctrlPr>
+              <w:rPr>
+                <w:rFonts w:ascii="Cambria Math" w:hAnsi="Cambria Math"/>
+                <w:lang w:val="en-US"/>
+              </w:rPr>
+            </m:ctrlPr>
+          </m:dPr>
+          <m:e>
+            <m:r>
+              <w:rPr>
+                <w:rFonts w:ascii="Cambria Math" w:hAnsi="Cambria Math"/>
+                <w:lang w:val="en-US"/>
+              </w:rPr>
+              <m:t>j</m:t>
+            </m:r>
+          </m:e>
+          <m:e>
+            <m:r>
+              <w:rPr>
+                <w:rFonts w:ascii="Cambria Math" w:hAnsi="Cambria Math"/>
+                <w:lang w:val="en-US"/>
+              </w:rPr>
+              <m:t>k</m:t>
+            </m:r>
+          </m:e>
+        </m:d>
+      </m:oMath>
+      <w:r>
+        <w:rPr>
+          <w:lang w:val="en-US"/>
+        </w:rPr>
+        <w:t xml:space="preserve">routers. Hence, an upward packet first selects </w:t>
+      </w:r>
+      <m:oMath>
+        <m:r>
+          <w:rPr>
+            <w:rFonts w:ascii="Cambria Math" w:hAnsi="Cambria Math"/>
+            <w:lang w:val="en-US"/>
+          </w:rPr>
+          <m:t>k</m:t>
+        </m:r>
+      </m:oMath>
+      <w:r>
+        <w:rPr>
+          <w:lang w:val="en-US"/>
+        </w:rPr>
+        <w:t xml:space="preserve">at L1–L2 and then </w:t>
+      </w:r>
+      <m:oMath>
+        <m:r>
+          <w:rPr>
+            <w:rFonts w:ascii="Cambria Math" w:hAnsi="Cambria Math"/>
+            <w:lang w:val="en-US"/>
+          </w:rPr>
+          <m:t>j</m:t>
+        </m:r>
+      </m:oMath>
+      <w:r>
+        <w:rPr>
+          <w:lang w:val="en-US"/>
+        </w:rPr>
+        <w:t xml:space="preserve">at L2–L3, yielding </w:t>
+      </w:r>
+      <m:oMath>
+        <m:r>
+          <w:rPr>
+            <w:rFonts w:ascii="Cambria Math" w:hAnsi="Cambria Math"/>
+            <w:lang w:val="en-US"/>
+          </w:rPr>
+          <m:t>4×4=16</m:t>
+        </m:r>
+      </m:oMath>
+      <w:r>
+        <w:rPr>
+          <w:rFonts w:hint="eastAsia"/>
+          <w:lang w:val="en-US" w:eastAsia="zh-CN"/>
+        </w:rPr>
+        <w:t xml:space="preserve"> </w:t>
+      </w:r>
+      <w:r>
+        <w:rPr>
+          <w:lang w:val="en-US"/>
+        </w:rPr>
+        <w:t>physical path combinations. Importantly, these replicated paths do not alter the logical tree hierarchy; they only distribute traffic across multiple routing elements, allowing the same region-based routing semantics to be retained.</w:t>
+      </w:r>
+    </w:p>
+    <w:p>
+      <w:pPr>
+        <w:pStyle w:val="a3"/>
+      </w:pPr>
+      <w:r>
+        <w:t xml:space="preserve">Rather than further extending the hierarchy with increasingly wide upper-level routers, we terminate the local tree at L3 and distribute global traffic over multiple mesh planes. As shown in Fig. 1(d), let </w:t>
+      </w:r>
+      <m:oMath>
+        <m:sSub>
+          <m:sSubPr>
+            <m:ctrlPr>
+              <w:rPr>
+                <w:rFonts w:ascii="Cambria Math" w:hAnsi="Cambria Math"/>
+              </w:rPr>
+            </m:ctrlPr>
+          </m:sSubPr>
+          <m:e>
+            <m:r>
+              <w:rPr>
+                <w:rFonts w:ascii="Cambria Math" w:hAnsi="Cambria Math"/>
+              </w:rPr>
+              <m:t>P</m:t>
+            </m:r>
+          </m:e>
+          <m:sub>
+            <m:r>
+              <w:rPr>
+                <w:rFonts w:ascii="Cambria Math" w:hAnsi="Cambria Math"/>
+              </w:rPr>
+              <m:t>h</m:t>
+            </m:r>
+          </m:sub>
+        </m:sSub>
+      </m:oMath>
+      <w:r>
+        <w:t xml:space="preserve">denote the </w:t>
+      </w:r>
+      <m:oMath>
+        <m:r>
+          <w:rPr>
+            <w:rFonts w:ascii="Cambria Math" w:hAnsi="Cambria Math"/>
+          </w:rPr>
+          <m:t>h</m:t>
+        </m:r>
+      </m:oMath>
+      <w:r>
+        <w:t xml:space="preserve">-th parent lane of an L3 router and </w:t>
+      </w:r>
+      <m:oMath>
+        <m:sSub>
+          <m:sSubPr>
+            <m:ctrlPr>
+              <w:rPr>
+                <w:rFonts w:ascii="Cambria Math" w:hAnsi="Cambria Math"/>
+              </w:rPr>
+            </m:ctrlPr>
+          </m:sSubPr>
+          <m:e>
+            <m:r>
+              <w:rPr>
+                <w:rFonts w:ascii="Cambria Math" w:hAnsi="Cambria Math"/>
+              </w:rPr>
+              <m:t>L</m:t>
+            </m:r>
+          </m:e>
+          <m:sub>
+            <m:r>
+              <w:rPr>
+                <w:rFonts w:ascii="Cambria Math" w:hAnsi="Cambria Math"/>
+              </w:rPr>
+              <m:t>k</m:t>
+            </m:r>
+          </m:sub>
+        </m:sSub>
+      </m:oMath>
+      <w:r>
+        <w:t xml:space="preserve">the </w:t>
+      </w:r>
+      <m:oMath>
+        <m:r>
+          <w:rPr>
+            <w:rFonts w:ascii="Cambria Math" w:hAnsi="Cambria Math"/>
+          </w:rPr>
+          <m:t>k</m:t>
+        </m:r>
+      </m:oMath>
+      <w:r>
+        <w:t>-th local port of a mesh router. Their mapping is</w:t>
+      </w:r>
+      <w:r>
+        <w:rPr>
+          <w:rFonts w:hint="eastAsia"/>
+          <w:lang w:eastAsia="zh-CN"/>
+        </w:rPr>
+        <w:t xml:space="preserve"> </w:t>
+      </w:r>
+      <m:oMath>
+        <m:r>
+          <w:rPr>
+            <w:rFonts w:ascii="Cambria Math" w:hAnsi="Cambria Math"/>
+          </w:rPr>
+          <m:t>L3</m:t>
+        </m:r>
+        <m:d>
+          <m:dPr>
+            <m:sepChr m:val=","/>
+            <m:ctrlPr>
+              <w:rPr>
+                <w:rFonts w:ascii="Cambria Math" w:hAnsi="Cambria Math"/>
+              </w:rPr>
+            </m:ctrlPr>
+          </m:dPr>
+          <m:e>
+            <m:r>
+              <w:rPr>
+                <w:rFonts w:ascii="Cambria Math" w:hAnsi="Cambria Math"/>
+              </w:rPr>
+              <m:t>j</m:t>
+            </m:r>
+          </m:e>
+          <m:e>
+            <m:r>
+              <w:rPr>
+                <w:rFonts w:ascii="Cambria Math" w:hAnsi="Cambria Math"/>
+              </w:rPr>
+              <m:t>k</m:t>
+            </m:r>
+          </m:e>
+        </m:d>
+        <m:r>
+          <w:rPr>
+            <w:rFonts w:ascii="Cambria Math" w:hAnsi="Cambria Math"/>
+          </w:rPr>
+          <m:t>.</m:t>
+        </m:r>
+        <m:sSub>
+          <m:sSubPr>
+            <m:ctrlPr>
+              <w:rPr>
+                <w:rFonts w:ascii="Cambria Math" w:hAnsi="Cambria Math"/>
+              </w:rPr>
+            </m:ctrlPr>
+          </m:sSubPr>
+          <m:e>
+            <m:r>
+              <w:rPr>
+                <w:rFonts w:ascii="Cambria Math" w:hAnsi="Cambria Math"/>
+              </w:rPr>
+              <m:t>P</m:t>
+            </m:r>
+          </m:e>
+          <m:sub>
+            <m:r>
+              <w:rPr>
+                <w:rFonts w:ascii="Cambria Math" w:hAnsi="Cambria Math"/>
+              </w:rPr>
+              <m:t>h</m:t>
+            </m:r>
+          </m:sub>
+        </m:sSub>
+        <m:r>
+          <w:rPr>
+            <w:rFonts w:ascii="Cambria Math" w:hAnsi="Cambria Math"/>
+          </w:rPr>
+          <m:t>↔Mesh</m:t>
+        </m:r>
+        <m:d>
+          <m:dPr>
+            <m:sepChr m:val=","/>
+            <m:ctrlPr>
+              <w:rPr>
+                <w:rFonts w:ascii="Cambria Math" w:hAnsi="Cambria Math"/>
+              </w:rPr>
+            </m:ctrlPr>
+          </m:dPr>
+          <m:e>
+            <m:r>
+              <w:rPr>
+                <w:rFonts w:ascii="Cambria Math" w:hAnsi="Cambria Math"/>
+              </w:rPr>
+              <m:t>j</m:t>
+            </m:r>
+          </m:e>
+          <m:e>
+            <m:r>
+              <w:rPr>
+                <w:rFonts w:ascii="Cambria Math" w:hAnsi="Cambria Math"/>
+              </w:rPr>
+              <m:t>h</m:t>
+            </m:r>
+          </m:e>
+        </m:d>
+        <m:r>
+          <w:rPr>
+            <w:rFonts w:ascii="Cambria Math" w:hAnsi="Cambria Math"/>
+          </w:rPr>
+          <m:t>.</m:t>
+        </m:r>
+        <m:sSub>
+          <m:sSubPr>
+            <m:ctrlPr>
+              <w:rPr>
+                <w:rFonts w:ascii="Cambria Math" w:hAnsi="Cambria Math"/>
+              </w:rPr>
+            </m:ctrlPr>
+          </m:sSubPr>
+          <m:e>
+            <m:r>
+              <w:rPr>
+                <w:rFonts w:ascii="Cambria Math" w:hAnsi="Cambria Math"/>
+              </w:rPr>
+              <m:t>L</m:t>
+            </m:r>
+          </m:e>
+          <m:sub>
+            <m:r>
+              <w:rPr>
+                <w:rFonts w:ascii="Cambria Math" w:hAnsi="Cambria Math"/>
+              </w:rPr>
+              <m:t>k</m:t>
+            </m:r>
+          </m:sub>
+        </m:sSub>
+        <m:r>
+          <w:rPr>
+            <w:rFonts w:ascii="Cambria Math" w:hAnsi="Cambria Math"/>
+          </w:rPr>
+          <m:t>.</m:t>
+        </m:r>
+      </m:oMath>
+      <w:r>
+        <w:rPr>
+          <w:rFonts w:hint="eastAsia"/>
+          <w:lang w:eastAsia="zh-CN"/>
+        </w:rPr>
+        <w:t xml:space="preserve"> </w:t>
+      </w:r>
+      <w:r>
+        <w:t>Thus, the 16 L3 routers expose 64 tile-boundary connections, evenly distributed over 16 independent mesh planes, each serving four local L3 attachments. This organization avoids a new high-radix aggregation point while preserving bounded local arbitration. The fixed-depth hierarchy handles local communication, whereas the replicated meshes provide scalable inter-tile connectivity.</w:t>
+      </w:r>
+    </w:p>
+    <w:p>
+      <w:pPr>
+        <w:pStyle w:val="a3"/>
+      </w:pPr>
+      <w:r>
+        <w:lastRenderedPageBreak/>
+        <w:t xml:space="preserve">The structural benefit can be quantified by a simple cut-capacity bound. For a region </w:t>
+      </w:r>
+      <m:oMath>
+        <m:r>
+          <w:rPr>
+            <w:rFonts w:ascii="Cambria Math" w:hAnsi="Cambria Math"/>
+          </w:rPr>
+          <m:t>S</m:t>
+        </m:r>
+      </m:oMath>
+      <w:r>
+        <w:t xml:space="preserve">containing </w:t>
+      </w:r>
+      <m:oMath>
+        <m:r>
+          <w:rPr>
+            <w:rFonts w:ascii="Cambria Math" w:hAnsi="Cambria Math"/>
+          </w:rPr>
+          <m:t>s</m:t>
+        </m:r>
+      </m:oMath>
+      <w:r>
+        <w:t xml:space="preserve">nodes in an </w:t>
+      </w:r>
+      <m:oMath>
+        <m:r>
+          <w:rPr>
+            <w:rFonts w:ascii="Cambria Math" w:hAnsi="Cambria Math"/>
+          </w:rPr>
+          <m:t>N</m:t>
+        </m:r>
+      </m:oMath>
+      <w:r>
+        <w:t xml:space="preserve">-node network under uniform-random unicast traffic, the average traffic leaving </w:t>
+      </w:r>
+      <m:oMath>
+        <m:r>
+          <w:rPr>
+            <w:rFonts w:ascii="Cambria Math" w:hAnsi="Cambria Math"/>
+          </w:rPr>
+          <m:t>S</m:t>
+        </m:r>
+      </m:oMath>
+      <w:r>
+        <w:t>is</w:t>
+      </w:r>
+    </w:p>
+    <w:p>
+      <w:pPr>
+        <w:pStyle w:val="a3"/>
+      </w:pPr>
+      <m:oMathPara>
+        <m:oMath>
+          <m:m>
+            <m:mPr>
+              <m:plcHide m:val="1"/>
+              <m:mcs>
+                <m:mc>
+                  <m:mcPr>
+                    <m:count m:val="4"/>
+                    <m:mcJc m:val="center"/>
+                  </m:mcPr>
+                </m:mc>
+              </m:mcs>
+              <m:ctrlPr>
+                <w:rPr>
+                  <w:rFonts w:ascii="Cambria Math" w:hAnsi="Cambria Math"/>
+                </w:rPr>
+              </m:ctrlPr>
+            </m:mPr>
+            <m:mr>
+              <m:e/>
+              <m:e>
+                <m:sSub>
+                  <m:sSubPr>
+                    <m:ctrlPr>
+                      <w:rPr>
+                        <w:rFonts w:ascii="Cambria Math" w:hAnsi="Cambria Math"/>
+                      </w:rPr>
+                    </m:ctrlPr>
+                  </m:sSubPr>
+                  <m:e>
+                    <m:r>
+                      <m:rPr>
+                        <m:sty m:val="p"/>
+                      </m:rPr>
+                      <w:rPr>
+                        <w:rFonts w:ascii="Cambria Math" w:hAnsi="Cambria Math"/>
+                      </w:rPr>
+                      <m:t>Λ</m:t>
+                    </m:r>
+                  </m:e>
+                  <m:sub>
+                    <m:r>
+                      <m:rPr>
+                        <m:sty m:val="p"/>
+                      </m:rPr>
+                      <w:rPr>
+                        <w:rFonts w:ascii="Cambria Math" w:hAnsi="Cambria Math"/>
+                      </w:rPr>
+                      <m:t>out</m:t>
+                    </m:r>
+                  </m:sub>
+                </m:sSub>
+                <m:r>
+                  <w:rPr>
+                    <w:rFonts w:ascii="Cambria Math" w:hAnsi="Cambria Math"/>
+                  </w:rPr>
+                  <m:t>=sλ</m:t>
+                </m:r>
+                <m:f>
+                  <m:fPr>
+                    <m:ctrlPr>
+                      <w:rPr>
+                        <w:rFonts w:ascii="Cambria Math" w:hAnsi="Cambria Math"/>
+                      </w:rPr>
+                    </m:ctrlPr>
+                  </m:fPr>
+                  <m:num>
+                    <m:r>
+                      <w:rPr>
+                        <w:rFonts w:ascii="Cambria Math" w:hAnsi="Cambria Math"/>
+                      </w:rPr>
+                      <m:t>N-s</m:t>
+                    </m:r>
+                  </m:num>
+                  <m:den>
+                    <m:r>
+                      <w:rPr>
+                        <w:rFonts w:ascii="Cambria Math" w:hAnsi="Cambria Math"/>
+                      </w:rPr>
+                      <m:t>N-1</m:t>
+                    </m:r>
+                  </m:den>
+                </m:f>
+                <m:r>
+                  <w:rPr>
+                    <w:rFonts w:ascii="Cambria Math" w:hAnsi="Cambria Math"/>
+                  </w:rPr>
+                  <m:t>,</m:t>
+                </m:r>
+              </m:e>
+              <m:e/>
+              <m:e>
+                <m:r>
+                  <m:rPr>
+                    <m:nor/>
+                  </m:rPr>
+                  <m:t>(2)</m:t>
+                </m:r>
+              </m:e>
+            </m:mr>
+          </m:m>
+        </m:oMath>
+      </m:oMathPara>
+    </w:p>
+    <w:p>
+      <w:pPr>
+        <w:pStyle w:val="a3"/>
+      </w:pPr>
+      <w:r>
+        <w:t xml:space="preserve">where </w:t>
+      </w:r>
+      <m:oMath>
+        <m:r>
+          <w:rPr>
+            <w:rFonts w:ascii="Cambria Math" w:hAnsi="Cambria Math"/>
+          </w:rPr>
+          <m:t>λ</m:t>
+        </m:r>
+      </m:oMath>
+      <w:r>
+        <w:t xml:space="preserve">is the per-node injection rate. If the cut provides </w:t>
+      </w:r>
+      <m:oMath>
+        <m:r>
+          <w:rPr>
+            <w:rFonts w:ascii="Cambria Math" w:hAnsi="Cambria Math"/>
+          </w:rPr>
+          <m:t>c</m:t>
+        </m:r>
+      </m:oMath>
+      <w:r>
+        <w:t xml:space="preserve">directed lanes of capacity </w:t>
+      </w:r>
+      <m:oMath>
+        <m:r>
+          <w:rPr>
+            <w:rFonts w:ascii="Cambria Math" w:hAnsi="Cambria Math"/>
+          </w:rPr>
+          <m:t>C</m:t>
+        </m:r>
+      </m:oMath>
+      <w:r>
+        <w:t>, the sustainable injection rate is bounded by</w:t>
+      </w:r>
+    </w:p>
+    <w:p>
+      <w:pPr>
+        <w:pStyle w:val="a3"/>
+      </w:pPr>
+      <m:oMathPara>
+        <m:oMath>
+          <m:m>
+            <m:mPr>
+              <m:plcHide m:val="1"/>
+              <m:mcs>
+                <m:mc>
+                  <m:mcPr>
+                    <m:count m:val="4"/>
+                    <m:mcJc m:val="center"/>
+                  </m:mcPr>
+                </m:mc>
+              </m:mcs>
+              <m:ctrlPr>
+                <w:rPr>
+                  <w:rFonts w:ascii="Cambria Math" w:hAnsi="Cambria Math"/>
+                </w:rPr>
+              </m:ctrlPr>
+            </m:mPr>
+            <m:mr>
+              <m:e/>
+              <m:e>
+                <m:r>
+                  <w:rPr>
+                    <w:rFonts w:ascii="Cambria Math" w:hAnsi="Cambria Math"/>
+                  </w:rPr>
+                  <m:t>λ≤</m:t>
+                </m:r>
+                <m:f>
+                  <m:fPr>
+                    <m:ctrlPr>
+                      <w:rPr>
+                        <w:rFonts w:ascii="Cambria Math" w:hAnsi="Cambria Math"/>
+                      </w:rPr>
+                    </m:ctrlPr>
+                  </m:fPr>
+                  <m:num>
+                    <m:r>
+                      <w:rPr>
+                        <w:rFonts w:ascii="Cambria Math" w:hAnsi="Cambria Math"/>
+                      </w:rPr>
+                      <m:t>cC</m:t>
+                    </m:r>
+                    <m:d>
+                      <m:dPr>
+                        <m:ctrlPr>
+                          <w:rPr>
+                            <w:rFonts w:ascii="Cambria Math" w:hAnsi="Cambria Math"/>
+                          </w:rPr>
+                        </m:ctrlPr>
+                      </m:dPr>
+                      <m:e>
+                        <m:r>
+                          <w:rPr>
+                            <w:rFonts w:ascii="Cambria Math" w:hAnsi="Cambria Math"/>
+                          </w:rPr>
+                          <m:t>N-1</m:t>
+                        </m:r>
+                      </m:e>
+                    </m:d>
+                  </m:num>
+                  <m:den>
+                    <m:r>
+                      <w:rPr>
+                        <w:rFonts w:ascii="Cambria Math" w:hAnsi="Cambria Math"/>
+                      </w:rPr>
+                      <m:t>s</m:t>
+                    </m:r>
+                    <m:d>
+                      <m:dPr>
+                        <m:ctrlPr>
+                          <w:rPr>
+                            <w:rFonts w:ascii="Cambria Math" w:hAnsi="Cambria Math"/>
+                          </w:rPr>
+                        </m:ctrlPr>
+                      </m:dPr>
+                      <m:e>
+                        <m:r>
+                          <w:rPr>
+                            <w:rFonts w:ascii="Cambria Math" w:hAnsi="Cambria Math"/>
+                          </w:rPr>
+                          <m:t>N-s</m:t>
+                        </m:r>
+                      </m:e>
+                    </m:d>
+                  </m:den>
+                </m:f>
+                <m:r>
+                  <w:rPr>
+                    <w:rFonts w:ascii="Cambria Math" w:hAnsi="Cambria Math"/>
+                  </w:rPr>
+                  <m:t>.</m:t>
+                </m:r>
+              </m:e>
+              <m:e/>
+              <m:e>
+                <m:r>
+                  <m:rPr>
+                    <m:nor/>
+                  </m:rPr>
+                  <m:t>(3)</m:t>
+                </m:r>
+              </m:e>
+            </m:mr>
+          </m:m>
+        </m:oMath>
+      </m:oMathPara>
+    </w:p>
+    <w:p>
+      <w:pPr>
+        <w:pStyle w:val="a3"/>
+        <w:rPr>
+          <w:rFonts w:hint="eastAsia"/>
+          <w:lang w:eastAsia="zh-CN"/>
+        </w:rPr>
+      </w:pPr>
+      <w:r>
+        <w:t xml:space="preserve">For the 64-PE local hierarchy, the 4-PE and 16-PE cuts yield bounds of </w:t>
+      </w:r>
+      <m:oMath>
+        <m:r>
+          <w:rPr>
+            <w:rFonts w:ascii="Cambria Math" w:hAnsi="Cambria Math"/>
+          </w:rPr>
+          <m:t>1.05C</m:t>
+        </m:r>
+      </m:oMath>
+      <w:r>
+        <w:t xml:space="preserve">and </w:t>
+      </w:r>
+      <m:oMath>
+        <m:r>
+          <w:rPr>
+            <w:rFonts w:ascii="Cambria Math" w:hAnsi="Cambria Math"/>
+          </w:rPr>
+          <m:t>1.31C</m:t>
+        </m:r>
+      </m:oMath>
+      <w:r>
+        <w:t xml:space="preserve">, respectively, both above the endpoint capacity </w:t>
+      </w:r>
+      <m:oMath>
+        <m:r>
+          <w:rPr>
+            <w:rFonts w:ascii="Cambria Math" w:hAnsi="Cambria Math"/>
+          </w:rPr>
+          <m:t>C</m:t>
+        </m:r>
+      </m:oMath>
+      <w:r>
+        <w:t xml:space="preserve">; hence, neither hierarchical cut becomes the intrinsic bottleneck under this traffic model. At 256 nodes, the 16-plane upper mesh provides a central-bisection bound of </w:t>
+      </w:r>
+      <m:oMath>
+        <m:r>
+          <w:rPr>
+            <w:rFonts w:ascii="Cambria Math" w:hAnsi="Cambria Math"/>
+          </w:rPr>
+          <m:t>0.498C</m:t>
+        </m:r>
+      </m:oMath>
+      <w:r>
+        <w:t xml:space="preserve">, twice that of an equal-scale single-plane </w:t>
+      </w:r>
+      <m:oMath>
+        <m:r>
+          <w:rPr>
+            <w:rFonts w:ascii="Cambria Math" w:hAnsi="Cambria Math"/>
+          </w:rPr>
+          <m:t>16×16</m:t>
+        </m:r>
+      </m:oMath>
+      <w:r>
+        <w:t>mesh (</w:t>
+      </w:r>
+      <m:oMath>
+        <m:r>
+          <w:rPr>
+            <w:rFonts w:ascii="Cambria Math" w:hAnsi="Cambria Math"/>
+          </w:rPr>
+          <m:t>0.249C</m:t>
+        </m:r>
+      </m:oMath>
+      <w:r>
+        <w:t>). These bounds characterize structural capacity; measured performance is evaluated in Section IV.</w:t>
       </w:r>
     </w:p>
     <w:p>
@@ -1486,343 +2648,2090 @@
         <w:pStyle w:val="2"/>
       </w:pPr>
       <w:r>
-        <w:t>Abbreviations</w:t>
-      </w:r>
-      <w:r>
-        <w:t xml:space="preserve"> and Acronyms</w:t>
+        <w:t>Multicast Routing Across Tree and Mesh</w:t>
       </w:r>
     </w:p>
     <w:p>
       <w:pPr>
         <w:pStyle w:val="a3"/>
-      </w:pPr>
-      <w:r>
-        <w:t>Define abbreviations and acronyms the first time they are used in the text, even after they have been defined in the abstract. Abbreviations such as IEEE, SI, MKS, CGS, sc, dc, and rms do not have to be defined. Do not use abbreviations in the title or heads unless they are unavoidable.</w:t>
-      </w:r>
-    </w:p>
-    <w:p>
-      <w:pPr>
-        <w:pStyle w:val="2"/>
-      </w:pPr>
-      <w:r>
-        <w:t>Units</w:t>
-      </w:r>
-    </w:p>
-    <w:p>
-      <w:pPr>
-        <w:pStyle w:val="bulletlist"/>
-      </w:pPr>
-      <w:r>
-        <w:t xml:space="preserve">Use </w:t>
-      </w:r>
-      <w:r>
-        <w:t>either</w:t>
-      </w:r>
-      <w:r>
-        <w:t xml:space="preserve"> SI (MKS) or CGS as primary units. (SI units are encouraged.) English units may be used as secondary units (in parentheses). An exception would be the use of English units as identifiers in trade, such as “3.5-inch disk drive”.</w:t>
-      </w:r>
-    </w:p>
-    <w:p>
-      <w:pPr>
-        <w:pStyle w:val="bulletlist"/>
-      </w:pPr>
-      <w:r>
-        <w:t xml:space="preserve">Avoid combining SI and CGS units, such as current in amperes and magnetic field in oersteds. This often leads to confusion because equations do not balance dimensionally. If you must use mixed units, clearly </w:t>
-      </w:r>
-      <w:r>
-        <w:t>state the units for each quantity that you use in an equation.</w:t>
-      </w:r>
-    </w:p>
-    <w:p>
-      <w:pPr>
-        <w:pStyle w:val="bulletlist"/>
-      </w:pPr>
-      <w:r>
-        <w:t>Do not mix complete spellings and abbreviations of units: “Wb/m2” or “webers per square meter”, not “webers/m2”.  Spell out units when they appear in text: “. . . a few henries”, not “. . . a few H”.</w:t>
-      </w:r>
-    </w:p>
-    <w:p>
-      <w:pPr>
-        <w:pStyle w:val="sponsors"/>
-        <w:framePr w:wrap="auto" w:vAnchor="page" w:hAnchor="page" w:x="45.90pt" w:y="756.05pt"/>
-        <w:ind w:firstLine="14.45pt"/>
-      </w:pPr>
-      <w:r>
-        <w:t>Identif</w:t>
-      </w:r>
-      <w:r>
-        <w:t xml:space="preserve">y applicable </w:t>
-      </w:r>
-      <w:r>
-        <w:t>funding agency</w:t>
-      </w:r>
-      <w:r>
-        <w:t xml:space="preserve"> here. </w:t>
-      </w:r>
-      <w:r>
-        <w:rPr>
-          <w:iCs/>
-        </w:rPr>
-        <w:t>If none, delete this text box</w:t>
-      </w:r>
-      <w:r>
-        <w:rPr>
-          <w:iCs/>
-        </w:rPr>
-        <w:t>.</w:t>
-      </w:r>
-    </w:p>
-    <w:p>
-      <w:pPr>
-        <w:pStyle w:val="bulletlist"/>
-      </w:pPr>
-      <w:r>
-        <w:t xml:space="preserve">Use a zero before decimal points: “0.25”, not “.25”. Use “cm3”, not “cc”. </w:t>
-      </w:r>
-      <w:r>
-        <w:t>(</w:t>
-      </w:r>
-      <w:r>
-        <w:rPr>
+        <w:ind w:firstLine="0pt"/>
+        <w:rPr>
+          <w:lang w:val="en-US"/>
+        </w:rPr>
+      </w:pPr>
+      <w:r>
+        <w:rPr>
+          <w:lang w:val="en-US"/>
+        </w:rPr>
+        <w:tab/>
+      </w:r>
+      <w:r>
+        <w:rPr>
+          <w:lang w:val="en-US"/>
+        </w:rPr>
+        <w:t xml:space="preserve">We use a unified rectangular destination representation across both routing tiers. Each multicast packet carries </w:t>
+      </w:r>
+      <m:oMath>
+        <m:sSub>
+          <m:sSubPr>
+            <m:ctrlPr>
+              <w:rPr>
+                <w:rFonts w:ascii="Cambria Math" w:hAnsi="Cambria Math"/>
+                <w:lang w:val="en-US"/>
+              </w:rPr>
+            </m:ctrlPr>
+          </m:sSubPr>
+          <m:e>
+            <m:r>
+              <w:rPr>
+                <w:rFonts w:ascii="Cambria Math" w:hAnsi="Cambria Math"/>
+                <w:lang w:val="en-US"/>
+              </w:rPr>
+              <m:t>R</m:t>
+            </m:r>
+          </m:e>
+          <m:sub>
+            <m:r>
+              <w:rPr>
+                <w:rFonts w:ascii="Cambria Math" w:hAnsi="Cambria Math"/>
+                <w:lang w:val="en-US"/>
+              </w:rPr>
+              <m:t>d</m:t>
+            </m:r>
+          </m:sub>
+        </m:sSub>
+        <m:r>
+          <w:rPr>
+            <w:rFonts w:ascii="Cambria Math" w:hAnsi="Cambria Math"/>
+            <w:lang w:val="en-US"/>
+          </w:rPr>
+          <m:t>=</m:t>
+        </m:r>
+        <m:d>
+          <m:dPr>
+            <m:begChr m:val="["/>
+            <m:sepChr m:val=","/>
+            <m:endChr m:val="]"/>
+            <m:ctrlPr>
+              <w:rPr>
+                <w:rFonts w:ascii="Cambria Math" w:hAnsi="Cambria Math"/>
+                <w:lang w:val="en-US"/>
+              </w:rPr>
+            </m:ctrlPr>
+          </m:dPr>
+          <m:e>
+            <m:sSub>
+              <m:sSubPr>
+                <m:ctrlPr>
+                  <w:rPr>
+                    <w:rFonts w:ascii="Cambria Math" w:hAnsi="Cambria Math"/>
+                    <w:lang w:val="en-US"/>
+                  </w:rPr>
+                </m:ctrlPr>
+              </m:sSubPr>
+              <m:e>
+                <m:r>
+                  <w:rPr>
+                    <w:rFonts w:ascii="Cambria Math" w:hAnsi="Cambria Math"/>
+                    <w:lang w:val="en-US"/>
+                  </w:rPr>
+                  <m:t>x</m:t>
+                </m:r>
+              </m:e>
+              <m:sub>
+                <m:r>
+                  <w:rPr>
+                    <w:rFonts w:ascii="Cambria Math" w:hAnsi="Cambria Math"/>
+                    <w:lang w:val="en-US"/>
+                  </w:rPr>
+                  <m:t>0</m:t>
+                </m:r>
+              </m:sub>
+            </m:sSub>
+          </m:e>
+          <m:e>
+            <m:sSub>
+              <m:sSubPr>
+                <m:ctrlPr>
+                  <w:rPr>
+                    <w:rFonts w:ascii="Cambria Math" w:hAnsi="Cambria Math"/>
+                    <w:lang w:val="en-US"/>
+                  </w:rPr>
+                </m:ctrlPr>
+              </m:sSubPr>
+              <m:e>
+                <m:r>
+                  <w:rPr>
+                    <w:rFonts w:ascii="Cambria Math" w:hAnsi="Cambria Math"/>
+                    <w:lang w:val="en-US"/>
+                  </w:rPr>
+                  <m:t>x</m:t>
+                </m:r>
+              </m:e>
+              <m:sub>
+                <m:r>
+                  <w:rPr>
+                    <w:rFonts w:ascii="Cambria Math" w:hAnsi="Cambria Math"/>
+                    <w:lang w:val="en-US"/>
+                  </w:rPr>
+                  <m:t>1</m:t>
+                </m:r>
+              </m:sub>
+            </m:sSub>
+          </m:e>
+        </m:d>
+        <m:r>
+          <w:rPr>
+            <w:rFonts w:ascii="Cambria Math" w:hAnsi="Cambria Math"/>
+            <w:lang w:val="en-US"/>
+          </w:rPr>
+          <m:t>×</m:t>
+        </m:r>
+        <m:d>
+          <m:dPr>
+            <m:begChr m:val="["/>
+            <m:sepChr m:val=","/>
+            <m:endChr m:val="]"/>
+            <m:ctrlPr>
+              <w:rPr>
+                <w:rFonts w:ascii="Cambria Math" w:hAnsi="Cambria Math"/>
+                <w:lang w:val="en-US"/>
+              </w:rPr>
+            </m:ctrlPr>
+          </m:dPr>
+          <m:e>
+            <m:sSub>
+              <m:sSubPr>
+                <m:ctrlPr>
+                  <w:rPr>
+                    <w:rFonts w:ascii="Cambria Math" w:hAnsi="Cambria Math"/>
+                    <w:lang w:val="en-US"/>
+                  </w:rPr>
+                </m:ctrlPr>
+              </m:sSubPr>
+              <m:e>
+                <m:r>
+                  <w:rPr>
+                    <w:rFonts w:ascii="Cambria Math" w:hAnsi="Cambria Math"/>
+                    <w:lang w:val="en-US"/>
+                  </w:rPr>
+                  <m:t>y</m:t>
+                </m:r>
+              </m:e>
+              <m:sub>
+                <m:r>
+                  <w:rPr>
+                    <w:rFonts w:ascii="Cambria Math" w:hAnsi="Cambria Math"/>
+                    <w:lang w:val="en-US"/>
+                  </w:rPr>
+                  <m:t>0</m:t>
+                </m:r>
+              </m:sub>
+            </m:sSub>
+          </m:e>
+          <m:e>
+            <m:sSub>
+              <m:sSubPr>
+                <m:ctrlPr>
+                  <w:rPr>
+                    <w:rFonts w:ascii="Cambria Math" w:hAnsi="Cambria Math"/>
+                    <w:lang w:val="en-US"/>
+                  </w:rPr>
+                </m:ctrlPr>
+              </m:sSubPr>
+              <m:e>
+                <m:r>
+                  <w:rPr>
+                    <w:rFonts w:ascii="Cambria Math" w:hAnsi="Cambria Math"/>
+                    <w:lang w:val="en-US"/>
+                  </w:rPr>
+                  <m:t>y</m:t>
+                </m:r>
+              </m:e>
+              <m:sub>
+                <m:r>
+                  <w:rPr>
+                    <w:rFonts w:ascii="Cambria Math" w:hAnsi="Cambria Math"/>
+                    <w:lang w:val="en-US"/>
+                  </w:rPr>
+                  <m:t>1</m:t>
+                </m:r>
+              </m:sub>
+            </m:sSub>
+          </m:e>
+        </m:d>
+      </m:oMath>
+      <w:r>
+        <w:rPr>
+          <w:lang w:val="en-US"/>
+        </w:rPr>
+        <w:t xml:space="preserve">, where </w:t>
+      </w:r>
+      <m:oMath>
+        <m:d>
+          <m:dPr>
+            <m:sepChr m:val=","/>
+            <m:ctrlPr>
+              <w:rPr>
+                <w:rFonts w:ascii="Cambria Math" w:hAnsi="Cambria Math"/>
+                <w:lang w:val="en-US"/>
+              </w:rPr>
+            </m:ctrlPr>
+          </m:dPr>
+          <m:e>
+            <m:sSub>
+              <m:sSubPr>
+                <m:ctrlPr>
+                  <w:rPr>
+                    <w:rFonts w:ascii="Cambria Math" w:hAnsi="Cambria Math"/>
+                    <w:lang w:val="en-US"/>
+                  </w:rPr>
+                </m:ctrlPr>
+              </m:sSubPr>
+              <m:e>
+                <m:r>
+                  <w:rPr>
+                    <w:rFonts w:ascii="Cambria Math" w:hAnsi="Cambria Math"/>
+                    <w:lang w:val="en-US"/>
+                  </w:rPr>
+                  <m:t>x</m:t>
+                </m:r>
+              </m:e>
+              <m:sub>
+                <m:r>
+                  <w:rPr>
+                    <w:rFonts w:ascii="Cambria Math" w:hAnsi="Cambria Math"/>
+                    <w:lang w:val="en-US"/>
+                  </w:rPr>
+                  <m:t>0</m:t>
+                </m:r>
+              </m:sub>
+            </m:sSub>
+          </m:e>
+          <m:e>
+            <m:sSub>
+              <m:sSubPr>
+                <m:ctrlPr>
+                  <w:rPr>
+                    <w:rFonts w:ascii="Cambria Math" w:hAnsi="Cambria Math"/>
+                    <w:lang w:val="en-US"/>
+                  </w:rPr>
+                </m:ctrlPr>
+              </m:sSubPr>
+              <m:e>
+                <m:r>
+                  <w:rPr>
+                    <w:rFonts w:ascii="Cambria Math" w:hAnsi="Cambria Math"/>
+                    <w:lang w:val="en-US"/>
+                  </w:rPr>
+                  <m:t>y</m:t>
+                </m:r>
+              </m:e>
+              <m:sub>
+                <m:r>
+                  <w:rPr>
+                    <w:rFonts w:ascii="Cambria Math" w:hAnsi="Cambria Math"/>
+                    <w:lang w:val="en-US"/>
+                  </w:rPr>
+                  <m:t>0</m:t>
+                </m:r>
+              </m:sub>
+            </m:sSub>
+          </m:e>
+        </m:d>
+      </m:oMath>
+      <w:r>
+        <w:rPr>
+          <w:lang w:val="en-US"/>
+        </w:rPr>
+        <w:t xml:space="preserve">and </w:t>
+      </w:r>
+      <m:oMath>
+        <m:d>
+          <m:dPr>
+            <m:sepChr m:val=","/>
+            <m:ctrlPr>
+              <w:rPr>
+                <w:rFonts w:ascii="Cambria Math" w:hAnsi="Cambria Math"/>
+                <w:lang w:val="en-US"/>
+              </w:rPr>
+            </m:ctrlPr>
+          </m:dPr>
+          <m:e>
+            <m:sSub>
+              <m:sSubPr>
+                <m:ctrlPr>
+                  <w:rPr>
+                    <w:rFonts w:ascii="Cambria Math" w:hAnsi="Cambria Math"/>
+                    <w:lang w:val="en-US"/>
+                  </w:rPr>
+                </m:ctrlPr>
+              </m:sSubPr>
+              <m:e>
+                <m:r>
+                  <w:rPr>
+                    <w:rFonts w:ascii="Cambria Math" w:hAnsi="Cambria Math"/>
+                    <w:lang w:val="en-US"/>
+                  </w:rPr>
+                  <m:t>x</m:t>
+                </m:r>
+              </m:e>
+              <m:sub>
+                <m:r>
+                  <w:rPr>
+                    <w:rFonts w:ascii="Cambria Math" w:hAnsi="Cambria Math"/>
+                    <w:lang w:val="en-US"/>
+                  </w:rPr>
+                  <m:t>1</m:t>
+                </m:r>
+              </m:sub>
+            </m:sSub>
+          </m:e>
+          <m:e>
+            <m:sSub>
+              <m:sSubPr>
+                <m:ctrlPr>
+                  <w:rPr>
+                    <w:rFonts w:ascii="Cambria Math" w:hAnsi="Cambria Math"/>
+                    <w:lang w:val="en-US"/>
+                  </w:rPr>
+                </m:ctrlPr>
+              </m:sSubPr>
+              <m:e>
+                <m:r>
+                  <w:rPr>
+                    <w:rFonts w:ascii="Cambria Math" w:hAnsi="Cambria Math"/>
+                    <w:lang w:val="en-US"/>
+                  </w:rPr>
+                  <m:t>y</m:t>
+                </m:r>
+              </m:e>
+              <m:sub>
+                <m:r>
+                  <w:rPr>
+                    <w:rFonts w:ascii="Cambria Math" w:hAnsi="Cambria Math"/>
+                    <w:lang w:val="en-US"/>
+                  </w:rPr>
+                  <m:t>1</m:t>
+                </m:r>
+              </m:sub>
+            </m:sSub>
+          </m:e>
+        </m:d>
+      </m:oMath>
+      <w:r>
+        <w:rPr>
+          <w:rFonts w:hint="eastAsia"/>
+          <w:lang w:val="en-US" w:eastAsia="zh-CN"/>
+        </w:rPr>
+        <w:t xml:space="preserve"> </w:t>
+      </w:r>
+      <w:r>
+        <w:rPr>
+          <w:lang w:val="en-US"/>
+        </w:rPr>
+        <w:t xml:space="preserve">denote the two opposite corners of the destination region. At each router </w:t>
+      </w:r>
+      <m:oMath>
+        <m:r>
+          <w:rPr>
+            <w:rFonts w:ascii="Cambria Math" w:hAnsi="Cambria Math"/>
+            <w:lang w:val="en-US"/>
+          </w:rPr>
+          <m:t>v</m:t>
+        </m:r>
+      </m:oMath>
+      <w:r>
+        <w:rPr>
+          <w:lang w:val="en-US"/>
+        </w:rPr>
+        <w:t xml:space="preserve">, the routing logic determines a logical output mask </w:t>
+      </w:r>
+      <m:oMath>
+        <m:r>
+          <m:rPr>
+            <m:sty m:val="bi"/>
+          </m:rPr>
+          <w:rPr>
+            <w:rFonts w:ascii="Cambria Math" w:hAnsi="Cambria Math"/>
+            <w:lang w:val="en-US"/>
+          </w:rPr>
+          <m:t>D</m:t>
+        </m:r>
+        <m:r>
+          <m:rPr>
+            <m:scr m:val="script"/>
+          </m:rPr>
+          <w:rPr>
+            <w:rFonts w:ascii="Cambria Math" w:hAnsi="Cambria Math"/>
+            <w:lang w:val="en-US"/>
+          </w:rPr>
+          <m:t>=R</m:t>
+        </m:r>
+        <m:d>
+          <m:dPr>
+            <m:sepChr m:val=","/>
+            <m:ctrlPr>
+              <w:rPr>
+                <w:rFonts w:ascii="Cambria Math" w:hAnsi="Cambria Math"/>
+                <w:lang w:val="en-US"/>
+              </w:rPr>
+            </m:ctrlPr>
+          </m:dPr>
+          <m:e>
+            <m:r>
+              <w:rPr>
+                <w:rFonts w:ascii="Cambria Math" w:hAnsi="Cambria Math"/>
+                <w:lang w:val="en-US"/>
+              </w:rPr>
+              <m:t>v</m:t>
+            </m:r>
+          </m:e>
+          <m:e>
+            <m:sSub>
+              <m:sSubPr>
+                <m:ctrlPr>
+                  <w:rPr>
+                    <w:rFonts w:ascii="Cambria Math" w:hAnsi="Cambria Math"/>
+                    <w:lang w:val="en-US"/>
+                  </w:rPr>
+                </m:ctrlPr>
+              </m:sSubPr>
+              <m:e>
+                <m:r>
+                  <w:rPr>
+                    <w:rFonts w:ascii="Cambria Math" w:hAnsi="Cambria Math"/>
+                    <w:lang w:val="en-US"/>
+                  </w:rPr>
+                  <m:t>R</m:t>
+                </m:r>
+              </m:e>
+              <m:sub>
+                <m:r>
+                  <w:rPr>
+                    <w:rFonts w:ascii="Cambria Math" w:hAnsi="Cambria Math"/>
+                    <w:lang w:val="en-US"/>
+                  </w:rPr>
+                  <m:t>d</m:t>
+                </m:r>
+              </m:sub>
+            </m:sSub>
+          </m:e>
+          <m:e>
+            <m:sSub>
+              <m:sSubPr>
+                <m:ctrlPr>
+                  <w:rPr>
+                    <w:rFonts w:ascii="Cambria Math" w:hAnsi="Cambria Math"/>
+                    <w:lang w:val="en-US"/>
+                  </w:rPr>
+                </m:ctrlPr>
+              </m:sSubPr>
+              <m:e>
+                <m:r>
+                  <w:rPr>
+                    <w:rFonts w:ascii="Cambria Math" w:hAnsi="Cambria Math"/>
+                    <w:lang w:val="en-US"/>
+                  </w:rPr>
+                  <m:t>d</m:t>
+                </m:r>
+              </m:e>
+              <m:sub>
+                <m:r>
+                  <m:rPr>
+                    <m:sty m:val="p"/>
+                  </m:rPr>
+                  <w:rPr>
+                    <w:rFonts w:ascii="Cambria Math" w:hAnsi="Cambria Math"/>
+                    <w:lang w:val="en-US"/>
+                  </w:rPr>
+                  <m:t>in</m:t>
+                </m:r>
+              </m:sub>
+            </m:sSub>
+          </m:e>
+        </m:d>
+      </m:oMath>
+      <w:r>
+        <w:rPr>
+          <w:lang w:val="en-US"/>
+        </w:rPr>
+        <w:t xml:space="preserve">, where </w:t>
+      </w:r>
+      <m:oMath>
+        <m:sSub>
+          <m:sSubPr>
+            <m:ctrlPr>
+              <w:rPr>
+                <w:rFonts w:ascii="Cambria Math" w:hAnsi="Cambria Math"/>
+                <w:lang w:val="en-US"/>
+              </w:rPr>
+            </m:ctrlPr>
+          </m:sSubPr>
+          <m:e>
+            <m:r>
+              <w:rPr>
+                <w:rFonts w:ascii="Cambria Math" w:hAnsi="Cambria Math"/>
+                <w:lang w:val="en-US"/>
+              </w:rPr>
+              <m:t>d</m:t>
+            </m:r>
+          </m:e>
+          <m:sub>
+            <m:r>
+              <m:rPr>
+                <m:sty m:val="p"/>
+              </m:rPr>
+              <w:rPr>
+                <w:rFonts w:ascii="Cambria Math" w:hAnsi="Cambria Math"/>
+                <w:lang w:val="en-US"/>
+              </w:rPr>
+              <m:t>in</m:t>
+            </m:r>
+          </m:sub>
+        </m:sSub>
+      </m:oMath>
+      <w:r>
+        <w:rPr>
+          <w:lang w:val="en-US"/>
+        </w:rPr>
+        <w:t xml:space="preserve">is the ingress direction and each bit of </w:t>
+      </w:r>
+      <m:oMath>
+        <m:r>
+          <m:rPr>
+            <m:sty m:val="bi"/>
+          </m:rPr>
+          <w:rPr>
+            <w:rFonts w:ascii="Cambria Math" w:hAnsi="Cambria Math"/>
+            <w:lang w:val="en-US"/>
+          </w:rPr>
+          <m:t>D</m:t>
+        </m:r>
+      </m:oMath>
+      <w:r>
+        <w:rPr>
+          <w:lang w:val="en-US"/>
+        </w:rPr>
+        <w:t>enables one output direction. Physical-lane selection is handled separately by the multi-lane control in Section III-C, allowing the same multicast packet to traverse the Tree–Mesh hierarchy without destination rewriting or packet regeneration.</w:t>
+      </w:r>
+    </w:p>
+    <w:p>
+      <w:pPr>
+        <w:pStyle w:val="a3"/>
+        <w:tabs>
+          <w:tab w:val="clear" w:pos="14.40pt"/>
+        </w:tabs>
+        <w:ind w:firstLine="0pt"/>
+        <w:rPr>
+          <w:rFonts w:hint="eastAsia"/>
+          <w:lang w:val="en-US" w:eastAsia="zh-CN"/>
+        </w:rPr>
+      </w:pPr>
+      <w:r>
+        <w:rPr>
+          <w:rFonts w:hint="eastAsia"/>
           <w:i/>
           <w:iCs/>
-        </w:rPr>
-        <w:t>bullet list</w:t>
-      </w:r>
-      <w:r>
-        <w:t>)</w:t>
-      </w:r>
-    </w:p>
-    <w:p>
-      <w:pPr>
-        <w:pStyle w:val="2"/>
-      </w:pPr>
-      <w:r>
-        <w:t>Equations</w:t>
-      </w:r>
-    </w:p>
-    <w:p>
-      <w:pPr>
-        <w:pStyle w:val="a3"/>
-      </w:pPr>
-      <w:r>
-        <w:t>The equations are an exception to the prescribed specifications of this template. You will need to determine whether or not your equation should be typed using either the Times New Roman or the Symbol font (please no other font). To create multileveled equations, it may be necessary to treat the equation as a graphic and insert it into the text after your paper is styled.</w:t>
-      </w:r>
-    </w:p>
-    <w:p>
-      <w:pPr>
-        <w:pStyle w:val="a3"/>
-        <w:rPr>
-          <w:lang w:val="en-US"/>
-        </w:rPr>
-      </w:pPr>
-      <w:r>
-        <w:t>Number equations consecutively. Equation numbers, within parentheses, are to position flush right, as in (1), using a right tab stop. To make your equations more compact, you may use the solidus ( / ), the exp function, or appropriate exponents. Italicize Roman symbols for quantities and variables, but not Greek symbols. Use a long dash rather than a hyphen for a minus sign. Punctuate equations with commas or periods when they are part of a sentence, as in</w:t>
-      </w:r>
-      <w:r>
-        <w:rPr>
-          <w:lang w:val="en-US"/>
-        </w:rPr>
-        <w:t>:</w:t>
-      </w:r>
-    </w:p>
-    <w:p>
-      <w:pPr>
-        <w:pStyle w:val="equation"/>
+          <w:lang w:val="en-US" w:eastAsia="zh-CN"/>
+        </w:rPr>
+        <w:t>Routing within Trees:</w:t>
+      </w:r>
+      <w:r>
         <w:rPr>
           <w:rFonts w:hint="eastAsia"/>
-        </w:rPr>
-      </w:pPr>
-      <w:r>
-        <w:tab/>
-      </w:r>
-      <w:r>
-        <w:rPr>
-          <w:rFonts w:ascii="Times New Roman" w:hAnsi="Times New Roman" w:cs="Times New Roman"/>
-          <w:i/>
-        </w:rPr>
-        <w:t>a</w:t>
-      </w:r>
-      <w:r>
-        <w:t></w:t>
-      </w:r>
-      <w:r>
-        <w:t></w:t>
-      </w:r>
-      <w:r>
-        <w:t></w:t>
-      </w:r>
-      <w:r>
-        <w:rPr>
-          <w:rFonts w:ascii="Times New Roman" w:hAnsi="Times New Roman" w:cs="Times New Roman"/>
-          <w:i/>
-        </w:rPr>
-        <w:t>b</w:t>
-      </w:r>
-      <w:r>
-        <w:t></w:t>
-      </w:r>
-      <w:r>
-        <w:t></w:t>
-      </w:r>
-      <w:r>
-        <w:t></w:t>
-      </w:r>
-      <w:r>
-        <w:t></w:t>
-      </w:r>
-      <w:r>
-        <w:t></w:t>
-      </w:r>
-      <w:r>
-        <w:tab/>
-      </w:r>
-      <w:r>
-        <w:t></w:t>
-      </w:r>
-      <w:r>
-        <w:t></w:t>
-      </w:r>
-      <w:r>
-        <w:t></w:t>
-      </w:r>
-    </w:p>
-    <w:p>
-      <w:pPr>
-        <w:pStyle w:val="a3"/>
-      </w:pPr>
-      <w:r>
-        <w:t>Note that the equation is centered using a center tab stop. Be sure that the symbols in your equation have been defined before or immediately following the equation. Use “(1)”, not “Eq. (1)” or “equation (1)”, except at the beginning of a sentence: “Equation (1) is . . .”</w:t>
-      </w:r>
-    </w:p>
-    <w:p>
-      <w:pPr>
-        <w:pStyle w:val="2"/>
-      </w:pPr>
-      <w:r>
-        <w:t>Some Common Mistakes</w:t>
-      </w:r>
-    </w:p>
-    <w:p>
-      <w:pPr>
-        <w:pStyle w:val="bulletlist"/>
-      </w:pPr>
-      <w:r>
-        <w:t>The word “data” is plural, not singular.</w:t>
-      </w:r>
-    </w:p>
-    <w:p>
-      <w:pPr>
-        <w:pStyle w:val="bulletlist"/>
-      </w:pPr>
-      <w:r>
-        <w:t xml:space="preserve">The subscript for the permeability of vacuum </w:t>
-      </w:r>
-      <w:r>
-        <w:rPr>
-          <w:rFonts w:ascii="Symbol" w:hAnsi="Symbol" w:cs="Symbol"/>
           <w:i/>
           <w:iCs/>
-          <w:snapToGrid w:val="0"/>
-        </w:rPr>
-        <w:t></w:t>
-      </w:r>
-      <w:r>
-        <w:rPr>
-          <w:vertAlign w:val="subscript"/>
-        </w:rPr>
-        <w:t>0</w:t>
-      </w:r>
-      <w:r>
-        <w:t>, and other common scientific constants, is zero with subscript formatting, not a lowercase letter “o”.</w:t>
-      </w:r>
-    </w:p>
-    <w:p>
-      <w:pPr>
-        <w:pStyle w:val="bulletlist"/>
-      </w:pPr>
-      <w:r>
-        <w:t xml:space="preserve">In American </w:t>
-      </w:r>
-      <w:r>
-        <w:t>English, commas, semi</w:t>
-      </w:r>
-      <w:r>
-        <w:t>colons, periods, question and exclamation marks are located within quotation marks only when a complete thought or name is cited, such as a title or full quotation. When quotation marks are used, instead of a bold or italic typeface, to highlight a word or phrase, punctuation should appear outside of the quotation marks. A parenthetical phrase or statement at the end of a sentence is punctuated outside of the closing parenthesis (like this). (A parenthetical sentence is punctuated within the parentheses.)</w:t>
-      </w:r>
-    </w:p>
-    <w:p>
-      <w:pPr>
-        <w:pStyle w:val="bulletlist"/>
-      </w:pPr>
-      <w:r>
-        <w:t>A graph within a graph is an “inset”, not an “insert”. The word alternatively is preferred to the word “alternately” (unless you really mean something that alternates).</w:t>
-      </w:r>
-    </w:p>
-    <w:p>
-      <w:pPr>
-        <w:pStyle w:val="bulletlist"/>
-      </w:pPr>
-      <w:r>
-        <w:t>Do not use the word “essentially” to mean “approximately” or “effectively”.</w:t>
-      </w:r>
-    </w:p>
-    <w:p>
-      <w:pPr>
-        <w:pStyle w:val="bulletlist"/>
-      </w:pPr>
-      <w:r>
-        <w:t>In your paper title, if the words “that uses” can accurately replace the word “using”, capitalize the “u”; if not, keep using lower-cased.</w:t>
-      </w:r>
-    </w:p>
-    <w:p>
-      <w:pPr>
-        <w:pStyle w:val="bulletlist"/>
-      </w:pPr>
-      <w:r>
+          <w:lang w:val="en-US" w:eastAsia="zh-CN"/>
+        </w:rPr>
+        <w:t xml:space="preserve"> </w:t>
+      </w:r>
+      <w:r>
+        <w:rPr>
+          <w:rFonts w:hint="eastAsia"/>
+          <w:lang w:val="en-US" w:eastAsia="zh-CN"/>
+        </w:rPr>
+        <w:t>W</w:t>
+      </w:r>
+      <w:r>
+        <w:rPr>
+          <w:lang w:val="en-US" w:eastAsia="zh-CN"/>
+        </w:rPr>
+        <w:t xml:space="preserve">ithin the local tree, routing is determined by the spatial relation between the destination region and the region represented by each router. Let </w:t>
+      </w:r>
+      <m:oMath>
+        <m:sSub>
+          <m:sSubPr>
+            <m:ctrlPr>
+              <w:rPr>
+                <w:rFonts w:ascii="Cambria Math" w:hAnsi="Cambria Math"/>
+                <w:lang w:val="en-US" w:eastAsia="zh-CN"/>
+              </w:rPr>
+            </m:ctrlPr>
+          </m:sSubPr>
+          <m:e>
+            <m:r>
+              <w:rPr>
+                <w:rFonts w:ascii="Cambria Math" w:hAnsi="Cambria Math"/>
+                <w:lang w:val="en-US" w:eastAsia="zh-CN"/>
+              </w:rPr>
+              <m:t>R</m:t>
+            </m:r>
+          </m:e>
+          <m:sub>
+            <m:r>
+              <w:rPr>
+                <w:rFonts w:ascii="Cambria Math" w:hAnsi="Cambria Math"/>
+                <w:lang w:val="en-US" w:eastAsia="zh-CN"/>
+              </w:rPr>
+              <m:t>v</m:t>
+            </m:r>
+          </m:sub>
+        </m:sSub>
+      </m:oMath>
+      <w:r>
+        <w:rPr>
+          <w:rFonts w:hint="eastAsia"/>
+          <w:lang w:val="en-US" w:eastAsia="zh-CN"/>
+        </w:rPr>
+        <w:t xml:space="preserve"> </w:t>
+      </w:r>
+      <w:r>
+        <w:rPr>
+          <w:lang w:val="en-US" w:eastAsia="zh-CN"/>
+        </w:rPr>
+        <w:t xml:space="preserve">denote the region covered by the current router </w:t>
+      </w:r>
+      <m:oMath>
+        <m:r>
+          <w:rPr>
+            <w:rFonts w:ascii="Cambria Math" w:hAnsi="Cambria Math"/>
+            <w:lang w:val="en-US" w:eastAsia="zh-CN"/>
+          </w:rPr>
+          <m:t>v</m:t>
+        </m:r>
+      </m:oMath>
+      <w:r>
+        <w:rPr>
+          <w:lang w:val="en-US" w:eastAsia="zh-CN"/>
+        </w:rPr>
+        <w:t xml:space="preserve">, and </w:t>
+      </w:r>
+      <m:oMath>
+        <m:sSubSup>
+          <m:sSubSupPr>
+            <m:ctrlPr>
+              <w:rPr>
+                <w:rFonts w:ascii="Cambria Math" w:hAnsi="Cambria Math"/>
+                <w:lang w:val="en-US" w:eastAsia="zh-CN"/>
+              </w:rPr>
+            </m:ctrlPr>
+          </m:sSubSupPr>
+          <m:e>
+            <m:r>
+              <w:rPr>
+                <w:rFonts w:ascii="Cambria Math" w:hAnsi="Cambria Math"/>
+                <w:lang w:val="en-US" w:eastAsia="zh-CN"/>
+              </w:rPr>
+              <m:t>R</m:t>
+            </m:r>
+          </m:e>
+          <m:sub>
+            <m:r>
+              <w:rPr>
+                <w:rFonts w:ascii="Cambria Math" w:hAnsi="Cambria Math"/>
+                <w:lang w:val="en-US" w:eastAsia="zh-CN"/>
+              </w:rPr>
+              <m:t>v</m:t>
+            </m:r>
+          </m:sub>
+          <m:sup>
+            <m:r>
+              <w:rPr>
+                <w:rFonts w:ascii="Cambria Math" w:hAnsi="Cambria Math"/>
+                <w:lang w:val="en-US" w:eastAsia="zh-CN"/>
+              </w:rPr>
+              <m:t>i</m:t>
+            </m:r>
+          </m:sup>
+        </m:sSubSup>
+      </m:oMath>
+      <w:r>
+        <w:rPr>
+          <w:rFonts w:hint="eastAsia"/>
+          <w:lang w:val="en-US" w:eastAsia="zh-CN"/>
+        </w:rPr>
+        <w:t xml:space="preserve"> </w:t>
+      </w:r>
+      <w:r>
+        <w:rPr>
+          <w:lang w:val="en-US" w:eastAsia="zh-CN"/>
+        </w:rPr>
+        <w:t xml:space="preserve">the region associated with its </w:t>
+      </w:r>
+      <m:oMath>
+        <m:r>
+          <w:rPr>
+            <w:rFonts w:ascii="Cambria Math" w:hAnsi="Cambria Math"/>
+            <w:lang w:val="en-US" w:eastAsia="zh-CN"/>
+          </w:rPr>
+          <m:t>i</m:t>
+        </m:r>
+      </m:oMath>
+      <w:r>
+        <w:rPr>
+          <w:lang w:val="en-US" w:eastAsia="zh-CN"/>
+        </w:rPr>
+        <w:t xml:space="preserve">-th child. A child direction </w:t>
+      </w:r>
+      <m:oMath>
+        <m:r>
+          <w:rPr>
+            <w:rFonts w:ascii="Cambria Math" w:hAnsi="Cambria Math"/>
+            <w:lang w:val="en-US" w:eastAsia="zh-CN"/>
+          </w:rPr>
+          <m:t>i</m:t>
+        </m:r>
+      </m:oMath>
+      <w:r>
+        <w:rPr>
+          <w:rFonts w:hint="eastAsia"/>
+          <w:lang w:val="en-US" w:eastAsia="zh-CN"/>
+        </w:rPr>
+        <w:t xml:space="preserve"> </w:t>
+      </w:r>
+      <w:r>
+        <w:rPr>
+          <w:lang w:val="en-US" w:eastAsia="zh-CN"/>
+        </w:rPr>
+        <w:t xml:space="preserve">is activated whenever the destination region overlaps that child region, i.e., </w:t>
+      </w:r>
+      <m:oMath>
+        <m:sSub>
+          <m:sSubPr>
+            <m:ctrlPr>
+              <w:rPr>
+                <w:rFonts w:ascii="Cambria Math" w:hAnsi="Cambria Math"/>
+                <w:lang w:val="en-US" w:eastAsia="zh-CN"/>
+              </w:rPr>
+            </m:ctrlPr>
+          </m:sSubPr>
+          <m:e>
+            <m:r>
+              <w:rPr>
+                <w:rFonts w:ascii="Cambria Math" w:hAnsi="Cambria Math"/>
+                <w:lang w:val="en-US" w:eastAsia="zh-CN"/>
+              </w:rPr>
+              <m:t>R</m:t>
+            </m:r>
+          </m:e>
+          <m:sub>
+            <m:r>
+              <w:rPr>
+                <w:rFonts w:ascii="Cambria Math" w:hAnsi="Cambria Math"/>
+                <w:lang w:val="en-US" w:eastAsia="zh-CN"/>
+              </w:rPr>
+              <m:t>d</m:t>
+            </m:r>
+          </m:sub>
+        </m:sSub>
+        <m:r>
+          <w:rPr>
+            <w:rFonts w:ascii="Cambria Math" w:hAnsi="Cambria Math"/>
+            <w:lang w:val="en-US" w:eastAsia="zh-CN"/>
+          </w:rPr>
+          <m:t>∩</m:t>
+        </m:r>
+        <m:sSubSup>
+          <m:sSubSupPr>
+            <m:ctrlPr>
+              <w:rPr>
+                <w:rFonts w:ascii="Cambria Math" w:hAnsi="Cambria Math"/>
+                <w:lang w:val="en-US" w:eastAsia="zh-CN"/>
+              </w:rPr>
+            </m:ctrlPr>
+          </m:sSubSupPr>
+          <m:e>
+            <m:r>
+              <w:rPr>
+                <w:rFonts w:ascii="Cambria Math" w:hAnsi="Cambria Math"/>
+                <w:lang w:val="en-US" w:eastAsia="zh-CN"/>
+              </w:rPr>
+              <m:t>R</m:t>
+            </m:r>
+          </m:e>
+          <m:sub>
+            <m:r>
+              <w:rPr>
+                <w:rFonts w:ascii="Cambria Math" w:hAnsi="Cambria Math"/>
+                <w:lang w:val="en-US" w:eastAsia="zh-CN"/>
+              </w:rPr>
+              <m:t>v</m:t>
+            </m:r>
+          </m:sub>
+          <m:sup>
+            <m:r>
+              <w:rPr>
+                <w:rFonts w:ascii="Cambria Math" w:hAnsi="Cambria Math"/>
+                <w:lang w:val="en-US" w:eastAsia="zh-CN"/>
+              </w:rPr>
+              <m:t>i</m:t>
+            </m:r>
+          </m:sup>
+        </m:sSubSup>
+        <m:r>
+          <w:rPr>
+            <w:rFonts w:ascii="Cambria Math" w:hAnsi="Cambria Math"/>
+            <w:lang w:val="en-US" w:eastAsia="zh-CN"/>
+          </w:rPr>
+          <m:t>≠∅</m:t>
+        </m:r>
+      </m:oMath>
+      <w:r>
+        <w:rPr>
+          <w:lang w:val="en-US" w:eastAsia="zh-CN"/>
+        </w:rPr>
+        <w:t xml:space="preserve">. Meanwhile, the parent direction is activated only when </w:t>
+      </w:r>
+      <m:oMath>
+        <m:sSub>
+          <m:sSubPr>
+            <m:ctrlPr>
+              <w:rPr>
+                <w:rFonts w:ascii="Cambria Math" w:hAnsi="Cambria Math"/>
+                <w:lang w:val="en-US" w:eastAsia="zh-CN"/>
+              </w:rPr>
+            </m:ctrlPr>
+          </m:sSubPr>
+          <m:e>
+            <m:r>
+              <w:rPr>
+                <w:rFonts w:ascii="Cambria Math" w:hAnsi="Cambria Math"/>
+                <w:lang w:val="en-US" w:eastAsia="zh-CN"/>
+              </w:rPr>
+              <m:t>R</m:t>
+            </m:r>
+          </m:e>
+          <m:sub>
+            <m:r>
+              <w:rPr>
+                <w:rFonts w:ascii="Cambria Math" w:hAnsi="Cambria Math"/>
+                <w:lang w:val="en-US" w:eastAsia="zh-CN"/>
+              </w:rPr>
+              <m:t>d</m:t>
+            </m:r>
+          </m:sub>
+        </m:sSub>
+      </m:oMath>
+      <w:r>
+        <w:rPr>
+          <w:rFonts w:hint="eastAsia"/>
+          <w:lang w:val="en-US" w:eastAsia="zh-CN"/>
+        </w:rPr>
+        <w:t xml:space="preserve"> </w:t>
+      </w:r>
+      <w:r>
+        <w:rPr>
+          <w:lang w:val="en-US" w:eastAsia="zh-CN"/>
+        </w:rPr>
+        <w:t xml:space="preserve">is not fully contained in </w:t>
+      </w:r>
+      <m:oMath>
+        <m:sSub>
+          <m:sSubPr>
+            <m:ctrlPr>
+              <w:rPr>
+                <w:rFonts w:ascii="Cambria Math" w:hAnsi="Cambria Math"/>
+                <w:lang w:val="en-US" w:eastAsia="zh-CN"/>
+              </w:rPr>
+            </m:ctrlPr>
+          </m:sSubPr>
+          <m:e>
+            <m:r>
+              <w:rPr>
+                <w:rFonts w:ascii="Cambria Math" w:hAnsi="Cambria Math"/>
+                <w:lang w:val="en-US" w:eastAsia="zh-CN"/>
+              </w:rPr>
+              <m:t>R</m:t>
+            </m:r>
+          </m:e>
+          <m:sub>
+            <m:r>
+              <w:rPr>
+                <w:rFonts w:ascii="Cambria Math" w:hAnsi="Cambria Math"/>
+                <w:lang w:val="en-US" w:eastAsia="zh-CN"/>
+              </w:rPr>
+              <m:t>v</m:t>
+            </m:r>
+          </m:sub>
+        </m:sSub>
+      </m:oMath>
+      <w:r>
+        <w:rPr>
+          <w:lang w:val="en-US" w:eastAsia="zh-CN"/>
+        </w:rPr>
+        <w:t>, allowing the packet to continue upward until reaching the smallest hierarchy level that covers all destinations. The ingress direction is excluded from the output mask to avoid immediate backtracking. This rule is recursively applied across the three tree levels: L1 resolves destinations at PE</w:t>
+      </w:r>
+      <w:r>
+        <w:rPr>
+          <w:rFonts w:hint="eastAsia"/>
+          <w:lang w:val="en-US" w:eastAsia="zh-CN"/>
+        </w:rPr>
+        <w:t xml:space="preserve"> level</w:t>
+      </w:r>
+      <w:r>
+        <w:rPr>
+          <w:lang w:val="en-US" w:eastAsia="zh-CN"/>
+        </w:rPr>
+        <w:t>, whereas L2 and L3 operate on progressively larger spatial subregions.</w:t>
+      </w:r>
+    </w:p>
+    <w:p>
+      <w:pPr>
+        <w:pStyle w:val="a3"/>
+        <w:tabs>
+          <w:tab w:val="clear" w:pos="14.40pt"/>
+        </w:tabs>
+        <w:ind w:firstLine="0pt"/>
+        <w:rPr>
+          <w:i/>
+          <w:iCs/>
+          <w:lang w:val="en-US" w:eastAsia="zh-CN"/>
+        </w:rPr>
+      </w:pPr>
+      <w:r>
+        <w:rPr>
+          <w:i/>
+          <w:iCs/>
+          <w:noProof/>
+          <w:lang w:val="en-US" w:eastAsia="zh-CN"/>
+        </w:rPr>
+        <w:drawing>
+          <wp:inline distT="0" distB="0" distL="0" distR="0" wp14:anchorId="4201ADE8" wp14:editId="09C9FF1E">
+            <wp:extent cx="3089910" cy="2132330"/>
+            <wp:effectExtent l="0" t="0" r="0" b="1270"/>
+            <wp:docPr id="225684018" name="图形 6"/>
+            <wp:cNvGraphicFramePr>
+              <a:graphicFrameLocks xmlns:a="http://purl.oclc.org/ooxml/drawingml/main" noChangeAspect="1"/>
+            </wp:cNvGraphicFramePr>
+            <a:graphic xmlns:a="http://purl.oclc.org/ooxml/drawingml/main">
+              <a:graphicData uri="http://purl.oclc.org/ooxml/drawingml/picture">
+                <pic:pic xmlns:pic="http://purl.oclc.org/ooxml/drawingml/picture">
+                  <pic:nvPicPr>
+                    <pic:cNvPr id="225684018" name="图形 225684018"/>
+                    <pic:cNvPicPr/>
+                  </pic:nvPicPr>
+                  <pic:blipFill>
+                    <a:blip r:embed="rId11">
+                      <a:extLst>
+                        <a:ext uri="{96DAC541-7B7A-43D3-8B79-37D633B846F1}">
+                          <asvg:svgBlip xmlns:asvg="http://schemas.microsoft.com/office/drawing/2016/SVG/main" r:embed="rId12"/>
+                        </a:ext>
+                      </a:extLst>
+                    </a:blip>
+                    <a:stretch>
+                      <a:fillRect/>
+                    </a:stretch>
+                  </pic:blipFill>
+                  <pic:spPr>
+                    <a:xfrm>
+                      <a:off x="0" y="0"/>
+                      <a:ext cx="3089910" cy="2132330"/>
+                    </a:xfrm>
+                    <a:prstGeom prst="rect">
+                      <a:avLst/>
+                    </a:prstGeom>
+                  </pic:spPr>
+                </pic:pic>
+              </a:graphicData>
+            </a:graphic>
+          </wp:inline>
+        </w:drawing>
+      </w:r>
+    </w:p>
+    <w:p>
+      <w:pPr>
+        <w:pStyle w:val="a3"/>
+        <w:keepNext/>
+        <w:ind w:firstLine="0pt"/>
+      </w:pPr>
+      <w:r>
+        <w:rPr>
+          <w:noProof/>
+        </w:rPr>
+        <w:drawing>
+          <wp:inline distT="0" distB="0" distL="0" distR="0" wp14:anchorId="34333B7C" wp14:editId="0BB936EB">
+            <wp:extent cx="3089910" cy="2013585"/>
+            <wp:effectExtent l="0" t="0" r="0" b="5715"/>
+            <wp:docPr id="1136540781" name="图形 1"/>
+            <wp:cNvGraphicFramePr>
+              <a:graphicFrameLocks xmlns:a="http://purl.oclc.org/ooxml/drawingml/main" noChangeAspect="1"/>
+            </wp:cNvGraphicFramePr>
+            <a:graphic xmlns:a="http://purl.oclc.org/ooxml/drawingml/main">
+              <a:graphicData uri="http://purl.oclc.org/ooxml/drawingml/picture">
+                <pic:pic xmlns:pic="http://purl.oclc.org/ooxml/drawingml/picture">
+                  <pic:nvPicPr>
+                    <pic:cNvPr id="1136540781" name=""/>
+                    <pic:cNvPicPr/>
+                  </pic:nvPicPr>
+                  <pic:blipFill>
+                    <a:blip r:embed="rId13">
+                      <a:extLst>
+                        <a:ext uri="{96DAC541-7B7A-43D3-8B79-37D633B846F1}">
+                          <asvg:svgBlip xmlns:asvg="http://schemas.microsoft.com/office/drawing/2016/SVG/main" r:embed="rId14"/>
+                        </a:ext>
+                      </a:extLst>
+                    </a:blip>
+                    <a:stretch>
+                      <a:fillRect/>
+                    </a:stretch>
+                  </pic:blipFill>
+                  <pic:spPr>
+                    <a:xfrm>
+                      <a:off x="0" y="0"/>
+                      <a:ext cx="3089910" cy="2013585"/>
+                    </a:xfrm>
+                    <a:prstGeom prst="rect">
+                      <a:avLst/>
+                    </a:prstGeom>
+                  </pic:spPr>
+                </pic:pic>
+              </a:graphicData>
+            </a:graphic>
+          </wp:inline>
+        </w:drawing>
+      </w:r>
+    </w:p>
+    <w:p>
+      <w:pPr>
+        <w:pStyle w:val="af0"/>
+        <w:jc w:val="both"/>
+        <w:rPr>
+          <w:rFonts w:ascii="Times New Roman" w:hAnsi="Times New Roman" w:cs="Times New Roman"/>
+          <w:sz w:val="16"/>
+          <w:szCs w:val="16"/>
+          <w:lang w:eastAsia="zh-CN"/>
+        </w:rPr>
+      </w:pPr>
+      <w:r>
+        <w:rPr>
+          <w:rFonts w:ascii="Times New Roman" w:hAnsi="Times New Roman" w:cs="Times New Roman"/>
+          <w:sz w:val="16"/>
+          <w:szCs w:val="16"/>
+        </w:rPr>
+        <w:t>Fig.</w:t>
+      </w:r>
+      <w:r>
+        <w:rPr>
+          <w:rFonts w:ascii="Times New Roman" w:hAnsi="Times New Roman" w:cs="Times New Roman" w:hint="eastAsia"/>
+          <w:sz w:val="16"/>
+          <w:szCs w:val="16"/>
+          <w:lang w:eastAsia="zh-CN"/>
+        </w:rPr>
+        <w:t xml:space="preserve"> 2</w:t>
+      </w:r>
+      <w:r>
+        <w:rPr>
+          <w:rFonts w:ascii="Times New Roman" w:hAnsi="Times New Roman" w:cs="Times New Roman"/>
+          <w:sz w:val="16"/>
+          <w:szCs w:val="16"/>
+        </w:rPr>
+        <w:t>.</w:t>
+      </w:r>
+      <w:r>
+        <w:rPr>
+          <w:rFonts w:ascii="Times New Roman" w:hAnsi="Times New Roman" w:cs="Times New Roman" w:hint="eastAsia"/>
+          <w:sz w:val="16"/>
+          <w:szCs w:val="16"/>
+          <w:lang w:eastAsia="zh-CN"/>
+        </w:rPr>
+        <w:t xml:space="preserve"> </w:t>
+      </w:r>
+      <w:r>
+        <w:rPr>
+          <w:rFonts w:ascii="Times New Roman" w:hAnsi="Times New Roman" w:cs="Times New Roman"/>
+          <w:b/>
+          <w:bCs/>
+          <w:sz w:val="16"/>
+          <w:szCs w:val="16"/>
+          <w:lang w:eastAsia="zh-CN"/>
+        </w:rPr>
+        <w:t>Representative cases of recursive region-based multicast routing in the local tree</w:t>
+      </w:r>
+      <w:r>
+        <w:rPr>
+          <w:rFonts w:ascii="Times New Roman" w:hAnsi="Times New Roman" w:cs="Times New Roman"/>
+          <w:sz w:val="16"/>
+          <w:szCs w:val="16"/>
+          <w:lang w:eastAsia="zh-CN"/>
+        </w:rPr>
+        <w:t>.</w:t>
+      </w:r>
+      <w:r>
+        <w:rPr>
+          <w:rFonts w:ascii="Times New Roman" w:eastAsia="宋体" w:hAnsi="Times New Roman" w:cs="Times New Roman"/>
+        </w:rPr>
+        <w:t xml:space="preserve"> </w:t>
+      </w:r>
+      <w:r>
+        <w:rPr>
+          <w:rFonts w:ascii="Times New Roman" w:hAnsi="Times New Roman" w:cs="Times New Roman"/>
+          <w:sz w:val="16"/>
+          <w:szCs w:val="16"/>
+          <w:lang w:eastAsia="zh-CN"/>
+        </w:rPr>
+        <w:t>(a) single-child delivery; (b) simultaneous local and upward forwarding; (c) multi-child replication; and (d) parent-only forwarding.</w:t>
+      </w:r>
+    </w:p>
+    <w:p>
+      <w:pPr>
+        <w:rPr>
+          <w:rFonts w:hint="eastAsia"/>
+          <w:lang w:eastAsia="zh-CN"/>
+        </w:rPr>
+      </w:pPr>
+    </w:p>
+    <w:p>
+      <w:pPr>
+        <w:jc w:val="both"/>
+        <w:rPr>
+          <w:lang w:eastAsia="zh-CN"/>
+        </w:rPr>
+      </w:pPr>
+      <w:r>
+        <w:rPr>
+          <w:rFonts w:hint="eastAsia"/>
+          <w:i/>
+          <w:iCs/>
+          <w:lang w:eastAsia="zh-CN"/>
+        </w:rPr>
+        <w:t xml:space="preserve">Routing within </w:t>
+      </w:r>
+      <w:r>
+        <w:rPr>
+          <w:rFonts w:hint="eastAsia"/>
+          <w:i/>
+          <w:iCs/>
+          <w:lang w:eastAsia="zh-CN"/>
+        </w:rPr>
+        <w:t>Mesh</w:t>
+      </w:r>
+      <w:r>
+        <w:rPr>
+          <w:rFonts w:hint="eastAsia"/>
+          <w:i/>
+          <w:iCs/>
+          <w:lang w:eastAsia="zh-CN"/>
+        </w:rPr>
+        <w:t>:</w:t>
+      </w:r>
+      <w:r>
+        <w:rPr>
+          <w:rFonts w:hint="eastAsia"/>
+          <w:i/>
+          <w:iCs/>
+          <w:lang w:eastAsia="zh-CN"/>
+        </w:rPr>
+        <w:t xml:space="preserve"> </w:t>
+      </w:r>
+      <w:r>
+        <w:rPr>
+          <w:lang w:eastAsia="zh-CN"/>
+        </w:rPr>
+        <w:t>For inter-tile communication, the destination rectangle is projected onto the upper-mesh coordinate space. Let</w:t>
+      </w:r>
+      <w:r>
+        <w:rPr>
+          <w:rFonts w:hint="eastAsia"/>
+          <w:lang w:eastAsia="zh-CN"/>
+        </w:rPr>
+        <w:t xml:space="preserve"> </w:t>
+      </w:r>
+      <m:oMath>
+        <m:sSub>
+          <m:sSubPr>
+            <m:ctrlPr>
+              <w:rPr>
+                <w:rFonts w:ascii="Cambria Math" w:hAnsi="Cambria Math"/>
+              </w:rPr>
+            </m:ctrlPr>
+          </m:sSubPr>
+          <m:e>
+            <m:r>
+              <w:rPr>
+                <w:rFonts w:ascii="Cambria Math" w:hAnsi="Cambria Math"/>
+              </w:rPr>
+              <m:t>R</m:t>
+            </m:r>
+          </m:e>
+          <m:sub>
+            <m:r>
+              <w:rPr>
+                <w:rFonts w:ascii="Cambria Math" w:hAnsi="Cambria Math"/>
+              </w:rPr>
+              <m:t>m</m:t>
+            </m:r>
+          </m:sub>
+        </m:sSub>
+        <m:r>
+          <w:rPr>
+            <w:rFonts w:ascii="Cambria Math" w:hAnsi="Cambria Math"/>
+          </w:rPr>
+          <m:t>=</m:t>
+        </m:r>
+        <m:d>
+          <m:dPr>
+            <m:begChr m:val="["/>
+            <m:endChr m:val="]"/>
+            <m:ctrlPr>
+              <w:rPr>
+                <w:rFonts w:ascii="Cambria Math" w:hAnsi="Cambria Math"/>
+              </w:rPr>
+            </m:ctrlPr>
+          </m:dPr>
+          <m:e>
+            <m:sSub>
+              <m:sSubPr>
+                <m:ctrlPr>
+                  <w:rPr>
+                    <w:rFonts w:ascii="Cambria Math" w:hAnsi="Cambria Math"/>
+                  </w:rPr>
+                </m:ctrlPr>
+              </m:sSubPr>
+              <m:e>
+                <m:r>
+                  <w:rPr>
+                    <w:rFonts w:ascii="Cambria Math" w:hAnsi="Cambria Math"/>
+                  </w:rPr>
+                  <m:t>x</m:t>
+                </m:r>
+              </m:e>
+              <m:sub>
+                <m:r>
+                  <w:rPr>
+                    <w:rFonts w:ascii="Cambria Math" w:hAnsi="Cambria Math"/>
+                  </w:rPr>
+                  <m:t>L</m:t>
+                </m:r>
+              </m:sub>
+            </m:sSub>
+            <m:r>
+              <w:rPr>
+                <w:rFonts w:ascii="Cambria Math" w:hAnsi="Cambria Math"/>
+              </w:rPr>
+              <m:t>, </m:t>
+            </m:r>
+            <m:sSub>
+              <m:sSubPr>
+                <m:ctrlPr>
+                  <w:rPr>
+                    <w:rFonts w:ascii="Cambria Math" w:hAnsi="Cambria Math"/>
+                  </w:rPr>
+                </m:ctrlPr>
+              </m:sSubPr>
+              <m:e>
+                <m:r>
+                  <w:rPr>
+                    <w:rFonts w:ascii="Cambria Math" w:hAnsi="Cambria Math"/>
+                  </w:rPr>
+                  <m:t>x</m:t>
+                </m:r>
+              </m:e>
+              <m:sub>
+                <m:r>
+                  <w:rPr>
+                    <w:rFonts w:ascii="Cambria Math" w:hAnsi="Cambria Math"/>
+                  </w:rPr>
+                  <m:t>H</m:t>
+                </m:r>
+              </m:sub>
+            </m:sSub>
+          </m:e>
+        </m:d>
+        <m:r>
+          <w:rPr>
+            <w:rFonts w:ascii="Cambria Math" w:hAnsi="Cambria Math"/>
+          </w:rPr>
+          <m:t>×</m:t>
+        </m:r>
+        <m:d>
+          <m:dPr>
+            <m:begChr m:val="["/>
+            <m:endChr m:val="]"/>
+            <m:ctrlPr>
+              <w:rPr>
+                <w:rFonts w:ascii="Cambria Math" w:hAnsi="Cambria Math"/>
+              </w:rPr>
+            </m:ctrlPr>
+          </m:dPr>
+          <m:e>
+            <m:sSub>
+              <m:sSubPr>
+                <m:ctrlPr>
+                  <w:rPr>
+                    <w:rFonts w:ascii="Cambria Math" w:hAnsi="Cambria Math"/>
+                  </w:rPr>
+                </m:ctrlPr>
+              </m:sSubPr>
+              <m:e>
+                <m:r>
+                  <w:rPr>
+                    <w:rFonts w:ascii="Cambria Math" w:hAnsi="Cambria Math"/>
+                  </w:rPr>
+                  <m:t>y</m:t>
+                </m:r>
+              </m:e>
+              <m:sub>
+                <m:r>
+                  <w:rPr>
+                    <w:rFonts w:ascii="Cambria Math" w:hAnsi="Cambria Math"/>
+                  </w:rPr>
+                  <m:t>L</m:t>
+                </m:r>
+              </m:sub>
+            </m:sSub>
+            <m:r>
+              <w:rPr>
+                <w:rFonts w:ascii="Cambria Math" w:hAnsi="Cambria Math"/>
+              </w:rPr>
+              <m:t>, </m:t>
+            </m:r>
+            <m:sSub>
+              <m:sSubPr>
+                <m:ctrlPr>
+                  <w:rPr>
+                    <w:rFonts w:ascii="Cambria Math" w:hAnsi="Cambria Math"/>
+                  </w:rPr>
+                </m:ctrlPr>
+              </m:sSubPr>
+              <m:e>
+                <m:r>
+                  <w:rPr>
+                    <w:rFonts w:ascii="Cambria Math" w:hAnsi="Cambria Math"/>
+                  </w:rPr>
+                  <m:t>y</m:t>
+                </m:r>
+              </m:e>
+              <m:sub>
+                <m:r>
+                  <w:rPr>
+                    <w:rFonts w:ascii="Cambria Math" w:hAnsi="Cambria Math"/>
+                  </w:rPr>
+                  <m:t>H</m:t>
+                </m:r>
+              </m:sub>
+            </m:sSub>
+          </m:e>
+        </m:d>
+      </m:oMath>
+      <w:r>
+        <w:rPr>
+          <w:lang w:eastAsia="zh-CN"/>
+        </w:rPr>
+        <w:t xml:space="preserve">where </w:t>
+      </w:r>
+      <m:oMath>
+        <m:sSub>
+          <m:sSubPr>
+            <m:ctrlPr>
+              <w:rPr>
+                <w:rFonts w:ascii="Cambria Math" w:hAnsi="Cambria Math"/>
+                <w:lang w:eastAsia="zh-CN"/>
+              </w:rPr>
+            </m:ctrlPr>
+          </m:sSubPr>
+          <m:e>
+            <m:r>
+              <w:rPr>
+                <w:rFonts w:ascii="Cambria Math" w:hAnsi="Cambria Math"/>
+                <w:lang w:eastAsia="zh-CN"/>
+              </w:rPr>
+              <m:t>x</m:t>
+            </m:r>
+          </m:e>
+          <m:sub>
+            <m:r>
+              <w:rPr>
+                <w:rFonts w:ascii="Cambria Math" w:hAnsi="Cambria Math"/>
+                <w:lang w:eastAsia="zh-CN"/>
+              </w:rPr>
+              <m:t>L</m:t>
+            </m:r>
+          </m:sub>
+        </m:sSub>
+        <m:r>
+          <w:rPr>
+            <w:rFonts w:ascii="Cambria Math" w:hAnsi="Cambria Math"/>
+            <w:lang w:eastAsia="zh-CN"/>
+          </w:rPr>
+          <m:t>=</m:t>
+        </m:r>
+        <m:d>
+          <m:dPr>
+            <m:begChr m:val="⌊"/>
+            <m:endChr m:val="⌋"/>
+            <m:ctrlPr>
+              <w:rPr>
+                <w:rFonts w:ascii="Cambria Math" w:hAnsi="Cambria Math"/>
+                <w:lang w:eastAsia="zh-CN"/>
+              </w:rPr>
+            </m:ctrlPr>
+          </m:dPr>
+          <m:e>
+            <m:r>
+              <m:rPr>
+                <m:sty m:val="p"/>
+              </m:rPr>
+              <w:rPr>
+                <w:rFonts w:ascii="Cambria Math" w:hAnsi="Cambria Math"/>
+                <w:lang w:eastAsia="zh-CN"/>
+              </w:rPr>
+              <m:t>min</m:t>
+            </m:r>
+            <m:r>
+              <w:rPr>
+                <w:rFonts w:ascii="Cambria Math" w:hAnsi="Cambria Math"/>
+                <w:lang w:eastAsia="zh-CN"/>
+              </w:rPr>
+              <m:t>⁡</m:t>
+            </m:r>
+            <m:d>
+              <m:dPr>
+                <m:sepChr m:val=","/>
+                <m:ctrlPr>
+                  <w:rPr>
+                    <w:rFonts w:ascii="Cambria Math" w:hAnsi="Cambria Math"/>
+                    <w:lang w:eastAsia="zh-CN"/>
+                  </w:rPr>
+                </m:ctrlPr>
+              </m:dPr>
+              <m:e>
+                <m:sSub>
+                  <m:sSubPr>
+                    <m:ctrlPr>
+                      <w:rPr>
+                        <w:rFonts w:ascii="Cambria Math" w:hAnsi="Cambria Math"/>
+                        <w:lang w:eastAsia="zh-CN"/>
+                      </w:rPr>
+                    </m:ctrlPr>
+                  </m:sSubPr>
+                  <m:e>
+                    <m:r>
+                      <w:rPr>
+                        <w:rFonts w:ascii="Cambria Math" w:hAnsi="Cambria Math"/>
+                        <w:lang w:eastAsia="zh-CN"/>
+                      </w:rPr>
+                      <m:t>x</m:t>
+                    </m:r>
+                  </m:e>
+                  <m:sub>
+                    <m:r>
+                      <w:rPr>
+                        <w:rFonts w:ascii="Cambria Math" w:hAnsi="Cambria Math"/>
+                        <w:lang w:eastAsia="zh-CN"/>
+                      </w:rPr>
+                      <m:t>0</m:t>
+                    </m:r>
+                  </m:sub>
+                </m:sSub>
+              </m:e>
+              <m:e>
+                <m:sSub>
+                  <m:sSubPr>
+                    <m:ctrlPr>
+                      <w:rPr>
+                        <w:rFonts w:ascii="Cambria Math" w:hAnsi="Cambria Math"/>
+                        <w:lang w:eastAsia="zh-CN"/>
+                      </w:rPr>
+                    </m:ctrlPr>
+                  </m:sSubPr>
+                  <m:e>
+                    <m:r>
+                      <w:rPr>
+                        <w:rFonts w:ascii="Cambria Math" w:hAnsi="Cambria Math"/>
+                        <w:lang w:eastAsia="zh-CN"/>
+                      </w:rPr>
+                      <m:t>x</m:t>
+                    </m:r>
+                  </m:e>
+                  <m:sub>
+                    <m:r>
+                      <w:rPr>
+                        <w:rFonts w:ascii="Cambria Math" w:hAnsi="Cambria Math"/>
+                        <w:lang w:eastAsia="zh-CN"/>
+                      </w:rPr>
+                      <m:t>1</m:t>
+                    </m:r>
+                  </m:sub>
+                </m:sSub>
+              </m:e>
+            </m:d>
+            <m:r>
+              <w:rPr>
+                <w:rFonts w:ascii="Cambria Math" w:hAnsi="Cambria Math"/>
+                <w:lang w:eastAsia="zh-CN"/>
+              </w:rPr>
+              <m:t>/8</m:t>
+            </m:r>
+          </m:e>
+        </m:d>
+      </m:oMath>
+      <w:r>
+        <w:rPr>
+          <w:lang w:eastAsia="zh-CN"/>
+        </w:rPr>
+        <w:t xml:space="preserve">, </w:t>
+      </w:r>
+      <m:oMath>
+        <m:sSub>
+          <m:sSubPr>
+            <m:ctrlPr>
+              <w:rPr>
+                <w:rFonts w:ascii="Cambria Math" w:hAnsi="Cambria Math"/>
+                <w:lang w:eastAsia="zh-CN"/>
+              </w:rPr>
+            </m:ctrlPr>
+          </m:sSubPr>
+          <m:e>
+            <m:r>
+              <w:rPr>
+                <w:rFonts w:ascii="Cambria Math" w:hAnsi="Cambria Math"/>
+                <w:lang w:eastAsia="zh-CN"/>
+              </w:rPr>
+              <m:t>x</m:t>
+            </m:r>
+          </m:e>
+          <m:sub>
+            <m:r>
+              <w:rPr>
+                <w:rFonts w:ascii="Cambria Math" w:hAnsi="Cambria Math"/>
+                <w:lang w:eastAsia="zh-CN"/>
+              </w:rPr>
+              <m:t>H</m:t>
+            </m:r>
+          </m:sub>
+        </m:sSub>
+        <m:r>
+          <w:rPr>
+            <w:rFonts w:ascii="Cambria Math" w:hAnsi="Cambria Math"/>
+            <w:lang w:eastAsia="zh-CN"/>
+          </w:rPr>
+          <m:t>=</m:t>
+        </m:r>
+        <m:d>
+          <m:dPr>
+            <m:begChr m:val="⌊"/>
+            <m:endChr m:val="⌋"/>
+            <m:ctrlPr>
+              <w:rPr>
+                <w:rFonts w:ascii="Cambria Math" w:hAnsi="Cambria Math"/>
+                <w:lang w:eastAsia="zh-CN"/>
+              </w:rPr>
+            </m:ctrlPr>
+          </m:dPr>
+          <m:e>
+            <m:r>
+              <m:rPr>
+                <m:sty m:val="p"/>
+              </m:rPr>
+              <w:rPr>
+                <w:rFonts w:ascii="Cambria Math" w:hAnsi="Cambria Math"/>
+                <w:lang w:eastAsia="zh-CN"/>
+              </w:rPr>
+              <m:t>max</m:t>
+            </m:r>
+            <m:r>
+              <w:rPr>
+                <w:rFonts w:ascii="Cambria Math" w:hAnsi="Cambria Math"/>
+                <w:lang w:eastAsia="zh-CN"/>
+              </w:rPr>
+              <m:t>⁡</m:t>
+            </m:r>
+            <m:d>
+              <m:dPr>
+                <m:sepChr m:val=","/>
+                <m:ctrlPr>
+                  <w:rPr>
+                    <w:rFonts w:ascii="Cambria Math" w:hAnsi="Cambria Math"/>
+                    <w:lang w:eastAsia="zh-CN"/>
+                  </w:rPr>
+                </m:ctrlPr>
+              </m:dPr>
+              <m:e>
+                <m:sSub>
+                  <m:sSubPr>
+                    <m:ctrlPr>
+                      <w:rPr>
+                        <w:rFonts w:ascii="Cambria Math" w:hAnsi="Cambria Math"/>
+                        <w:lang w:eastAsia="zh-CN"/>
+                      </w:rPr>
+                    </m:ctrlPr>
+                  </m:sSubPr>
+                  <m:e>
+                    <m:r>
+                      <w:rPr>
+                        <w:rFonts w:ascii="Cambria Math" w:hAnsi="Cambria Math"/>
+                        <w:lang w:eastAsia="zh-CN"/>
+                      </w:rPr>
+                      <m:t>x</m:t>
+                    </m:r>
+                  </m:e>
+                  <m:sub>
+                    <m:r>
+                      <w:rPr>
+                        <w:rFonts w:ascii="Cambria Math" w:hAnsi="Cambria Math"/>
+                        <w:lang w:eastAsia="zh-CN"/>
+                      </w:rPr>
+                      <m:t>0</m:t>
+                    </m:r>
+                  </m:sub>
+                </m:sSub>
+              </m:e>
+              <m:e>
+                <m:sSub>
+                  <m:sSubPr>
+                    <m:ctrlPr>
+                      <w:rPr>
+                        <w:rFonts w:ascii="Cambria Math" w:hAnsi="Cambria Math"/>
+                        <w:lang w:eastAsia="zh-CN"/>
+                      </w:rPr>
+                    </m:ctrlPr>
+                  </m:sSubPr>
+                  <m:e>
+                    <m:r>
+                      <w:rPr>
+                        <w:rFonts w:ascii="Cambria Math" w:hAnsi="Cambria Math"/>
+                        <w:lang w:eastAsia="zh-CN"/>
+                      </w:rPr>
+                      <m:t>x</m:t>
+                    </m:r>
+                  </m:e>
+                  <m:sub>
+                    <m:r>
+                      <w:rPr>
+                        <w:rFonts w:ascii="Cambria Math" w:hAnsi="Cambria Math"/>
+                        <w:lang w:eastAsia="zh-CN"/>
+                      </w:rPr>
+                      <m:t>1</m:t>
+                    </m:r>
+                  </m:sub>
+                </m:sSub>
+              </m:e>
+            </m:d>
+            <m:r>
+              <w:rPr>
+                <w:rFonts w:ascii="Cambria Math" w:hAnsi="Cambria Math"/>
+                <w:lang w:eastAsia="zh-CN"/>
+              </w:rPr>
+              <m:t>/8</m:t>
+            </m:r>
+          </m:e>
+        </m:d>
+      </m:oMath>
+      <w:r>
+        <w:rPr>
+          <w:lang w:eastAsia="zh-CN"/>
+        </w:rPr>
+        <w:t xml:space="preserve">, and similarly for </w:t>
+      </w:r>
+      <m:oMath>
+        <m:sSub>
+          <m:sSubPr>
+            <m:ctrlPr>
+              <w:rPr>
+                <w:rFonts w:ascii="Cambria Math" w:hAnsi="Cambria Math"/>
+                <w:lang w:eastAsia="zh-CN"/>
+              </w:rPr>
+            </m:ctrlPr>
+          </m:sSubPr>
+          <m:e>
+            <m:r>
+              <w:rPr>
+                <w:rFonts w:ascii="Cambria Math" w:hAnsi="Cambria Math"/>
+                <w:lang w:eastAsia="zh-CN"/>
+              </w:rPr>
+              <m:t>y</m:t>
+            </m:r>
+          </m:e>
+          <m:sub>
+            <m:r>
+              <w:rPr>
+                <w:rFonts w:ascii="Cambria Math" w:hAnsi="Cambria Math"/>
+                <w:lang w:eastAsia="zh-CN"/>
+              </w:rPr>
+              <m:t>L</m:t>
+            </m:r>
+          </m:sub>
+        </m:sSub>
+      </m:oMath>
+      <w:r>
+        <w:rPr>
+          <w:rFonts w:hint="eastAsia"/>
+          <w:lang w:eastAsia="zh-CN"/>
+        </w:rPr>
+        <w:t xml:space="preserve"> </w:t>
+      </w:r>
+      <w:r>
+        <w:rPr>
+          <w:lang w:eastAsia="zh-CN"/>
+        </w:rPr>
+        <w:t xml:space="preserve">and </w:t>
+      </w:r>
+      <m:oMath>
+        <m:sSub>
+          <m:sSubPr>
+            <m:ctrlPr>
+              <w:rPr>
+                <w:rFonts w:ascii="Cambria Math" w:hAnsi="Cambria Math"/>
+                <w:lang w:eastAsia="zh-CN"/>
+              </w:rPr>
+            </m:ctrlPr>
+          </m:sSubPr>
+          <m:e>
+            <m:r>
+              <w:rPr>
+                <w:rFonts w:ascii="Cambria Math" w:hAnsi="Cambria Math"/>
+                <w:lang w:eastAsia="zh-CN"/>
+              </w:rPr>
+              <m:t>y</m:t>
+            </m:r>
+          </m:e>
+          <m:sub>
+            <m:r>
+              <w:rPr>
+                <w:rFonts w:ascii="Cambria Math" w:hAnsi="Cambria Math"/>
+                <w:lang w:eastAsia="zh-CN"/>
+              </w:rPr>
+              <m:t>H</m:t>
+            </m:r>
+          </m:sub>
+        </m:sSub>
+      </m:oMath>
+      <w:r>
+        <w:rPr>
+          <w:lang w:eastAsia="zh-CN"/>
+        </w:rPr>
+        <w:t xml:space="preserve">. Following prior tree-based multicast routing in 2-D meshes </w:t>
+      </w:r>
+      <w:r>
+        <w:rPr>
+          <w:rFonts w:hint="eastAsia"/>
+          <w:lang w:eastAsia="zh-CN"/>
+        </w:rPr>
+        <w:t>(RPM)</w:t>
+      </w:r>
+      <w:r>
+        <w:rPr>
+          <w:lang w:eastAsia="zh-CN"/>
+        </w:rPr>
+        <w:t xml:space="preserve">, a packet outside </w:t>
+      </w:r>
+      <m:oMath>
+        <m:sSub>
+          <m:sSubPr>
+            <m:ctrlPr>
+              <w:rPr>
+                <w:rFonts w:ascii="Cambria Math" w:hAnsi="Cambria Math"/>
+                <w:lang w:eastAsia="zh-CN"/>
+              </w:rPr>
+            </m:ctrlPr>
+          </m:sSubPr>
+          <m:e>
+            <m:r>
+              <w:rPr>
+                <w:rFonts w:ascii="Cambria Math" w:hAnsi="Cambria Math"/>
+                <w:lang w:eastAsia="zh-CN"/>
+              </w:rPr>
+              <m:t>R</m:t>
+            </m:r>
+          </m:e>
+          <m:sub>
+            <m:r>
+              <w:rPr>
+                <w:rFonts w:ascii="Cambria Math" w:hAnsi="Cambria Math"/>
+                <w:lang w:eastAsia="zh-CN"/>
+              </w:rPr>
+              <m:t>m</m:t>
+            </m:r>
+          </m:sub>
+        </m:sSub>
+      </m:oMath>
+      <w:r>
+        <w:rPr>
+          <w:lang w:eastAsia="zh-CN"/>
+        </w:rPr>
+        <w:t>is first routed toward the nearest</w:t>
+      </w:r>
+      <w:r>
+        <w:rPr>
+          <w:rFonts w:hint="eastAsia"/>
+          <w:lang w:eastAsia="zh-CN"/>
+        </w:rPr>
+        <w:t xml:space="preserve"> </w:t>
+      </w:r>
+      <w:r>
+        <w:rPr>
+          <w:lang w:eastAsia="zh-CN"/>
+        </w:rPr>
+        <w:t>corne</w:t>
+      </w:r>
+      <w:r>
+        <w:rPr>
+          <w:rFonts w:hint="eastAsia"/>
+          <w:lang w:eastAsia="zh-CN"/>
+        </w:rPr>
+        <w:t xml:space="preserve">r </w:t>
+      </w:r>
+      <w:r>
+        <w:rPr>
+          <w:lang w:eastAsia="zh-CN"/>
+        </w:rPr>
+        <w:t xml:space="preserve">using deterministic XY routing. Once the packet enters </w:t>
+      </w:r>
+      <m:oMath>
+        <m:sSub>
+          <m:sSubPr>
+            <m:ctrlPr>
+              <w:rPr>
+                <w:rFonts w:ascii="Cambria Math" w:hAnsi="Cambria Math"/>
+                <w:lang w:eastAsia="zh-CN"/>
+              </w:rPr>
+            </m:ctrlPr>
+          </m:sSubPr>
+          <m:e>
+            <m:r>
+              <w:rPr>
+                <w:rFonts w:ascii="Cambria Math" w:hAnsi="Cambria Math"/>
+                <w:lang w:eastAsia="zh-CN"/>
+              </w:rPr>
+              <m:t>R</m:t>
+            </m:r>
+          </m:e>
+          <m:sub>
+            <m:r>
+              <w:rPr>
+                <w:rFonts w:ascii="Cambria Math" w:hAnsi="Cambria Math"/>
+                <w:lang w:eastAsia="zh-CN"/>
+              </w:rPr>
+              <m:t>m</m:t>
+            </m:r>
+          </m:sub>
+        </m:sSub>
+      </m:oMath>
+      <w:r>
+        <w:rPr>
+          <w:lang w:eastAsia="zh-CN"/>
+        </w:rPr>
+        <w:t xml:space="preserve">, it is locally delivered and replicated only toward the remaining portions of the destination region according to its ingress direction, as illustrated in Fig. </w:t>
+      </w:r>
+      <w:r>
+        <w:rPr>
+          <w:rFonts w:hint="eastAsia"/>
+          <w:lang w:eastAsia="zh-CN"/>
+        </w:rPr>
+        <w:t>3</w:t>
+      </w:r>
+      <w:r>
+        <w:rPr>
+          <w:lang w:eastAsia="zh-CN"/>
+        </w:rPr>
+        <w:t>. This approach preserves the same destination representation across the Tree–Mesh boundary and avoids regenerating packets for individual destination tiles.</w:t>
+      </w:r>
+    </w:p>
+    <w:p>
+      <w:pPr>
+        <w:jc w:val="both"/>
+        <w:rPr>
+          <w:lang w:eastAsia="zh-CN"/>
+        </w:rPr>
+      </w:pPr>
+    </w:p>
+    <w:p>
+      <w:pPr>
+        <w:keepNext/>
+        <w:jc w:val="start"/>
+        <w:rPr>
+          <w:rFonts w:hint="eastAsia"/>
+          <w:lang w:eastAsia="zh-CN"/>
+        </w:rPr>
+      </w:pPr>
+      <w:r>
+        <w:rPr>
+          <w:noProof/>
+        </w:rPr>
+        <w:drawing>
+          <wp:inline distT="0" distB="0" distL="0" distR="0" wp14:anchorId="75735D07" wp14:editId="5F044269">
+            <wp:extent cx="3089910" cy="2152015"/>
+            <wp:effectExtent l="0" t="0" r="0" b="635"/>
+            <wp:docPr id="562359467" name="图形 1"/>
+            <wp:cNvGraphicFramePr>
+              <a:graphicFrameLocks xmlns:a="http://purl.oclc.org/ooxml/drawingml/main" noChangeAspect="1"/>
+            </wp:cNvGraphicFramePr>
+            <a:graphic xmlns:a="http://purl.oclc.org/ooxml/drawingml/main">
+              <a:graphicData uri="http://purl.oclc.org/ooxml/drawingml/picture">
+                <pic:pic xmlns:pic="http://purl.oclc.org/ooxml/drawingml/picture">
+                  <pic:nvPicPr>
+                    <pic:cNvPr id="562359467" name=""/>
+                    <pic:cNvPicPr/>
+                  </pic:nvPicPr>
+                  <pic:blipFill>
+                    <a:blip r:embed="rId15">
+                      <a:extLst>
+                        <a:ext uri="{96DAC541-7B7A-43D3-8B79-37D633B846F1}">
+                          <asvg:svgBlip xmlns:asvg="http://schemas.microsoft.com/office/drawing/2016/SVG/main" r:embed="rId16"/>
+                        </a:ext>
+                      </a:extLst>
+                    </a:blip>
+                    <a:stretch>
+                      <a:fillRect/>
+                    </a:stretch>
+                  </pic:blipFill>
+                  <pic:spPr>
+                    <a:xfrm>
+                      <a:off x="0" y="0"/>
+                      <a:ext cx="3089910" cy="2152015"/>
+                    </a:xfrm>
+                    <a:prstGeom prst="rect">
+                      <a:avLst/>
+                    </a:prstGeom>
+                  </pic:spPr>
+                </pic:pic>
+              </a:graphicData>
+            </a:graphic>
+          </wp:inline>
+        </w:drawing>
+      </w:r>
+    </w:p>
+    <w:p>
+      <w:pPr>
+        <w:pStyle w:val="af0"/>
+        <w:jc w:val="start"/>
+        <w:rPr>
+          <w:rFonts w:ascii="Times New Roman" w:hAnsi="Times New Roman" w:cs="Times New Roman"/>
+          <w:sz w:val="16"/>
+          <w:szCs w:val="16"/>
+          <w:lang w:eastAsia="zh-CN"/>
+        </w:rPr>
+      </w:pPr>
+      <w:r>
+        <w:rPr>
+          <w:rFonts w:ascii="Times New Roman" w:hAnsi="Times New Roman" w:cs="Times New Roman"/>
+          <w:sz w:val="16"/>
+          <w:szCs w:val="16"/>
+        </w:rPr>
+        <w:t xml:space="preserve">Fig. </w:t>
+      </w:r>
+      <w:r>
+        <w:rPr>
+          <w:rFonts w:ascii="Times New Roman" w:hAnsi="Times New Roman" w:cs="Times New Roman" w:hint="eastAsia"/>
+          <w:sz w:val="16"/>
+          <w:szCs w:val="16"/>
+          <w:lang w:eastAsia="zh-CN"/>
+        </w:rPr>
+        <w:t>3</w:t>
+      </w:r>
+      <w:r>
+        <w:rPr>
+          <w:rFonts w:ascii="Times New Roman" w:hAnsi="Times New Roman" w:cs="Times New Roman" w:hint="eastAsia"/>
+          <w:sz w:val="16"/>
+          <w:szCs w:val="16"/>
+          <w:lang w:eastAsia="zh-CN"/>
+        </w:rPr>
+        <w:t xml:space="preserve">. </w:t>
+      </w:r>
+      <w:r>
+        <w:rPr>
+          <w:rFonts w:ascii="Times New Roman" w:hAnsi="Times New Roman" w:cs="Times New Roman"/>
+          <w:b/>
+          <w:bCs/>
+          <w:sz w:val="16"/>
+          <w:szCs w:val="16"/>
+          <w:lang w:eastAsia="zh-CN"/>
+        </w:rPr>
+        <w:t>Region-based multicast routing in the upper mesh</w:t>
+      </w:r>
+      <w:r>
+        <w:rPr>
+          <w:rFonts w:ascii="Times New Roman" w:hAnsi="Times New Roman" w:cs="Times New Roman"/>
+          <w:sz w:val="16"/>
+          <w:szCs w:val="16"/>
+          <w:lang w:eastAsia="zh-CN"/>
+        </w:rPr>
+        <w:t>.</w:t>
+      </w:r>
+    </w:p>
+    <w:p>
+      <w:pPr>
+        <w:rPr>
+          <w:rFonts w:hint="eastAsia"/>
+          <w:lang w:eastAsia="zh-CN"/>
+        </w:rPr>
+      </w:pPr>
+    </w:p>
+    <w:p>
+      <w:pPr>
+        <w:jc w:val="both"/>
+        <w:rPr>
+          <w:lang w:eastAsia="zh-CN"/>
+        </w:rPr>
+      </w:pPr>
+      <w:r>
+        <w:rPr>
+          <w:rFonts w:hint="eastAsia"/>
+          <w:noProof/>
+          <w:lang w:eastAsia="zh-CN"/>
+        </w:rPr>
         <w:lastRenderedPageBreak/>
-        <w:t>Be aware of the different meanings of the homophones “affect” and “effect”, “complement” and “compliment”, “discreet” and “discrete”, “principal” and “principle”.</w:t>
-      </w:r>
-    </w:p>
-    <w:p>
-      <w:pPr>
-        <w:pStyle w:val="bulletlist"/>
-      </w:pPr>
-      <w:r>
-        <w:t>Do not confuse “imply” and “infer”.</w:t>
-      </w:r>
-    </w:p>
-    <w:p>
-      <w:pPr>
-        <w:pStyle w:val="bulletlist"/>
-      </w:pPr>
-      <w:r>
-        <w:t>The prefix “non” is not a word; it should be joined to the word it modifies, usually without a hyphen.</w:t>
-      </w:r>
-    </w:p>
-    <w:p>
-      <w:pPr>
-        <w:pStyle w:val="bulletlist"/>
-      </w:pPr>
-      <w:r>
-        <w:t>There is no period after the “et” in the Latin abbreviation “et al.”.</w:t>
-      </w:r>
-    </w:p>
-    <w:p>
-      <w:pPr>
-        <w:pStyle w:val="bulletlist"/>
-      </w:pPr>
-      <w:r>
-        <w:t>The abbreviation “i.e.” means “that is”, and the abbreviation “e.g.” means “for example”.</w:t>
-      </w:r>
-    </w:p>
-    <w:p>
-      <w:pPr>
-        <w:pStyle w:val="a3"/>
-      </w:pPr>
-      <w:r>
-        <w:t>An excellent style manual for science writers is [7].</w:t>
-      </w:r>
+        <w:drawing>
+          <wp:inline distT="0" distB="0" distL="0" distR="0" wp14:anchorId="28A88065" wp14:editId="77B4C6A4">
+            <wp:extent cx="3089910" cy="3767455"/>
+            <wp:effectExtent l="0" t="0" r="0" b="4445"/>
+            <wp:docPr id="737153591" name="图形 5"/>
+            <wp:cNvGraphicFramePr>
+              <a:graphicFrameLocks xmlns:a="http://purl.oclc.org/ooxml/drawingml/main" noChangeAspect="1"/>
+            </wp:cNvGraphicFramePr>
+            <a:graphic xmlns:a="http://purl.oclc.org/ooxml/drawingml/main">
+              <a:graphicData uri="http://purl.oclc.org/ooxml/drawingml/picture">
+                <pic:pic xmlns:pic="http://purl.oclc.org/ooxml/drawingml/picture">
+                  <pic:nvPicPr>
+                    <pic:cNvPr id="737153591" name="图形 737153591"/>
+                    <pic:cNvPicPr/>
+                  </pic:nvPicPr>
+                  <pic:blipFill>
+                    <a:blip r:embed="rId17">
+                      <a:extLst>
+                        <a:ext uri="{96DAC541-7B7A-43D3-8B79-37D633B846F1}">
+                          <asvg:svgBlip xmlns:asvg="http://schemas.microsoft.com/office/drawing/2016/SVG/main" r:embed="rId18"/>
+                        </a:ext>
+                      </a:extLst>
+                    </a:blip>
+                    <a:stretch>
+                      <a:fillRect/>
+                    </a:stretch>
+                  </pic:blipFill>
+                  <pic:spPr>
+                    <a:xfrm>
+                      <a:off x="0" y="0"/>
+                      <a:ext cx="3089910" cy="3767455"/>
+                    </a:xfrm>
+                    <a:prstGeom prst="rect">
+                      <a:avLst/>
+                    </a:prstGeom>
+                  </pic:spPr>
+                </pic:pic>
+              </a:graphicData>
+            </a:graphic>
+          </wp:inline>
+        </w:drawing>
+      </w:r>
+    </w:p>
+    <w:p>
+      <w:pPr>
+        <w:pStyle w:val="2"/>
+        <w:rPr>
+          <w:rFonts w:hint="eastAsia"/>
+        </w:rPr>
+      </w:pPr>
     </w:p>
     <w:p>
       <w:pPr>
@@ -2529,6 +5438,7 @@
         <w:pStyle w:val="a3"/>
       </w:pPr>
       <w:r>
+        <w:lastRenderedPageBreak/>
         <w:t>Number footnotes separately in superscripts. Place the actual footnote at the bottom of the column in which it was cited. Do not put footnotes in the</w:t>
       </w:r>
       <w:r>
@@ -2566,7 +5476,6 @@
         <w:pStyle w:val="a3"/>
       </w:pPr>
       <w:r>
-        <w:lastRenderedPageBreak/>
         <w:t xml:space="preserve">For </w:t>
       </w:r>
       <w:r>
@@ -4956,7 +7865,6 @@
   <w:style w:type="character" w:default="1" w:styleId="a0">
     <w:name w:val="Default Paragraph Font"/>
     <w:uiPriority w:val="1"/>
-    <w:semiHidden/>
     <w:unhideWhenUsed/>
   </w:style>
   <w:style w:type="table" w:default="1" w:styleId="a1">
@@ -5346,6 +8254,17 @@
       <w:color w:val="666666"/>
     </w:rPr>
   </w:style>
+  <w:style w:type="paragraph" w:styleId="af0">
+    <w:name w:val="caption"/>
+    <w:basedOn w:val="a"/>
+    <w:next w:val="a"/>
+    <w:unhideWhenUsed/>
+    <w:qFormat/>
+    <w:rsid w:val="00A93109"/>
+    <w:rPr>
+      <w:rFonts w:asciiTheme="majorHAnsi" w:eastAsia="黑体" w:hAnsiTheme="majorHAnsi" w:cstheme="majorBidi"/>
+    </w:rPr>
+  </w:style>
 </w:styles>
 </file>
 

</xml_diff>